<commit_message>
Proofread Dutch edition: 280 fixes applied, 15 decisions logged
Co-Authored-By: Claude Opus 5.5 <noreply@anthropic.com>
Claude-Session: https://claude.ai/code/session_015bGU9R5VguxHZDVriTWnnq
</commit_message>
<xml_diff>
--- a/corrected/Inn Trouble - ASSEMBLED - FORMATTED_Dutch.docx
+++ b/corrected/Inn Trouble - ASSEMBLED - FORMATTED_Dutch.docx
@@ -52,7 +52,7 @@
     <w:p/>
     <w:p>
       <w:r>
-        <w:t>Niets uit deze uitgave mag worden verveelvoudigd, opgeslagen in een geautomatiseerd gegevensbestand, of openbaar gemaakt, in enige vorm of op enige wijze, hetzij elektronisch, mechanisch, door fotokopieën, opnamen, of op enige andere manier, zonder voorafgaande schriftelijke toestemming van de uitgever, met uitzondering van hetgeen is toegestaan krachtens de wet.</w:t>
+        <w:t xml:space="preserve">Niets uit deze uitgave mag worden verveelvoudigd, opgeslagen in een geautomatiseerd gegevensbestand, of openbaar gemaakt, in enige vorm of op enige wijze, hetzij elektronisch, mechanisch, door fotokopieën, opnamen, of op enige andere manier, zonder voorafgaande schriftelijke toestemming van de uitgever, met uitzondering van hetgeen is toegestaan krachtens de Amerikaanse auteurswet.</w:t>
       </w:r>
     </w:p>
     <w:p/>
@@ -106,7 +106,7 @@
     <w:p/>
     <w:p>
       <w:r>
-        <w:t>Wat is de volgende stap?</w:t>
+        <w:t xml:space="preserve">Wat komt er hierna?</w:t>
       </w:r>
     </w:p>
     <w:p/>
@@ -136,13 +136,13 @@
     <w:p/>
     <w:p>
       <w:r>
-        <w:t>In het briefje wordt een half miljoen dollar geëist. De afzender weet wat haar overgrootmoeder in 1924 uit het huis van de Blackburns heeft meegenomen, en in welke winkel twee dorpen verderop ze het heeft verkocht, en er wordt de steen genoemd die the sapphire at its heart vormt — details die op precies één plek te vinden zijn: in een afgesloten kist op Fiona’s vliering, en op nog maar één andere plek in het dorp.</w:t>
-      </w:r>
-    </w:p>
-    <w:p/>
-    <w:p>
-      <w:r>
-        <w:t>Jessica Claus zoekt de herkomst van de wetenschap liever bij de bron dan dat ze afgaat op wat het dorp het liefst zou aanwijzen. Een smid die twintig dollar schuldig was en weigerde een rechtstreeks antwoord te geven. Een vreemdeling die kaartjes over een zoekgeraakt broche uitdeelt aan iedereen die er ener wil aannemen. Een historicus die op een veldbed slaapt naast een cv-ketel die hij zich niet kan veroorloven te laten repareren.</w:t>
+        <w:t xml:space="preserve">In het briefje wordt een half miljoen dollar geëist. De afzender weet wat haar overgrootmoeder in 1924 uit het huis van de Blackburns heeft meegenomen, en in welke winkel twee dorpen verderop ze het heeft verkocht, en er wordt de steen genoemd die het hart van de broche vormt — details die op precies één plek te vinden zijn: in een afgesloten koffer op Fiona’s vliering, en op nog maar één andere plek in het dorp.</w:t>
+      </w:r>
+    </w:p>
+    <w:p/>
+    <w:p>
+      <w:r>
+        <w:t xml:space="preserve">Jessica Claus zoekt de herkomst van de wetenschap liever bij de bron dan dat ze afgaat op wat het dorp het liefst zou aanwijzen. Een smid die twintig dollar schuldig was en weigerde een rechtstreeks antwoord te geven. Een vreemdeling die kaartjes over een zoekgeraakte broche uitdeelt aan iedereen die er een wil aannemen. Een historicus die op een veldbed slaapt naast een cv-ketel die hij zich niet kan veroorloven te laten repareren.</w:t>
       </w:r>
     </w:p>
     <w:p/>
@@ -159,7 +159,7 @@
     <w:p/>
     <w:p>
       <w:r>
-        <w:t>De taart was nog warm toen ik hem in de mand legde, warm genoeg om de binnenkant van het koude keukenraam met stoom te beslaan, en de hele kamer rook naar kaneel, appels en de bruine suiker die ik een tikje donkerder dan goudbruin had laten worden omdat Fiona dat lekker vond. Ze had me eens verteld dat haar moeder de suiker per ongeluk had laten karamelliseren, precies tot op het randje waar het ophoudt zoet te zijn en iets diepers wordt. De geur daarvan, zei ze, was de geur van klein en veilig zijn in een warme keuken op een koud dag. Sindsdien had ik hem altijd zo voor haar gemaakt.</w:t>
+        <w:t xml:space="preserve">De taart was nog warm toen ik hem in de mand legde, warm genoeg om de binnenkant van het koude keukenraam met stoom te beslaan, en de hele kamer rook naar kaneel, appels en de bruine suiker die ik een tikje donkerder dan goudbruin had laten worden omdat Fiona dat lekker vond. Ze had me eens verteld dat haar moeder de suiker met opzet had laten karamelliseren, precies tot op het randje waar het ophoudt zoet te zijn en iets diepers wordt. De geur daarvan, zei ze, was de geur van klein en veilig zijn in een warme keuken op een koude dag. Sindsdien had ik hem altijd zo voor haar gemaakt.</w:t>
       </w:r>
     </w:p>
     <w:p/>
@@ -279,7 +279,7 @@
     <w:p/>
     <w:p>
       <w:r>
-        <w:t>„Meer dan gesetteld.” De man had zilverhaar en zag er keurig gestreken uit, innemend en onthaast, een man die duidelijk nog nooit op zijn beurt had hoeven wachten. Zijn vrouw droeg een kasjmieren trui in de kleur van room en pareloorbellen, nee, diamanten, kleine exemplaren die het vuurlicht ving toen ze haar hoofd draaide en over het plafond verstrooide. „We hoopten, Fiona, dat we de suite nog een week langer mochten houden. We zijn verliefd geworden op deze plek. Mijn vrouw zegt dat ze in jaren niet zo goed heeft geslapen.”</w:t>
+        <w:t xml:space="preserve">„Meer dan gesetteld.” De man had zilverhaar en zag er keurig gestreken uit, innemend en onthaast, een man die duidelijk nog nooit op zijn beurt had hoeven wachten. Zijn vrouw droeg een kasjmieren trui in de kleur van room en pareloorbellen, nee, diamanten, kleine exemplaren die het vuurlicht vingen toen ze haar hoofd draaide en over het plafond verstrooide. „We hoopten, Fiona, dat we de suite nog een week langer mochten houden. We zijn verliefd geworden op deze plek. Mijn vrouw zegt dat ze in jaren niet zo goed heeft geslapen.”</w:t>
       </w:r>
     </w:p>
     <w:p/>
@@ -303,7 +303,7 @@
     <w:p/>
     <w:p>
       <w:r>
-        <w:t>Toen begreep ik één ding. De Worthingtons waren het soort gasten waar elke hotelier op hoopt, van dat slag dat de beste kamer per week nam, de staf gul aandroeg en oprecht vroeg wie de quilts had gemaakt. Wat er ook mis was met Fiona, hun extra week was de enige stevige plank onder haar voeten.</w:t>
+        <w:t xml:space="preserve">Toen begreep ik één ding. De Worthingtons waren het soort gasten waar elke hotelier op hoopt, van dat slag dat de beste kamer per week nam, het personeel een gulle fooi gaf en oprecht vroeg wie de quilts had gemaakt. Wat er ook mis was met Fiona, hun extra week was de enige stevige plank onder haar voeten.</w:t>
       </w:r>
     </w:p>
     <w:p/>
@@ -375,7 +375,7 @@
     <w:p/>
     <w:p>
       <w:r>
-        <w:t>„Het is de geschiedenis die mij interesseert. Altijd al gedaan.” Hij zei het tegen Fiona, maar zijn ogen gleden door naar mij, werden warm, en hij stak zijn hand uit. „Vergeef me. Neil Carter.”</w:t>
+        <w:t xml:space="preserve">„Het is de geschiedenis die mij interesseert. Altijd al.” Hij zei het tegen Fiona, maar zijn ogen gleden door naar mij, werden warm, en hij stak zijn hand uit. „Vergeef me. Neil Carter.”</w:t>
       </w:r>
     </w:p>
     <w:p/>
@@ -387,13 +387,13 @@
     <w:p/>
     <w:p>
       <w:r>
-        <w:t>„Claus.” Hij glimlachte, en het was een goede glimlach, ontspannen en geoefend, maar ik vertrouwde hem ongeveer evenveel als ik het haardscherm had kunnen gooien. „Dan bent u de beroemde mevrouw Claus. Hoe ontzettend geweldig. Ik had het natuurlijk gehoord, men hoort het een en ander, maar ik kon het tot nu toe niet helemaal geloven.” Hij boog zich een fractie naar voren, vertrouwelijk. „Vertel eens. De oude families hier, de Blackburns en al die anderen, zijn hun bezittingen nog ergens in het dorp te vinden? Erfstukken, meubels, sieraden, dat soort werk? Ik ben toevallig op zoek naar een bepaald voorwerp. Een broche.”</w:t>
-      </w:r>
-    </w:p>
-    <w:p/>
-    <w:p>
-      <w:r>
-        <w:t>Hij legde het woord broche tussen ons neer als een vliegvisser die een kunstvlieg op het water laat landen, lichtjes, met grote zorg, en keek toe wat er kwam bovenwaterdrijven.</w:t>
+        <w:t xml:space="preserve">„Claus.” Hij glimlachte, en het was een goede glimlach, ontspannen en geoefend, maar ik vertrouwde hem niet verder dan ik het haardscherm had kunnen gooien. „Dan bent u de beroemde mevrouw Claus. Hoe ontzettend geweldig. Ik had het natuurlijk gehoord, men hoort het een en ander, maar ik kon het tot nu toe niet helemaal geloven.” Hij boog zich een fractie naar voren, vertrouwelijk. „Vertel eens. De oude families hier, de Blackburns en al die anderen, zijn hun bezittingen nog ergens in het dorp te vinden? Erfstukken, meubels, sieraden, dat soort werk? Ik ben toevallig op zoek naar een bepaald voorwerp. Een broche.”</w:t>
+      </w:r>
+    </w:p>
+    <w:p/>
+    <w:p>
+      <w:r>
+        <w:t xml:space="preserve">Hij legde het woord broche tussen ons neer als een vliegvisser die een kunstvlieg op het water laat landen, lichtjes, met grote zorg, en keek toe wat er kwam bovendrijven.</w:t>
       </w:r>
     </w:p>
     <w:p/>
@@ -447,13 +447,13 @@
     <w:p/>
     <w:p>
       <w:r>
-        <w:t>Ze wierp me een blik toe van diep en oeroud verraad. Toen, omdat ze wel van een beetje treiterij hield, stootte ze met haar schouder tegen de tafel terwijl ze langsliep. Het hele kristallen arrangement wankelde. Een stuk of wat gasten hielden tegelijk hun adem in, de oudere vrouw bij het vuur rees half op uit haar stoel, en de schaal gleed weer op haar plek terug. Ik wist ons naar buiten te loodsen door de voordeur en het portiek op voordat mijn schandelijk pinguïn kon afmaken waar ze aan begonnen was.</w:t>
-      </w:r>
-    </w:p>
-    <w:p/>
-    <w:p>
-      <w:r>
-        <w:t>Buiten was de kou een verademing na de benauwde, warme zorg in de lobby. Ik bleef even bij de balustrade van het portiek staan en liet de frisse lucht mijn hoofd leegmaken. Beneden op de brink waren mannen op ladders bezig om de festivallampjes tussen de lantaarnpalen te spannen en riepen ze naar elkaar. Er blafte ergens een hond in de richting van het park, en de trein liet zijn verre fluit horen toen hij het station binnenreed. Het was allemaal zo alledaags dat de misstanden in het gezicht van Fiona even leken op iets wat ik me had verbeeld.</w:t>
+        <w:t xml:space="preserve">Ze wierp me een blik toe van diep en oeroud verraad. Toen, omdat ze wel van een beetje treiterij hield, stootte ze met haar schouder tegen de tafel terwijl ze langsliep. Het hele kristallen arrangement wankelde. Een stuk of wat gasten hielden tegelijk hun adem in, de oudere vrouw bij het vuur rees half op uit haar stoel, en de schaal gleed weer op haar plek terug. Ik wist ons naar buiten te loodsen door de voordeur en het portiek op voordat mijn schandelijke pinguïn kon afmaken waar ze aan begonnen was.</w:t>
+      </w:r>
+    </w:p>
+    <w:p/>
+    <w:p>
+      <w:r>
+        <w:t xml:space="preserve">Buiten was de kou een verademing na de benauwde, warme zorg in de lobby. Ik bleef even bij de balustrade van het portiek staan en liet de frisse lucht mijn hoofd leegmaken. Beneden op de brink waren mannen op ladders bezig om de festivallampjes tussen de lantaarnpalen te spannen en riepen ze naar elkaar. Er blafte ergens een hond in de richting van het park, en de trein liet zijn verre fluit horen toen hij het station binnenreed. Het was allemaal zo alledaags dat wat er mis was aan het gezicht van Fiona even leek op iets wat ik me had verbeeld.</w:t>
       </w:r>
     </w:p>
     <w:p/>
@@ -465,7 +465,7 @@
     <w:p/>
     <w:p>
       <w:r>
-        <w:t>Slechts voor één ademhaling. Het harde pompoenoranje werd zachter, verwarmde en werd goud, het diepe, vaste goud van een kaars achter een raam, de hele streng in één keer, elke lamp. Ik knipperde met mijn ogen, en het was weer oranje, met het zwakke zoemende geluid van goedkope festivallampjes.</w:t>
+        <w:t xml:space="preserve">Slechts voor één ademhaling. Het harde pompoenoranje werd zachter, werd warmer en werd goud, het diepe, vaste goud van een kaars achter een raam, de hele streng in één keer, elke lamp. Ik knipperde met mijn ogen, en het was weer oranje, met het zwakke zoemende geluid van goedkope festivallampjes.</w:t>
       </w:r>
     </w:p>
     <w:p/>
@@ -501,7 +501,7 @@
     <w:p/>
     <w:p>
       <w:r>
-        <w:t>En er was iets mis met mijn vriendin, goed mis, genoeg om schaduwen onder haar ogen te zetten en een alerte, bange blik in haar blik. Het had te maken met een broche. En een vreemdeling met een innemende glimlach en een notitieboekje was naar een klein dorp afgereisd om exact daarnaar te vragen.</w:t>
+        <w:t xml:space="preserve">En er was iets mis met mijn vriendin, goed mis, genoeg om schaduwen onder haar ogen te zetten en een alerte, bange blik in haar gezicht. Het had te maken met een broche. En een vreemdeling met een innemende glimlach en een notitieboekje was naar een klein dorp afgereisd om exact daarnaar te vragen.</w:t>
       </w:r>
     </w:p>
     <w:p/>
@@ -524,7 +524,7 @@
     <w:p/>
     <w:p>
       <w:r>
-        <w:t>Het telefoontje kwam de volgende ochtend terwijl ik met mijn handen diep in het taartdeeg zat, en ik wist al dat het foute boel was voordat ik ze goed en wel had afgedroogd, omdat de telefoon in ons huisje nagenoeg nooit overging. Mensen kwamen meestal aan de deur, of stuurden een kind met een briefje, of troffen je op de markt. Als de telefoon dan toch overging, was het doorgaans Olivia om te vragen of ik de nieuwe merinowol al had gezien die was binnengekomen, of Martha om me eraan te herinneren op welke middag de handwerkkring bij elkaar kwam. Dus toen hij om halfnegen op een grauwe ochtend schril door de stille keuken schaterde, spande mijn maag zich al samen voordat ik de vloer was overgestoken.</w:t>
+        <w:t xml:space="preserve">Het telefoontje kwam de volgende ochtend terwijl ik met mijn handen diep in het taartdeeg zat, en ik wist al dat het foute boel was voordat ik ze goed en wel had afgedroogd, omdat de telefoon in ons huisje nagenoeg nooit overging. Mensen kwamen meestal aan de deur, of stuurden een kind met een briefje, of troffen je op de markt. Als de telefoon dan toch overging, was het doorgaans Olivia om te vragen of ik de nieuwe merinowol al had gezien die was binnengekomen, of Martha om me eraan te herinneren op welke middag de handwerkkring bij elkaar kwam. Dus toen hij om halfnegen op een grauwe ochtend schril door de stille keuken rinkelde, spande mijn maag zich al samen voordat ik de vloer was overgestoken.</w:t>
       </w:r>
     </w:p>
     <w:p>
@@ -569,17 +569,17 @@
     </w:p>
     <w:p>
       <w:r>
-        <w:t>De ochtend was in de loop van de nacht guur geworden. De plassen op het paadje hadden een vliesje van ijs dat kraakte onder mijn laarzen, en de dorre bladeren waren stijf en zilver geworden van de vorst. De geur van houtrook uit de schoorstenen langs Evergreen hing laag in de windstille kou. Het stadje was nog nauwelijks wakker. De meeste winkels waren nog donker, hun festivalpompoenen op de stoepen, en onze voetstappen weerklinken op het lege trottoir.</w:t>
-      </w:r>
-    </w:p>
-    <w:p>
-      <w:r>
-        <w:t>De Winter Wonderland Inn verscheen in het vizier toen we naar het dorpsplein draaiden, de grijsgroene voorgevel en de krans met het gouden lint precies zoals ze er de dag ervoor hadden bijgelegen, en toch zag de hele boel er nu anders uit voor me, veranderd doordat ik wist dat er onheil schuilde. De krans ving het vroege licht. De ramen waren donker op één na.</w:t>
-      </w:r>
-    </w:p>
-    <w:p>
-      <w:r>
-        <w:t>Ik duwde de zware voordeur open en het vertrouwelijke gekraak ervan klonk veel te luid in de stille lobby. De open haard brandde, maar pas net, en er waren nog geen andere gasten te bekennen, alleen de oudere vrouw van de dag ervoor, in dezelfde stoel bij het vuur met hetzelfde dikke paperbackboek. Ze keek over haar leesbril naar me op met de openlijke nieuwsgierigheid van iemand die niets te doen had dan de lobby in de gaten houden, en haar ogen volgden me de hele weg door de ruimte. Ik heb er nooit van gehouden om aangestaard te worden op een plek die gastvrij hoort te zijn, en die ochtend hield ik er al helemaal niet van.</w:t>
+        <w:t xml:space="preserve">De ochtend was in de loop van de nacht guur geworden. De plassen op het paadje hadden een vliesje van ijs dat kraakte onder mijn laarzen, en de dorre bladeren waren stijf en zilver geworden van de vorst. De geur van houtrook uit de schoorstenen langs Evergreen hing laag in de windstille kou. Het stadje was nog nauwelijks wakker. De meeste winkels waren nog donker, hun festivalpompoenen op de stoepen, en onze voetstappen weerklonken op het lege trottoir.</w:t>
+      </w:r>
+    </w:p>
+    <w:p>
+      <w:r>
+        <w:t xml:space="preserve">De Winter Wonderland Inn verscheen in het vizier toen we naar het dorpsplein draaiden, de grijsgroene voorgevel en de krans met het gouden lint precies zoals ze er de dag ervoor bij hadden gehangen, en toch zag de hele boel er nu anders uit voor me, veranderd doordat ik wist dat er onheil schuilde. De krans ving het vroege licht. De ramen waren donker op één na.</w:t>
+      </w:r>
+    </w:p>
+    <w:p>
+      <w:r>
+        <w:t xml:space="preserve">Ik duwde de zware voordeur open en het vertrouwde gekraak ervan klonk veel te luid in de stille lobby. De open haard brandde, maar pas net, en er waren nog geen andere gasten te bekennen, alleen de oudere vrouw van de dag ervoor, in dezelfde stoel bij het vuur met hetzelfde dikke paperbackboek. Ze keek over haar leesbril naar me op met de openlijke nieuwsgierigheid van iemand die niets te doen had dan de lobby in de gaten houden, en haar ogen volgden me de hele weg door de ruimte. Ik heb er nooit van gehouden om aangestaard te worden op een plek die gastvrij hoort te zijn, en die ochtend hield ik er al helemaal niet van.</w:t>
       </w:r>
     </w:p>
     <w:p>
@@ -609,13 +609,13 @@
     </w:p>
     <w:p>
       <w:r>
-        <w:t xml:space="preserve">Het was een briefje. Het handschrift was opzettelijk slordig neergepend, vol onregelmatige schuine letters en afgebroken tekens, de gekunstelde onhandigheid van iemand die er hard aan werkt om haar handschrift te verhullen. Het bedrag was het eerste wat in het oog sprong, omdat degene die het had geschreven erop had gehamerd dat dat het eerste was wat iemand zou zien. Vijf honderdduizend dollar. En daaronder, in datzelfde moeizame krabbelschrift, de rest. </w:t>
+        <w:t xml:space="preserve">Het was een briefje. Het handschrift was opzettelijk slordig neergepend, vol onregelmatige schuine letters en afgebroken tekens, de gekunstelde onhandigheid van iemand die er hard aan werkt om zijn handschrift te verhullen. Het bedrag was het eerste wat in het oog sprong, omdat degene die het had geschreven erop had gehamerd dat dat het eerste was wat iemand zou zien. Vijfhonderdduizend dollar. En daaronder, in datzelfde moeizame krabbelschrift, de rest. </w:t>
       </w:r>
       <w:r>
         <w:rPr>
           <w:i/>
         </w:rPr>
-        <w:t>Ik weet hoe je familie aan deze herberg is gekomen. Ik weet van de broche die je overgrootmoeder heeft meegenomen van de Blackburns, die met de sapphire at its heart, en het winkeltje in Ridgeline waar ze hem heeft verkocht om deze plek te kopen. Betaal, of het hele stadje komt de waarheid te weten. Leg het geld onder de treden van de voordeur van de herberg. Haal het gouden lint van de krans en hang er een rode voor in de plaats, zodat ik weet dat het geld er ligt.</w:t>
+        <w:t xml:space="preserve">Ik weet hoe je familie aan deze herberg is gekomen. Ik weet van de broche die je overgrootmoeder heeft meegenomen van de Blackburns, die met de saffier in haar hart, en het winkeltje in Ridgeline waar ze hem heeft verkocht om deze plek te kopen. Betaal, of het hele stadje komt de waarheid te weten. Leg het geld onder de treden van de voordeur van de herberg. Haal het gouden lint van de krans en hang er een rode voor in de plaats, zodat ik weet dat het geld er ligt.</w:t>
       </w:r>
     </w:p>
     <w:p>
@@ -626,7 +626,7 @@
         <w:rPr>
           <w:i/>
         </w:rPr>
-        <w:t>The sapphire at its heart</w:t>
+        <w:t xml:space="preserve">De saffier in haar hart</w:t>
       </w:r>
       <w:r>
         <w:t>. Een vreemde, zachte, bijna tedere manier voor een afperser om een gestolen edelsteen te noemen, als een zin die uit een boek was gelicht. Ik liet het los. Ik had op dat moment grotere zaken voor me dan de woordkeuze van een vreemde.</w:t>
@@ -644,7 +644,7 @@
     </w:p>
     <w:p>
       <w:r>
-        <w:t>Ik keek. Op de foto stond een vrouw in de kleding van honderd jaar geleden, slank en ernstig, haar donkere haar in golven strak tegen haar hoofd gedragen in de stijl van de jaren twintig, haar kin omhoog, haar ogen die de camera recht aankeken met iets daags in zich dat geen echte lach was en geen echte weerspannigheid, maar er wel heel dicht bij in de buurt kwam. Ze droeg een jurk met een hoge kraag, en bij haar keel, opgespeld net onder de kraag, zat een broche. Zelfs in de zachte bruine afbeelding kon je zien dat het een fijn stuk was, goud verwerkt in een ingewikkelde zetting rondom één enkele grote steen die door de oude film als een bleke, grijze gloed was vastgelegd.</w:t>
+        <w:t xml:space="preserve">Ik keek. Op de foto stond een vrouw in de kleding van honderd jaar geleden, slank en ernstig, haar donkere haar in golven strak tegen haar hoofd gedragen in de stijl van de jaren twintig, haar kin omhoog, haar ogen die de camera recht aankeken met iets in zich dat geen echte lach was en geen echte weerspannigheid, maar er wel heel dicht bij in de buurt kwam. Ze droeg een jurk met een hoge kraag, en bij haar keel, opgespeld net onder de kraag, zat een broche. Zelfs in de zachte bruine afbeelding kon je zien dat het een fijn stuk was, goud verwerkt in een ingewikkelde zetting rondom één enkele grote steen die door de oude film als een bleke, grijze gloed was vastgelegd.</w:t>
       </w:r>
     </w:p>
     <w:p>
@@ -664,7 +664,7 @@
     </w:p>
     <w:p>
       <w:r>
-        <w:t>„In 1924 werkte mijn overgrootmoeder, Constance Okafor, als dienstmeid bij de Blackburns,” zei ze. „Ze was jong. Negentien, misschien twintig. Zij waren destijds de rijkste familie in Frost Falls, de rijkste in de omtrek van vijftig mijl, en zij maakte hun kamers schoon, stookte hun haarden op en stofte hun spullen, inclusief die broche, dag in dag uit.” Ze haalde adem en rilde even. „En op een winter nam Constance hem mee. Ze stikte hem, Jessica. Die broche, zo van de toilettafel, of uit zijn doosje, ik weet niet precies hoe. En ze droeg hem dat huis uit en ze is nooit meer teruggegaan.”</w:t>
+        <w:t xml:space="preserve">„In 1924 werkte mijn overgrootmoeder, Constance Okafor, als dienstmeid bij de Blackburns,” zei ze. „Ze was jong. Negentien, misschien twintig. Zij waren destijds de rijkste familie in Frost Falls, de rijkste in de omtrek van vijftig mijl, en zij maakte hun kamers schoon, stookte hun haarden op en stofte hun spullen, inclusief die broche, dag in dag uit.” Ze haalde adem en rilde even. „En op een winter nam Constance hem mee. Ze stal hem, Jessica. Die broche, zo van de toilettafel, of uit zijn doosje, ik weet niet precies hoe. En ze droeg hem dat huis uit en ze is nooit meer teruggegaan.”</w:t>
       </w:r>
     </w:p>
     <w:p>
@@ -679,7 +679,7 @@
     </w:p>
     <w:p>
       <w:r>
-        <w:t>Het gewicht daarvan daalde neer in het kleine kamertje. Ik zat met de foto in de ene hand en het briefje in de andere en probeerde het tot me doordringen. De herberg, waar het halve stadje wel eens ergens iets had gevierd, gebouwd op een diefstal van een eeuw geleden.</w:t>
+        <w:t xml:space="preserve">Het gewicht daarvan daalde neer in het kleine kamertje. Ik zat met de foto in de ene hand en het briefje in de andere en probeerde het tot me door te laten dringen. De herberg, waar het halve stadje wel eens ergens iets had gevierd, gebouwd op een diefstal van een eeuw geleden.</w:t>
       </w:r>
     </w:p>
     <w:p>
@@ -689,7 +689,7 @@
     </w:p>
     <w:p>
       <w:r>
-        <w:t xml:space="preserve">„Jaren.” Ze veegde met de achterkant van haar hand langs haar ogen, een kinderachtig gebaar. „Ik vond het nadat mijn moeder was gestorven. Er stond een koffer op zolder, een oude stoomkoffer, op slot, en de sleutel zat tussen moeders spullen met een labeltje eraan in haar eigen handschrift waarop enkel stond </w:t>
+        <w:t xml:space="preserve">„Jaren.” Ze veegde met de achterkant van haar hand langs haar ogen, een kinderlijk gebaar. „Ik vond het nadat mijn moeder was gestorven. Er stond een koffer op zolder, een oude stoomkoffer, op slot, en de sleutel zat tussen moeders spullen met een labeltje eraan in haar eigen handschrift waarop enkel stond </w:t>
       </w:r>
       <w:r>
         <w:rPr>
@@ -698,7 +698,7 @@
         <w:t>niet kwijtraken</w:t>
       </w:r>
       <w:r>
-        <w:t>. Dus dat ik hem opdeed, sprak vanzelf.” Een klein, gebroken lachje. „Brieven. Een pandbon, de echte, uit het winkeltje in Ridgeline, met de datum en het bedrag. Nog wat andere dingen. Allemaal klein opgevouwen en weggestopt in de hoekjes, zoals iets wat je niet over je hart kunt verkrijgen om weg te gooien, maar waar je ook niet naar durft te kijken. Mijn moeder wist het. Haar moeder wist het. En nu weet ik het. En niet één van ons heeft ooit een levende ziel iets verteld.” Ze keek me aan, haar ogen roodrandigd. „Wie kon ik het vertellen? Hoe vertel je zoiets aan wie dan ook? Hoe zouden ze naar mij kijken, naar de herberg, als ze het wisten?”</w:t>
+        <w:t xml:space="preserve">. Dus dat ik hem opendeed, sprak vanzelf.” Een klein, gebroken lachje. „Brieven. Een pandbon, de echte, uit het winkeltje in Ridgeline, met de datum en het bedrag. Nog wat andere dingen. Allemaal klein opgevouwen en weggestopt in de hoekjes, zoals iets wat je niet over je hart kunt verkrijgen om weg te gooien, maar waar je ook niet naar durft te kijken. Mijn moeder wist het. Haar moeder wist het. En nu weet ik het. En niet één van ons heeft ooit een levende ziel iets verteld.” Ze keek me aan, haar ogen roodomrand. „Wie kon ik het vertellen? Hoe vertel je zoiets aan wie dan ook? Hoe zouden ze naar mij kijken, naar de herberg, als ze het wisten?”</w:t>
       </w:r>
     </w:p>
     <w:p>
@@ -723,7 +723,7 @@
     </w:p>
     <w:p>
       <w:r>
-        <w:t>„Fiona,” zei ik langzaam, terwijl ik het briefje liet zakken. „Lees het nog eens. Er wordt gesproken over de saffier. De saffier in het hart, precies die woorden. En er wordt Ridgeline genoemd, waar ze hem heeft verkocht.” Ik draaide de foto naar haar toe, met mijn vinger vlak bij de bleke gloed van het juweel bij de keel van de vrouw. „Heb je die twee dingen ooit aan iemand verteld? Dat ze hem in Ridgeline heeft verkocht? Dat de steen een saffier was?”</w:t>
+        <w:t xml:space="preserve">„Fiona,” zei ik langzaam, terwijl ik het briefje liet zakken. „Lees het nog eens. Er wordt gesproken over de saffier. De saffier in haar hart, precies die woorden. En er wordt Ridgeline genoemd, waar ze hem heeft verkocht.” Ik draaide de foto naar haar toe, met mijn vinger vlak bij de bleke gloed van het juweel bij de keel van de vrouw. „Heb je die twee dingen ooit aan iemand verteld? Dat ze hem in Ridgeline heeft verkocht? Dat de steen een saffier was?”</w:t>
       </w:r>
     </w:p>
     <w:p>
@@ -758,7 +758,7 @@
     </w:p>
     <w:p>
       <w:r>
-        <w:t>„Neem ze mee.” Ze slaakte een zucht die nog het meest weghad van een lach, zo'n versleten soort waar geen greintje vrolijkheid meer in zit. „Neem ze mee, en alsjeblieft, Jessica, zorg dat het stopt. Ik lig elke nacht wakker in het donker te rekenen. Ik heb het niet. Vijf honderdduizend dollar. Ik heb er nog geen tiende van. Ik heb een herberg vol liefde, een stapel rekeningen in de kantoorlade en de goede week van de Worthingtons. Dat is alles wat ik bezit op deze aardbol.”</w:t>
+        <w:t xml:space="preserve">„Neem ze mee.” Ze slaakte een zucht die nog het meest weghad van een lach, zo'n versleten soort waar geen greintje vrolijkheid meer in zit. „Neem ze mee, en alsjeblieft, Jessica, zorg dat het stopt. Ik lig elke nacht wakker in het donker te rekenen. Ik heb het niet. Vijfhonderdduizend dollar. Ik heb er nog geen tiende van. Ik heb een herberg vol liefde, een stapel rekeningen in de kantoorlade en de goede week van de Worthingtons. Dat is alles wat ik bezit op deze aardbol.”</w:t>
       </w:r>
     </w:p>
     <w:p>
@@ -826,13 +826,13 @@
     <w:p/>
     <w:p>
       <w:r>
-        <w:t>Dus vertelde ik het hem. Alles, terwijl de soep dampte en Pip lag te suffen bij het fornuis met één zwemvlies over haar ogen. Het telefoontje. De kleine zitkamer met de luidruchtige klok. Het briefje, het rode lint en het contante geld onder de treden. De foto van de naamloze Blackburn-vrouw met de broche op haar borst. Constance Okafor, negentien of twintig in een strenge winter, de diefstal, het pandjeshuis twee dorpen verderop in Ridgeline, de herberg gekocht van het geld. En de kist op zolder met het slot erop die niemand had geopend behalve Fiona zelf.</w:t>
-      </w:r>
-    </w:p>
-    <w:p/>
-    <w:p>
-      <w:r>
-        <w:t>Toen ik het briefje op tafel legde, werd Pip wakker. Ze kwam naar de rand van de tafel, rekte zich uit en drukte haar snavel plat tegen het papier. Toen bleef ze doodstil liggen, zoals ze deed wanneer ze een geur had opgevangen en zekerheid zocht. Daarna liep ze terug naar het fornuis en ging weer liggen met haar rug naar ons toe.</w:t>
+        <w:t xml:space="preserve">Dus vertelde ik het hem. Alles, terwijl de soep dampte en Pip lag te suffen bij het fornuis met één vleugel over haar ogen. Het telefoontje. De kleine zitkamer met de luidruchtige klok. Het briefje, het rode lint en het contante geld onder de treden. De foto van de naamloze Blackburn-vrouw met de broche op haar borst. Constance Okafor, negentien of twintig in een strenge winter, de diefstal, het pandjeshuis twee dorpen verderop in Ridgeline, de herberg gekocht van het geld. En de koffer op zolder met het slot erop die niemand had geopend behalve Fiona zelf.</w:t>
+      </w:r>
+    </w:p>
+    <w:p/>
+    <w:p>
+      <w:r>
+        <w:t xml:space="preserve">Toen ik het briefje op tafel legde, werd Pip wakker. Ze kwam naar de rand van de tafel, rekte zich uit en drukte haar snavel plat tegen het papier. Toen bleef ze doodstil staan, zoals ze deed wanneer ze een geur had opgevangen en zekerheid zocht. Daarna liep ze terug naar het fornuis en ging weer liggen met haar rug naar ons toe.</w:t>
       </w:r>
     </w:p>
     <w:p/>
@@ -844,19 +844,19 @@
     <w:p/>
     <w:p>
       <w:r>
-        <w:t>„De vraag is dus niet wie er een hekel heeft aan Fiona”, zei hij. „Omdat niemand een hekel heeft aan Fiona. Je zou in dit hele dorp geen mens kunnen vinden die een lelijk woord over haar spreekt, al bood je er een beloning voor. De vraag is wie de papieren van de Blackburns heeft gelezen.”</w:t>
-      </w:r>
-    </w:p>
-    <w:p/>
-    <w:p>
-      <w:r>
-        <w:t>„Daar kwam ik ook op uit.” Ik zette mijn lepel neer. „Ze is stellig over die kist, en ik geloof haar, Nick. Je móét haar wel geloven als je haar gezicht had gezien. Het geheim is dus niet via haar kant uitgelekt. Het kwam van de andere kant. Die van de Blackburns. Hun brieven, hun huishoudboekjes, wat de familie honderd jaar geleden ook maar opschreef toen er een broche uit het huis verdween. En waar belandt honderd jaar aan papier van de Blackburns?”</w:t>
-      </w:r>
-    </w:p>
-    <w:p/>
-    <w:p>
-      <w:r>
-        <w:t>„Waar alles wat oud is in dit dorp belandt.” Hij knikte langzaam. „Theo's archief. De Historische Kring.”</w:t>
+        <w:t xml:space="preserve">„De vraag is dus niet wie er een hekel heeft aan Fiona,” zei hij. „Omdat niemand een hekel heeft aan Fiona. Je zou in dit hele dorp geen mens kunnen vinden die een lelijk woord over haar spreekt, al bood je er een beloning voor. De vraag is wie de papieren van de Blackburns heeft gelezen.”</w:t>
+      </w:r>
+    </w:p>
+    <w:p/>
+    <w:p>
+      <w:r>
+        <w:t xml:space="preserve">„Daar kwam ik ook op uit.” Ik zette mijn lepel neer. „Ze is stellig over die koffer, en ik geloof haar, Nick. Je móét haar wel geloven als je haar gezicht had gezien. Het geheim is dus niet via haar kant uitgelekt. Het kwam van de andere kant. Die van de Blackburns. Hun brieven, hun huishoudboekjes, wat de familie honderd jaar geleden ook maar opschreef toen er een broche uit het huis verdween. En waar belandt honderd jaar aan papier van de Blackburns?”</w:t>
+      </w:r>
+    </w:p>
+    <w:p/>
+    <w:p>
+      <w:r>
+        <w:t xml:space="preserve">„Waar alles wat oud is in dit dorp belandt.” Hij knikte langzaam. „Theo's archief. Het Historisch Genootschap.”</w:t>
       </w:r>
     </w:p>
     <w:p/>
@@ -874,7 +874,7 @@
     <w:p/>
     <w:p>
       <w:r>
-        <w:t>„Theo Hussein,” zei hij, „is een van de vriendelijkste mannen in Frost Falls. Dat weet jij net zo goed als ik. Hij moest bijna huilen toen we hem de oude werkplaatsslede lieten fotograferen voor zijn verzameling. Hij brengt op zaterdagen cacao mee naar het voorleesuur voor de kinderen, de goede cacao, met van die mini-marshmallows erin, uit zijn eigen zak, omdat hij vindt dat de kinderen van Frost Falls moeten opgroeien in het besef waar ze vandaan komen.” Hij keek me aan. „Ik zeg dat niet om met je in discussie te gaan. Ik zeg het omdat het waar is, en omdat je zult inzien dat het waar is tijdens alles wat hierna komt, anders pak je het verkeerd aan.”</w:t>
+        <w:t xml:space="preserve">„Theo Hussein,” zei hij, „is een van de vriendelijkste mannen in Frost Falls. Dat weet jij net zo goed als ik. Hij moest bijna huilen toen we hem de oude werkplaatsslede lieten fotograferen voor zijn verzameling. Hij brengt op zaterdagen cacao mee naar het voorleesuur voor de kinderen, de goede cacao, met van die mini-marshmallows erin, uit zijn eigen zak, omdat hij vindt dat de kinderen van Frost Falls moeten opgroeien in het besef waar ze vandaan komen.” Hij keek me aan. „Ik zeg dat niet om met je in discussie te gaan. Ik zeg het omdat het waar is, en omdat je het voor waar zult moeten blijven houden tijdens alles wat hierna komt, anders pak je het verkeerd aan.”</w:t>
       </w:r>
     </w:p>
     <w:p/>
@@ -898,7 +898,7 @@
     <w:p/>
     <w:p>
       <w:r>
-        <w:t>„De tentoonstelling gaat morgen open,” zei ik. „Die van het archief. Al die oude documenten die worden tentoongesteld, de oude kaarten en de brieven en de foto's. Theo woont zo ongeveer in het Kringgebouw om het klaar te krijgen, Martha zegt dat hij al dagen niet thuis is geweest. En half het dorp is er straks bij voor de opening.”</w:t>
+        <w:t xml:space="preserve">„De tentoonstelling gaat morgen open,” zei ik. „Die van het archief. Al die oude documenten die worden tentoongesteld, de oude kaarten en de brieven en de foto's. Theo woont zo ongeveer in het gebouw van het Genootschap om het klaar te krijgen, Martha zegt dat hij al dagen niet thuis is geweest. En half het dorp is er straks bij voor de opening.”</w:t>
       </w:r>
     </w:p>
     <w:p/>
@@ -928,7 +928,7 @@
     <w:p/>
     <w:p>
       <w:r>
-        <w:t>„Wat ben je daar buiten aan het bouwen?” vroeg ik hem terwijl ik mijn handen afdroogde. Ik had het al eerder gevraagd. Hij was er inmiddels al weken mee bezig, en vertrok na het eten met een lantaarn op zak, neuriënd, om pas laat binnen te komen terwijl hij rook naar gezaagd vurenhout en iets warms dat ik niet thuis kon brengen.</w:t>
+        <w:t xml:space="preserve">„Wat ben je daar buiten aan het bouwen?” vroeg ik hem terwijl ik mijn handen afdroogde. Ik had het al eerder gevraagd. Hij was er inmiddels al weken mee bezig, en vertrok na het eten met een lantaarn, neuriënd, om pas laat binnen te komen terwijl hij rook naar gezaagd grenenhout en iets warms dat ik niet thuis kon brengen.</w:t>
       </w:r>
     </w:p>
     <w:p/>
@@ -946,7 +946,7 @@
     <w:p/>
     <w:p>
       <w:r>
-        <w:t>„Voor iedereen.” Hij kwam eraan en kuste me boven op mijn hoofd op weg naar de kast om de kommen weg te zetten. „Maar nu nog niet. Ga daar niet naar buiten, Jess. Beloof me dat. Het is nog niet klaar, en iets wat niet klaar is kan mislukken als er te vroeg naar gekeken wordt. Sommige dingen hebben het duisternis nodig om in te groeien. Bloembollen wel. Dit ook.”</w:t>
+        <w:t xml:space="preserve">„Voor iedereen.” Hij kwam eraan en kuste me boven op mijn hoofd op weg naar de kast om de kommen weg te zetten. „Maar nu nog niet. Ga daar niet naar buiten, Jess. Beloof me dat. Het is nog niet klaar, en iets wat niet klaar is kan mislukken als er te vroeg naar gekeken wordt. Sommige dingen hebben de duisternis nodig om in te groeien. Bloembollen wel. Dit ook.”</w:t>
       </w:r>
     </w:p>
     <w:p/>
@@ -1042,13 +1042,13 @@
     <w:p/>
     <w:p>
       <w:r>
-        <w:t>„Naar een thuis, denk ik,” zei hij. „Net als iedereen. Net als wij toen we hierheen kwamen. Het is met ons mee naar beneden gekomen vanaf het dak van de wereld en het is zijn plek kwijtgeraakt, en nu dwaalt het daar buiten in het duisternis rond van deur tot deur, net als iemand die zijn huis is kwijtgeraakt. Op zoek naar een plek die warm genoeg is om te blijven.”</w:t>
-      </w:r>
-    </w:p>
-    <w:p/>
-    <w:p>
-      <w:r>
-        <w:t>We bleven daar nog een poosje staan kijken naar het gouden stadje, en daarna gingen we naar bed. Ik lag nog een flinke tijd wakker in het donker, terwijl ik twee dingen tegelijk bezighield. Ergens beneden in Frost Falls had iemand tussen de dozen van Blackburn gestaan en een manier gevonden om zijn hand te sluiten om de keel van een goede vrouw voor een half miljoen dollar. En voorbij de weide was mijn man een verrassing aan het bouwen waar hij geen naam aan wilde geven, terwijl de lichten uit zichzelf goud kleurden en de magie die we hadden meegebracht door het duisternis joeg op zoek naar een plek om neer te strijken.</w:t>
+        <w:t xml:space="preserve">„Naar een thuis, denk ik,” zei hij. „Net als iedereen. Net als wij toen we hierheen kwamen. Het is met ons mee naar beneden gekomen vanaf het dak van de wereld en het is zijn plek kwijtgeraakt, en nu dwaalt het daar buiten in de duisternis rond van deur tot deur, net als iemand die zijn huis is kwijtgeraakt. Op zoek naar een plek die warm genoeg is om te blijven.”</w:t>
+      </w:r>
+    </w:p>
+    <w:p/>
+    <w:p>
+      <w:r>
+        <w:t xml:space="preserve">We bleven daar nog een poosje staan kijken naar het gouden stadje, en daarna gingen we naar bed. Ik lag nog een flinke tijd wakker in het donker, terwijl ik twee dingen tegelijk bezighield. Ergens beneden in Frost Falls had iemand tussen de dozen van Blackburn gestaan en een manier gevonden om zijn hand te sluiten om de keel van een goede vrouw voor een half miljoen dollar. En voorbij de weide was mijn man een verrassing aan het bouwen waar hij geen naam aan wilde geven, terwijl de lichten uit zichzelf goud kleurden en de magie die we hadden meegebracht door de duisternis joeg op zoek naar een plek om neer te strijken.</w:t>
       </w:r>
     </w:p>
     <w:p/>
@@ -1065,7 +1065,7 @@
     <w:p/>
     <w:p>
       <w:r>
-        <w:t xml:space="preserve">De Frost Falls Historical Society was een smal bakstenen pand aan het pleintje, en op de ochtend dat de archieftentoonstelling opende, liepen er meer mensen in en uit dan ik er ooit had gezien. Het stoepje ervoor was een trage rivier van jassen. Iemand had een spandoek boven de deur gehangen, met de hand geschilderd: </w:t>
+        <w:t xml:space="preserve">Het Historisch Genootschap van Frost Falls was een smal bakstenen pand aan het pleintje, en op de ochtend dat de archieftentoonstelling opende, liepen er meer mensen in en uit dan ik er ooit had gezien. Het stoepje ervoor was een trage rivier van jassen. Iemand had een spandoek boven de deur gehangen, met de hand geschilderd: </w:t>
       </w:r>
       <w:r>
         <w:rPr>
@@ -1086,7 +1086,7 @@
     <w:p/>
     <w:p>
       <w:r>
-        <w:t>Binnen was elke muur voor de tentoonstelling ingeruimd. De muren waar gewoonlijk vaagke kaarten en een spoorboekje uit 1911 hingen, waren nu bekleed met ingelijste brieven, foto’s en vergeelde eigendomsbewijzen. Elk stuk was voorzien van een opschrift in een klein, netjes, hellend handschrift dat ik al herkende voordat ik er een woord van had gelezen, omdat ik het had gezien op de kaartjes bij het voorlezen voor de kinderen en op de kleine bordjes in de museumvitrines. Theo’s handschrift. Hij voorzag alles van een label. Hij zou de cider nog van een label hebben voorzien als iemand hem zijn gang had laten gaan.</w:t>
+        <w:t xml:space="preserve">Binnen was elke muur voor de tentoonstelling ingeruimd. De muren waar gewoonlijk vage kaarten en een spoorboekje uit 1911 hingen, waren nu bekleed met ingelijste brieven, foto’s en vergeelde eigendomsbewijzen. Elk stuk was voorzien van een opschrift in een klein, netjes, hellend handschrift dat ik al herkende voordat ik er een woord van had gelezen, omdat ik het had gezien op de kaartjes bij het voorlezen voor de kinderen en op de kleine bordjes in de museumvitrines. Theo’s handschrift. Hij voorzag alles van een label. Hij zou de cider nog van een label hebben voorzien als iemand hem zijn gang had laten gaan.</w:t>
       </w:r>
     </w:p>
     <w:p/>
@@ -1098,7 +1098,7 @@
     <w:p/>
     <w:p>
       <w:r>
-        <w:t>Voor iedereen die binnenkwam had hij een glimlach, een echte, stralende glimlach, soms met beide handen erbij, en hij vertelde een lange man in een parka iets over de eigendomsbewijzen waardoor de man instemmend knikte en langzaam achteruitdeinsde. Maar tussen elke begroeting in, in de halve seconde dat hij dacht dat niemand keek, viel de glimlach van zijn gezicht als iets dat te zwaar was om vast te houden, en wat eronder tevoorschijn kwam hield me aan de grond genageld. Zijn huid had een grauwe waas. Onder zijn ogen zaten paarse kringen zo diep als blauwe plekken. Zijn das zat een kwartslag scheef geknoopt, en op een van de glazen van zijn bril zat een vette duimafdruk waar hij de energie niet meer voor had om hem op te merken, laat staan schoon te maken. Terwijl ik keek, streek hij zijn das glad. Een ogenblik later streek hij hem weer glad, precies dezelfde beweging, alsof hij vergeten was dat hij dat net al had gedaan.</w:t>
+        <w:t xml:space="preserve">Voor iedereen die binnenkwam had hij een glimlach, een echte, stralende glimlach, soms met beide handen erbij, en hij vertelde een lange man in een parka iets over de eigendomsbewijzen waardoor de man instemmend knikte en langzaam achteruitdeinsde. Maar tussen elke begroeting in, in de halve seconde dat hij dacht dat niemand keek, viel de glimlach van zijn gezicht als iets dat te zwaar was om vast te houden, en wat eronder tevoorschijn kwam hield me aan de grond genageld. Zijn huid had een grauw waas. Onder zijn ogen zaten paarse kringen zo diep als blauwe plekken. Zijn das zat een kwartslag scheef geknoopt, en op een van de glazen van zijn bril zat een vette duimafdruk waar hij de energie niet meer voor had om hem op te merken, laat staan schoon te maken. Terwijl ik keek, streek hij zijn das glad. Een ogenblik later streek hij hem weer glad, precies dezelfde beweging, alsof hij vergeten was dat hij dat net al had gedaan.</w:t>
       </w:r>
     </w:p>
     <w:p/>
@@ -1122,7 +1122,7 @@
     <w:p/>
     <w:p>
       <w:r>
-        <w:t>„Er zijn geen saaie bordjes,” zei hij met zo’n gekwetste oprechtheid dat ik moest lachen. Hij lachte ook, opgelucht, en hield mijn handen nog even langer vast. Op dat moment verafschuwde ik wat ik hier was komen doen: in zijn prachtige tentoonstelling rondlopen op zoek naar een afperser.</w:t>
+        <w:t xml:space="preserve">„Er zijn geen saaie bordjes,” zei hij met zo’n gekwetste oprechtheid dat ik moest lachen. Hij lachte ook, blij, en hield mijn handen nog even langer vast. Op dat moment verafschuwde ik wat ik hier was komen doen: in zijn prachtige tentoonstelling rondlopen op zoek naar een afperser.</w:t>
       </w:r>
     </w:p>
     <w:p/>
@@ -1206,7 +1206,7 @@
     <w:p/>
     <w:p>
       <w:r>
-        <w:t>„Ik moet één teleurstelling op mijn geweten bekijken.” Hij wreef in zijn nek, vol spijt, en de mensen leunden liefkozend naar voren. Iedereen hield van Theo als hij zo deed. „We zijn niet helemaal compleet. Sommige brieven van de Blackburns, een paar van de allerinteressantste, degene die ik jullie het liefst allemaal wilde laten zien, zijn tijdens het sorteren zoekgeraakt. Verkeerd gearchiveerd, zeker weten, niet echt kwijt, zulke dingen duiken altijd op de dag nadat je bent gestopt met zoeken. Maar ze liggen niet in de vitrine, en ik wilde ze daar zo graag hebben, en ik vrees dat de schuld bij mijn eigen slechte orde ligt.” Hij spreidde zijn handen en zijn glimlach werd zelfspot. „Een historicus die zijn eigen brieven niet kan vinden. Tja. Zeg het maar niet tegen de subsidiecommissie.”</w:t>
+        <w:t xml:space="preserve">„Ik moet één teleurstelling opbiechten.” Hij wreef in zijn nek, vol spijt, en de mensen leunden liefkozend naar voren. Iedereen hield van Theo als hij zo deed. „We zijn niet helemaal compleet. Sommige brieven van de Blackburns, een paar van de allerinteressantste, degene die ik jullie het liefst allemaal wilde laten zien, zijn tijdens het sorteren zoekgeraakt. Verkeerd gearchiveerd, zeker weten, niet echt kwijt, zulke dingen duiken altijd op de dag nadat je bent gestopt met zoeken. Maar ze liggen niet in de vitrine, en ik wilde ze daar zo graag hebben, en ik vrees dat de schuld bij mijn eigen slechte orde ligt.” Hij spreidde zijn handen en zijn glimlach werd zelfspottend. „Een historicus die zijn eigen brieven niet kan vinden. Tja. Zeg het maar niet tegen de subsidiecommissie.”</w:t>
       </w:r>
     </w:p>
     <w:p/>
@@ -1218,7 +1218,7 @@
     <w:p/>
     <w:p>
       <w:r>
-        <w:t>Theo trok zijn schouders op, verheugd, en ging verder met iedereen uit te nodigen voor de cider.</w:t>
+        <w:t xml:space="preserve">Theo boog zijn hoofd, verheugd, en ging verder met iedereen uit te nodigen voor de cider.</w:t>
       </w:r>
     </w:p>
     <w:p/>
@@ -1272,7 +1272,7 @@
     <w:p/>
     <w:p>
       <w:r>
-        <w:t>Maar ik vouwde het toch in de zak van mijn jas, naast de brief. Ik richtte me op en keek nog één keer om naar de warme, volle zaal. Naar Theo, die nu gehurkt bij de cidertafel zat en met heel zijn vermoeide hart een kleine jongen vertelde over de stichting van het stadje, terwijl de ogen van de jongen groot waren van verbazing. Naar Vera bij de balie, die haar doos met papieren voor de laatste keer een kwartcentimeter rechtlegde. Naar Neil Carter bij de vitrine, die iets in zijn notitieboekje schreef. En naar de stapel crème briefpapier naast Vera’s elkaars dat het licht ving.</w:t>
+        <w:t xml:space="preserve">Maar ik vouwde het toch in de zak van mijn jas, naast de brief. Ik richtte me op en keek nog één keer om naar de warme, volle zaal. Naar Theo, die nu gehurkt bij de cidertafel zat en met heel zijn vermoeide hart een kleine jongen vertelde over de stichting van het stadje, terwijl de ogen van de jongen groot waren van verbazing. Naar Vera bij de balie, die haar doos met papieren voor de laatste keer een halve centimeter rechtlegde. Naar Neil Carter bij de vitrine, die iets in zijn notitieboekje schreef. En naar de stapel crèmekleurig briefpapier naast Vera’s elleboog, die het licht ving.</w:t>
       </w:r>
     </w:p>
     <w:p/>
@@ -1284,7 +1284,7 @@
     <w:p/>
     <w:p>
       <w:r>
-        <w:t>Wat ik nu moest zien te vinden, was wie hier in de stilte was geweest, nadat de deuren waren vergrendeld en de dozen onbeheerd achterbleven, om bij lamplicht een eeuwenoud geheim te lezen en te besluiten het te gelde te maken.</w:t>
+        <w:t xml:space="preserve">Wat ik nu moest zien te vinden, was wie hier in de stilte was geweest, nadat de deuren waren vergrendeld en de dozen onbeheerd achterbleven, om bij lamplicht een honderd jaar oud geheim te lezen en te besluiten het te gelde te maken.</w:t>
       </w:r>
     </w:p>
     <w:p>
@@ -1320,7 +1320,7 @@
     </w:p>
     <w:p>
       <w:r>
-        <w:t>„Het is helemaal niet vervroegd”, zei Dot zonder op te kijken van haar werk. „Het is het laatste weekend van oktober, net als al sinds voordat jij geboren bent. Jij bent gewoon traag.”</w:t>
+        <w:t xml:space="preserve">„Het is helemaal niet vervroegd”, zei Dot zonder op te kijken van haar werk. „Het is het laatste weekend van oktober, zoals het al is sinds voordat jij geboren bent. Jij bent gewoon traag.”</w:t>
       </w:r>
     </w:p>
     <w:p>
@@ -1390,7 +1390,7 @@
     </w:p>
     <w:p>
       <w:r>
-        <w:t>Ik breidde en luisterde. De contouren ervan drongen koud en helder tot me doordringen, steek voor steek. Hier was een man die één ding op deze wereld meer liefhad dan zijn nachtrust of zijn avondeten, en dat ding lag te creperen bij gebrek aan geld. Hij was bij elke fatsoenlijke deur langsgegaan die hij kon bedenken en had ze stuk voor stuk voor zijn nacht dicht zien slaan.</w:t>
+        <w:t xml:space="preserve">Ik breidde en luisterde. De contouren ervan drongen koud en helder tot me door, steek voor steek. Hier was een man die één ding op deze wereld meer liefhad dan zijn nachtrust of zijn avondeten, en dat ding lag te creperen bij gebrek aan geld. Hij was bij elke fatsoenlijke deur langsgegaan die hij kon bedenken en had ze stuk voor stuk voor zijn neus dicht zien slaan.</w:t>
       </w:r>
     </w:p>
     <w:p>
@@ -1400,7 +1400,7 @@
     </w:p>
     <w:p>
       <w:r>
-        <w:t>Wie de geheimen uit de stukken haalt, weet waar hij moet zoeken, had Nick gezegd. Niet wie. Een hele hoop mensen in Frost Falls hadden te doen met Theo. De helft van het stadje zou in tranen zijn uitgebarsten als ze hadden geweten hoe slecht het ervoor stond. Medelijden hebben met een man, zelfs de wanhopigste man van het stadje zijn, is niet hetzelfde als een vriend afpersen om geld, en ik liet het een niet in mijn hoofd overlopen in het ander zonder meer bewijs dan wat rekenwerk en een slecht gevoel. Dus ik bleef breien, ik hield mijn hand gesloten, en ik hield mijn vermoeden voorzichtig vast, als een kooltje, klaar om het te laten vallen.</w:t>
+        <w:t xml:space="preserve">Weten dat het geheim uit de papieren kwam, vertelt je waar je moet gaan staan, had Nick gezegd. Niet wie. Een hele hoop mensen in Frost Falls hadden te doen met Theo. De helft van het stadje zou in tranen zijn uitgebarsten als ze hadden geweten hoe slecht het ervoor stond. Medelijden hebben met een man, zelfs de wanhopigste man van het stadje zijn, is niet hetzelfde als een vriend afpersen om geld, en ik liet het een niet in mijn hoofd overlopen in het ander zonder meer bewijs dan wat rekenwerk en een slecht gevoel. Dus ik bleef breien, ik hield mijn hand open, en ik hield mijn vermoeden voorzichtig vast, als een kooltje, klaar om het te laten vallen.</w:t>
       </w:r>
     </w:p>
     <w:p>
@@ -1420,7 +1420,7 @@
     </w:p>
     <w:p>
       <w:r>
-        <w:t>Daarna verschoof het gesprek naar de wanten, naar de pasgeboren baby van Ivy's dochter, en naar de vraag of sneeuw op de eerste oktober een strenge of een zachte winter betekende, waar ze het niet over eens werden. Ik liet het gesprek kabbelen. Naast me was Martha stil geworden over haar werk. Na een poosje leunde ze een beetje naar me toe en zei zacht, alleen voor ons tweeën: „En hoe gaat het met onze Fiona? Ik heb gehoord dat ze niet helemaal zichzelf is.”</w:t>
+        <w:t xml:space="preserve">Daarna verschoof het gesprek naar de wanten, naar de pasgeboren baby van Ivy's dochter, en naar de vraag of een eerste sneeuw in oktober een strenge of een zachte winter betekende, waar ze het niet over eens werden. Ik liet het gesprek kabbelen. Naast me was Martha stil geworden over haar werk. Na een poosje leunde ze een beetje naar me toe en zei zacht, alleen voor ons tweeën: „En hoe gaat het met onze Fiona? Ik heb gehoord dat ze niet helemaal zichzelf is.”</w:t>
       </w:r>
     </w:p>
     <w:p>
@@ -1430,7 +1430,7 @@
     </w:p>
     <w:p>
       <w:r>
-        <w:t>„Mm.” Martha was niet achterlijk. Ze liet die mm even hangen, omdat ze me niet geloofde maar er ook niet op doorvroeg. „Zeg maar tegen haar dat de kring er is, als ze ons nodig heeft. We zijn oud, maar niet nutteloos. Er is geen enkel probleem in dit stadje waar we niet samen met iemand doorheen hebben gezeten.” Toen legde ze haar naalden weer neer, reikte uit en legde haar gevlekte, sterke, oude hand op mijn knie. „En jij, Jessica. Jij hebt die blik. Die je een paar weken geleden ook had, om dat kind van Redfern, toen je de boel niet wilde laten rusten terwijl de rest van ons vond dat je dat wel moest doen. Je draagt iets met je mee.”</w:t>
+        <w:t xml:space="preserve">„Mm.” Martha was niet gek. Ze liet die mm even hangen, omdat ze me niet geloofde maar er ook niet op doorvroeg. „Zeg maar tegen haar dat de kring er is, als ze ons nodig heeft. We zijn oud, maar niet nutteloos. Er is geen enkel probleem in dit stadje waar we niet samen met iemand doorheen hebben gezeten.” Toen legde ze haar naalden weer neer, reikte uit en legde haar gevlekte, sterke, oude hand op mijn knie. „En jij, Jessica. Jij hebt die blik. Die je een paar weken geleden ook had, om dat kind van Redfern, toen je de boel niet wilde laten rusten terwijl de rest van ons vond dat je dat wel moest doen. Je draagt iets met je mee.”</w:t>
       </w:r>
     </w:p>
     <w:p>
@@ -1450,17 +1450,17 @@
     </w:p>
     <w:p>
       <w:r>
-        <w:t>„Dank je”, zei ik, en ik moest even schrapen. „Dat zal ik onthouden.”</w:t>
-      </w:r>
-    </w:p>
-    <w:p>
-      <w:r>
-        <w:t>„Zorg dat je dat doet.” En ze ging weer verder met haar want alsof ze me zojuist niet het een en ander te horen had gegeven.</w:t>
-      </w:r>
-    </w:p>
-    <w:p>
-      <w:r>
-        <w:t>Toen Pip en ik een uur later vertrokken, was het licht uitgedund tot de kleur van slappe thee, en stonden de mannen weer op het grasveld de laatste festivallampjes tussen de lantaarnpalen te spannen, terwijl ze elkaar in de kou toeroepen. Ik bleef even op de hoek staan en keek naar de nieuwe donkere snoeren die werden opgehangen, en ik dacht aan geld.</w:t>
+        <w:t xml:space="preserve">„Dank je”, zei ik, en ik moest even mijn keel schrapen. „Dat zal ik onthouden.”</w:t>
+      </w:r>
+    </w:p>
+    <w:p>
+      <w:r>
+        <w:t xml:space="preserve">„Zorg dat je dat doet.” En ze ging weer verder met haar want alsof ze me zojuist helemaal niets had gegeven.</w:t>
+      </w:r>
+    </w:p>
+    <w:p>
+      <w:r>
+        <w:t xml:space="preserve">Toen Pip en ik een uur later vertrokken, was het licht uitgedund tot de kleur van slappe thee, en stonden de mannen weer op het grasveld de laatste festivallampjes tussen de lantaarnpalen te spannen, terwijl ze elkaar in de kou toeriepen. Ik bleef even op de hoek staan en keek naar de nieuwe donkere snoeren die werden opgehangen, en ik dacht aan geld.</w:t>
       </w:r>
     </w:p>
     <w:p>
@@ -1486,13 +1486,13 @@
     <w:p/>
     <w:p>
       <w:r>
-        <w:t>Ik was van plan geweest om die middag na te denken, maar in plaats daarvan bracht ik haar door met het sjouwen van pompoenen, wat voor een getergde geest hoe dan ook de betere keuze bleek te zijn.</w:t>
-      </w:r>
-    </w:p>
-    <w:p/>
-    <w:p>
-      <w:r>
-        <w:t>Het grasveld was de plek waar het feest zou plaatsvinden, de grote gemeenschappelijke weide ten zuiden van Evergreen die vanaf het dorpsplein afliep, met het oorlogsmonument vlak bij het begin en de grote iep aan de overkant. Het hele dorp was uitgelopen om de boel an te kleden. Er moesten schragen worden aangesleept en in rijen worden opgesteld, er moest aan de noordkant een podium worden gebouwd en er moesten wel duizend kleine kalebassen worden gerangschikt in een opstelling die nonchalant moest lijken. Daar zou door een commissie in werkelijkheid een uur lang over worden getwist. Ik was er alleen gekomen om de eerste dos wanten van de breiclub bij de feestcommissie af te leveren, en binnen negentig tellen nadat ik was aangekomen, was me door een onbekende man een kist met taartpompoenen in de handen gedrukt met de mededeling: „Zet die even vooraan bij het podium neer, wil je? Pas op voor die zachte.” Zo ging dat nu eenmaal in dit dorp, en dat vond ik helemaal niet erg. Met een kist pompoenen in mijn armen viel er niet na te denken, en dat kwam me goed uit.</w:t>
+        <w:t xml:space="preserve">Ik was van plan geweest om die middag na te denken, maar in plaats daarvan bracht ik haar door met het sjouwen van pompoenen, wat voor een onrustige geest hoe dan ook de betere keuze bleek te zijn.</w:t>
+      </w:r>
+    </w:p>
+    <w:p/>
+    <w:p>
+      <w:r>
+        <w:t xml:space="preserve">Het grasveld was de plek waar het feest zou plaatsvinden, de grote gemeenschappelijke weide ten zuiden van Evergreen die vanaf het dorpsplein afliep, met het oorlogsmonument vlak bij het begin en de grote iep aan de overkant. Het hele dorp was uitgelopen om de boel aan te kleden. Er moesten schragen worden aangesleept en in rijen worden opgesteld, er moest aan de noordkant een podium worden gebouwd en er moesten wel duizend kleine kalebassen worden gerangschikt in een opstelling die nonchalant moest lijken. Daar zou door een commissie in werkelijkheid een uur lang over worden getwist. Ik was er alleen gekomen om het eerste dozijn wanten van de breiclub bij de feestcommissie af te leveren, en binnen negentig tellen nadat ik was aangekomen, was me door een onbekende man een kist met taartpompoenen in de handen gedrukt met de mededeling: „Zet die even vooraan bij het podium neer, wil je? Pas op voor die zachte.” Zo ging dat nu eenmaal in dit dorp, en dat vond ik helemaal niet erg. Met een kist pompoenen in mijn armen viel er niet na te denken, en dat kwam me goed uit.</w:t>
       </w:r>
     </w:p>
     <w:p/>
@@ -1504,13 +1504,13 @@
     <w:p/>
     <w:p>
       <w:r>
-        <w:t>Ik draaide me om. Pip had haar hele kop begraven in de opengescheurde bovenkant van een lampion die iemand al vroeg had uitgehold; ze trok de natte pitten eruit en slingerde ze het gras in met dezelfde roekeloze zaligheid waarmee ze zich op alles stortte wat verboden was. Boven haar stond Emma Redfern, gevangen ergens tussen afschuw en vertedering.</w:t>
-      </w:r>
-    </w:p>
-    <w:p/>
-    <w:p>
-      <w:r>
-        <w:t>„O, nee toch, Pip.” Ik trok haar bij haar middel omhoog. Ze kwam tevoorschijn met pitten die aan haar snavel hingen, pompoenvlees op haar kin en geen spatje schaamte in haar hele lijf. „Het speet me ontzettend, Emma. Ze heeft echt totaal geen manieren. Geen enkele. We hebben het geprobeerd.”</w:t>
+        <w:t xml:space="preserve">Ik draaide me om. Pip had haar hele kop begraven in de opengescheurde bovenkant van een pompoenlantaarn die iemand al vroeg had uitgehold; ze trok de natte pitten eruit en slingerde ze het gras in met dezelfde roekeloze zaligheid waarmee ze zich op alles stortte wat verboden was. Boven haar stond Emma Redfern, gevangen ergens tussen afschuw en vertedering.</w:t>
+      </w:r>
+    </w:p>
+    <w:p/>
+    <w:p>
+      <w:r>
+        <w:t xml:space="preserve">„O, nee toch, Pip.” Ik trok haar bij haar middel omhoog. Ze kwam tevoorschijn met pitten die aan haar snavel hingen, pompoenvlees op haar kin en geen spatje schaamte in haar hele lijf. „Het spijt me ontzettend, Emma. Ze heeft echt totaal geen manieren. Geen enkele. We hebben het geprobeerd.”</w:t>
       </w:r>
     </w:p>
     <w:p/>
@@ -1546,7 +1546,7 @@
     <w:p/>
     <w:p>
       <w:r>
-        <w:t>Dat leverde me nog een lach op, en daarachter kwam Mark Redfern aan met een armvol klapstoelen. Toen hij ze neerzette, zich rechtop trok en zijn haar uit zijn voorhoofd veegde, zag ik waarop ik had gehoopt op zijn gezicht te zien: ontspanning. Hij was een uitgeholde man geweest toen ik hem voor het eerst kende, die zichzelf en zijn dochter met beide handen overeind hield terwijl er niets meer over was. Er zat weer kleur in hem. Hij keek naar Emma die om de pinguïn lachte, en zijn schouders, die al een jaar stijf hadden gestaan, ontspanden zich.</w:t>
+        <w:t xml:space="preserve">Dat leverde me nog een lach op, en daarachter kwam Mark Redfern aan met een armvol klapstoelen. Toen hij ze neerzette, zich rechtop trok en zijn haar uit zijn voorhoofd veegde, zag ik op zijn gezicht waarop ik had gehoopt: ontspanning. Hij was een uitgeholde man geweest toen ik hem voor het eerst kende, die zichzelf en zijn dochter met beide handen overeind hield terwijl er niets meer over was. Er zat weer kleur in hem. Hij keek naar Emma die om de pinguïn lachte, en zijn schouders, die al een jaar stijf hadden gestaan, ontspanden zich.</w:t>
       </w:r>
     </w:p>
     <w:p/>
@@ -1564,7 +1564,7 @@
     <w:p/>
     <w:p>
       <w:r>
-        <w:t>Daarna gingen we met zijn vieren en de hond aan de slag, stoelen sjouwend, kalebassen transporteren en gezellig discussiërend over welke pompoenen nou echt te zacht waren voor de eerste rij.</w:t>
+        <w:t xml:space="preserve">Daarna gingen we met zijn vieren en de hond aan de slag, stoelen sjouwend, kalebassen transporterend en gezellig discussiërend over welke pompoenen nou echt te zacht waren voor de eerste rij.</w:t>
       </w:r>
     </w:p>
     <w:p/>
@@ -1606,7 +1606,7 @@
     <w:p/>
     <w:p>
       <w:r>
-        <w:t>De wanten zaten nog steeds in mijn tas. Ik ging op zoek naar degene die de commissie leidde en vond de politiechef. Noriko Tanaka stond midden op het grasveld in een parka en een wollen muts, met een klembord in de ene hand en een reismok in de andere, en stuurde mensen naar de plekken waar ze nodig waren. Ze was een compacte vrouw van een jaar of vijftig met grijze slapen en een versleten notitieboekje dat uit haar jaszak stak. Olivia had me verteld dat ze na twintig jaar bij de staatsrecherche was teruggekomen om een korps van zes man te leiden, en dat niemand in Frost Falls haar ooit haar stem had horen verheffen.</w:t>
+        <w:t xml:space="preserve">De wanten zaten nog steeds in mijn tas. Ik ging op zoek naar degene die de commissie leidde en vond de politiechef. Noriko Tanaka stond midden op het grasveld in een parka en een wollen muts, met een klembord in de ene hand en een reismok in de andere, en stuurde mensen naar de plekken waar ze nodig waren. Ze was een compacte vrouw van een jaar of vijftig met grijze slapen en een versleten notitieboekje dat uit haar jaszak stak. Olivia had me verteld dat ze na twintig jaar bij de staatspolitie was teruggekomen om een korps van zes man te leiden, en dat niemand in Frost Falls haar ooit haar stem had horen verheffen.</w:t>
       </w:r>
     </w:p>
     <w:p/>
@@ -1642,7 +1642,7 @@
     <w:p/>
     <w:p>
       <w:r>
-        <w:t>Ze was teruggelopen naar de jack-o'-lantern die Pip had toegetakeld, degene waarvan de bovenkant was afgescheurd en de pitten over de rand in het koude gras waren gemorst. Ze was er roerloos bij blijven staan en had toen met een zacht, voorzichtig stemmetje dat geen angst verraadde gezegd: „Mevrouw Claus. Kijken.”</w:t>
+        <w:t xml:space="preserve">Ze was teruggelopen naar de jack-o'-lantern die Pip had toegetakeld, degene waarvan de bovenkant was afgescheurd en de pitten over de rand in het koude gras waren gemorst. Ze was er roerloos bij blijven staan en had toen met een zacht, voorzichtig stemmetje dat geen angst verraadde gezegd: „Mevrouw Claus. Kijk.”</w:t>
       </w:r>
     </w:p>
     <w:p/>
@@ -1678,7 +1678,7 @@
     <w:p/>
     <w:p>
       <w:r>
-        <w:t>„Van ons,” beaamde ik, en ik kruiste mijn hart, en zag hoe ze haar hand over de hulst hield om die te verbergen voor de drukke commissie, alsof ze een klein, warm geheim tussen haar handpalmen levend hield.</w:t>
+        <w:t xml:space="preserve">„Van ons,” beaamde ik, en ik legde mijn hand op mijn hart, en zag hoe ze haar hand over de hulst hield om die te verbergen voor de drukke commissie, alsof ze een klein, warm geheim tussen haar handpalmen levend hield.</w:t>
       </w:r>
     </w:p>
     <w:p/>
@@ -1714,7 +1714,7 @@
     <w:p/>
     <w:p>
       <w:r>
-        <w:t>En ik pakte mijn schaamteloze, pompoenharige vogeltje op en liep door de invallende kou naar huis.</w:t>
+        <w:t xml:space="preserve">En ik pakte mijn schaamteloze vogeltje met de pompoen op haar kin op en liep door de invallende kou naar huis.</w:t>
       </w:r>
     </w:p>
     <w:p>
@@ -1755,12 +1755,12 @@
     </w:p>
     <w:p>
       <w:r>
-        <w:t>Ze nam me mee naar de voorhal, waar het middaglicht schuin door het bovenlicht boven de deur scheen en als een lange gouden balk over de vloerdelen lag. Aan de muur bij de trap, in een eenvoudige donkere lijst waar ik al twaalf keer langs was gelopen zonder te kijken, hing een foto. Een vrouw in de jurk met de hoge kraag en het strak gegolfde haar van een eeuw geleden, haar kin opgeheven, haar donkere ogen net zo standvastig op de camera gericht als die van de vrouw uit de familie Blackburn op de andere foto, met dezelfde ingehouden blik, al stond die op dit gezicht harder, vermoeider en dichter op de huid. Jonger dan ik me had voorgesteld. Jonger dan de vrouw op de foto van de afperser, die een Blackburn in haar mooiste kleren was. Dit was Constance zelf, op een goedkope studeerkamerstoel met een geschilderde tuin op de achtergrond, gekleed in haar beste kleren, wat niet veel voorstelde.</w:t>
-      </w:r>
-    </w:p>
-    <w:p>
-      <w:r>
-        <w:t>„Dat is haar,” zei Fiona zachtjes. „De enige foto die we hebben. Mijn moeder zei dat hij is genomen in het jaar dat ze de herberg opende. Ze moet een jaar of een etentje, tweeëntwintig zijn geweest. Iets jonger toen ze de daad beging.” Ze reikte omhoog en zette de lijst een haarbreedte recht, hoewel dat niet nodig was, met dat kleine, overbodige tikje dat je geeft aan iets waar je van houdt. „Kijk naar haar gezicht, Jessica. Ik zit er al dagen naar te kijken. Ze ziet er niet uit als een doorgewinterde dievegge. Ze ziet eruit als een meisje dat een besluit had genomen. Een meisje met haar rug tegen de muur dat naar de muur keek en besloot dat ze er niet tegenover zou sterven.”</w:t>
+        <w:t xml:space="preserve">Ze nam me mee naar de voorhal, waar het middaglicht schuin door het bovenlicht boven de deur scheen en als een lange gouden balk over de vloerdelen lag. Aan de muur bij de trap, in een eenvoudige donkere lijst waar ik al twaalf keer langs was gelopen zonder te kijken, hing een foto. Een vrouw in de jurk met de hoge kraag en het strak gegolfde haar van een eeuw geleden, haar kin opgeheven, haar donkere ogen net zo standvastig op de camera gericht als die van de vrouw uit de familie Blackburn op de andere foto, met dezelfde ingehouden blik, al stond die op dit gezicht harder, vermoeider en dichter op de huid. Jonger dan ik me had voorgesteld. Jonger dan de vrouw op de foto van de afperser, die een Blackburn in haar mooiste kleren was. Dit was Constance zelf, op een goedkope studiostoel met een geschilderde tuin op de achtergrond, gekleed in haar beste kleren, wat niet veel voorstelde.</w:t>
+      </w:r>
+    </w:p>
+    <w:p>
+      <w:r>
+        <w:t xml:space="preserve">„Dat is haar,” zei Fiona zachtjes. „De enige foto die we hebben. Mijn moeder zei dat hij is genomen in het jaar dat ze de herberg opende. Ze moet een jaar of eenentwintig, tweeëntwintig zijn geweest. Iets jonger toen ze de daad beging.” Ze reikte omhoog en zette de lijst een haarbreedte recht, hoewel dat niet nodig was, met dat kleine, overbodige tikje dat je geeft aan iets waar je van houdt. „Kijk naar haar gezicht, Jessica. Ik zit er al dagen naar te kijken. Ze ziet er niet uit als een doorgewinterde dievegge. Ze ziet eruit als een meisje dat een besluit had genomen. Een meisje met haar rug tegen de muur dat naar de muur keek en besloot dat ze er niet tegenaan zou sterven.”</w:t>
       </w:r>
     </w:p>
     <w:p>
@@ -1863,7 +1863,7 @@
     <w:p/>
     <w:p>
       <w:r>
-        <w:t>En terwijl ik ernaar keek, ademde ik de smederij in, en daar was hij, onmiskenbaar, precies die geur die kleefde aan een vel crème papier dat in mijn jas was gevouwen. Hij zat op de brief, en hij was hier. En ik dwong mezelf rustig aan te doen, dwong mezelf de kolen in mijn open hand te houden en er geen vuist van te maken, want een geur is geen bekentenis. Sam Patel was naar alle maatstaven tien jaar lang niets anders dan recht door zee geweest voor dit hele stadje, en ik was gekomen om te kijken, niet om te oordelen.</w:t>
+        <w:t xml:space="preserve">En terwijl ik ernaar keek, ademde ik de smederij in, en daar was hij, onmiskenbaar, precies die geur die kleefde aan een vel crèmekleurig papier dat in mijn jas was gevouwen. Hij zat op de brief, en hij was hier. En ik dwong mezelf rustig aan te doen, dwong mezelf de kolen in mijn open hand te houden en er geen vuist van te maken, want een geur is geen bekentenis. Sam Patel was naar alle maatstaven tien jaar lang niets anders dan recht door zee geweest voor dit hele stadje, en ik was gekomen om te kijken, niet om te oordelen.</w:t>
       </w:r>
     </w:p>
     <w:p/>
@@ -1929,13 +1929,13 @@
     <w:p/>
     <w:p>
       <w:r>
-        <w:t>Hij keek me wezenloos aan. „Eigenaar van is geworden? Ze zijn altijd al eigenaar geweest. Zover als iemands geheugen strekt. Haar overgrootmoeder is ermee begonnen, dat is het enige dat ik weet, er hangt een foto van die vrouw in de hal.” Hij haalde zijn schouders op, duidelijk verbijsterd door de vraag. „Waarom zou ik meer weten dan dat? Ik ben een smid. Ik ken ijzer en ik weet dat mijn klanten te laat betalen. Die oude families en al die flauwekul, dat is het terrein van Theo, van de Historische Kring. Van stof ga ik niezen. Ik ben er nog nooit binnen geweest.”</w:t>
-      </w:r>
-    </w:p>
-    <w:p/>
-    <w:p>
-      <w:r>
-        <w:t>Hij zei het als een man die een nuchter feit vaststelde, niet alsof hij zich verdedigde, omdat het niet in zijn opkomt was dat er iets te verdedigen viel, en ik geloofde hem tot op het bot.</w:t>
+        <w:t xml:space="preserve">Hij keek me wezenloos aan. „Eigenaar van is geworden? Ze zijn altijd al eigenaar geweest. Zover als iemands geheugen strekt. Haar overgrootmoeder is ermee begonnen, dat is het enige dat ik weet, er hangt een foto van die vrouw in de hal.” Hij haalde zijn schouders op, duidelijk verbijsterd door de vraag. „Waarom zou ik meer weten dan dat? Ik ben een smid. Ik ken ijzer en ik weet dat mijn klanten te laat betalen. Die oude families en al die flauwekul, dat is het terrein van Theo, van het Historisch Genootschap. Van stof ga ik niezen. Ik ben er nog nooit binnen geweest.”</w:t>
+      </w:r>
+    </w:p>
+    <w:p/>
+    <w:p>
+      <w:r>
+        <w:t xml:space="preserve">Hij zei het als een man die een nuchter feit vaststelde, niet alsof hij zich verdedigde, omdat het niet bij hem was opgekomen dat er iets te verdedigen viel, en ik geloofde hem tot op het bot.</w:t>
       </w:r>
     </w:p>
     <w:p/>
@@ -1947,7 +1947,7 @@
     <w:p/>
     <w:p>
       <w:r>
-        <w:t>„Die zijn ook van haar,” zei hij, terwijl hij er een oppakte en in het licht hield, en zelfs nu nog sprak er liefde voor dat ding uit zijn handen. „De consolebeugels voor de veranda. Het laatste deel van de bestelling. Ik heb dit jaar heel wat van mezelf in die lobby gestopt, weet je. Je kunt door Fiona’s voorkamer lopen zonder iets aan te raken wat ik heb gemaakt, of er vlakbij in de buurt te zijn.” Hij legde de ster neer. „Best prima. Een smid laat een plek nu eenmaal graag achter met de geur van zijn vuur.”</w:t>
+        <w:t xml:space="preserve">„Die zijn ook van haar,” zei hij, terwijl hij er een oppakte en in het licht hield, en zelfs nu nog sprak er liefde voor dat ding uit zijn handen. „De consolebeugels voor de veranda. Het laatste deel van de bestelling. Ik heb dit jaar heel wat van mezelf in die lobby gestopt, weet je. Je kunt niet door Fiona’s voorkamer lopen zonder iets aan te raken wat ik heb gemaakt, of er vlakbij in de buurt te zijn.” Hij legde de ster neer. „Best prima. Een smid laat een plek nu eenmaal graag achter met de geur van zijn vuur.”</w:t>
       </w:r>
     </w:p>
     <w:p/>
@@ -1971,13 +1971,13 @@
     <w:p/>
     <w:p>
       <w:r>
-        <w:t>„Moet je doen.” Hij knikte eenmaal, ernstig. „En zeg haar maar dat die twintig dollar is verscheurd. Zeg dat ik er nooit meer iets over wil horen. Zeg dat ze me de volgende keer dat ze me ziet moet aankijken, dat is het enige wat ik ervan wil, gewoon haar blik voor een seconde zodat ik weet dat het goed zit.”</w:t>
-      </w:r>
-    </w:p>
-    <w:p/>
-    <w:p>
-      <w:r>
-        <w:t>Ik beloofde dat ik dat zou doen. Pip en ik liepen de weg weer terug richting het stadje terwijl achter ons het gerinkel van zijn hamer weer opam, vastberaden en helder, een goed man die sterren maakte in de kou.</w:t>
+        <w:t xml:space="preserve">„Doe dat.” Hij knikte eenmaal, ernstig. „En zeg haar maar dat die twintig dollar is verscheurd. Zeg dat ik er nooit meer iets over wil horen. Zeg dat ze me de volgende keer dat ze me ziet moet aankijken, dat is het enige wat ik ervan wil, gewoon haar blik voor een seconde zodat ik weet dat het goed zit.”</w:t>
+      </w:r>
+    </w:p>
+    <w:p/>
+    <w:p>
+      <w:r>
+        <w:t xml:space="preserve">Ik beloofde dat ik dat zou doen. Pip en ik liepen de weg weer terug richting het stadje terwijl achter ons het gerinkel van zijn hamer weer inzette, vastberaden en helder, een goed man die sterren maakte in de kou.</w:t>
       </w:r>
     </w:p>
     <w:p/>
@@ -2012,7 +2012,7 @@
     <w:p/>
     <w:p>
       <w:r>
-        <w:t>„Mevrouw Claus! Kom eens kijken, dit vindt u vast leuk.” Hij draaide een bros registerblad mijn kant op toen ik naderde. „Achttien éénentnegentig. De Blackburns legden de helft van het geld in voor de kerk aan het pleintje. Wist u dat? De helft. Vrijgevig, dat oude volk, zolang het hun paste om gezien te worden.” Hij schudde zijn hoofd met wat oprechte bewondering leek. „Ik hou toch zo van een stichtende familie. Al die rauwe, grijpende ambitie in de eerste generatie, die in de derde verzuurt tot respectabiliteit, en tegen de tijd dat de vierde aan de beurt is, zijn ze allang vergeten dat ze ooit iets hebben ingepikt. Het is in elk dorp waar ik ooit ben geweest precies hetzelfde liedje.”</w:t>
+        <w:t xml:space="preserve">„Mevrouw Claus! Kom eens kijken, dit vindt u vast leuk.” Hij draaide een bros registerblad mijn kant op toen ik naderde. „Achttien eenennegentig. De Blackburns legden de helft van het geld in voor de kerk aan het pleintje. Wist u dat? De helft. Vrijgevig, dat oude volk, zolang het hun paste om gezien te worden.” Hij schudde zijn hoofd met wat oprechte bewondering leek. „Ik hou toch zo van een stichtende familie. Al die rauwe, grijpende ambitie in de eerste generatie, die in de derde verzuurt tot respectabiliteit, en tegen de tijd dat de vierde aan de beurt is, zijn ze allang vergeten dat ze ooit iets hebben ingepikt. Het is in elk dorp waar ik ooit ben geweest precies hetzelfde liedje.”</w:t>
       </w:r>
     </w:p>
     <w:p/>
@@ -2024,7 +2024,7 @@
     <w:p/>
     <w:p>
       <w:r>
-        <w:t>„Daar word ik voor betaald.” Hij zei het op vrolijke toon, wat me deed pauzeren, want ik had me schrap gezet voor een ontwijkend antwoord. „Erfenisonderzoek. Dat is mijn vak, mevrouw Claus. Als de laatste telg uit een oud en rijk geslacht sterft, blijft er een kluwen achter, een wirwar van wie wat bezat, wie nog ergens recht op had, waar een kostbaar voorwerp is gebleven, en iemand moet nu eenmaal in bibliotheken gaan zitten om die wirwar uit te kammen, en die iemand ben ik.” Hij spreidde zijn handen uit over de dozen. „Op dit moment kam ik een Blackburn-kluwen uit. Er was destijds een sieraad in de familie. Een broche. Een prachtig exemplaar. Een saffier in het midden, goudwerk eromheen, een echt stuk, toen al een klein vermogen waard en tegenwoordig een kapitaal.” Hij pakte het vergrootglas op en legde het weer neer, en van onder de tafel richtte Pip één oog op de koperen rand. „En die is rond 1924 abrupt uit de familiearchieven verdwenen. Er wordt met geen woord meer over gerept. En de advocaten van de familie zouden heel graag willen weten waar dat ding is gebleven, omdat er een nalatenschap is die niet naar behoren kan worden afgesloten zolang niemand kan opschrijven wat er met die broche is gebeurd.”</w:t>
+        <w:t xml:space="preserve">„Daar word ik voor betaald.” Hij zei het op vrolijke toon, wat me deed pauzeren, want ik had me schrap gezet voor een ontwijkend antwoord. „Erfenisonderzoek. Dat is mijn vak, mevrouw Claus. Als de laatste telg uit een oud en rijk geslacht sterft, blijft er een kluwen achter, een wirwar van wie wat bezat, wie nog ergens recht op had, waar een kostbaar voorwerp is gebleven, en iemand moet nu eenmaal in bibliotheken gaan zitten om die wirwar uit te kammen, en die iemand ben ik.” Hij spreidde zijn handen uit over de dozen. „Op dit moment kam ik een Blackburn-kluwen uit. Er was destijds een sieraad in de familie. Een broche. Een prachtig exemplaar. Een saffier in het midden, goudwerk eromheen, een echt stuk, toen al heel wat waard en tegenwoordig een klein vermogen.” Hij pakte het vergrootglas op en legde het weer neer, en van onder de tafel richtte Pip één oog op de koperen rand. „En die is rond 1924 abrupt uit de familiearchieven verdwenen. Er wordt met geen woord meer over gerept. En de advocaten van de familie zouden heel graag willen weten waar dat ding is gebleven, omdat er een nalatenschap is die niet naar behoren kan worden afgesloten zolang niemand kan opschrijven wat er met die broche is gebeurd.”</w:t>
       </w:r>
     </w:p>
     <w:p/>
@@ -2102,13 +2102,13 @@
     <w:p/>
     <w:p>
       <w:r>
-        <w:t>Hij dacht er serieus over na, en dat zal ik hem nageven. Hij greep niet naar het voor de hand liggende antwoord. „Dat zet ik in mijn rapport,” zei hij tenslotte. „Waar het ding is gebleven, en hoe. De erfenis afhandelen. Mijn honorarium innen en vertrekken.” Hij haalde zijn schouders op. „Ik ben de wet niet, mevrouw Claus, en geen priester, en al helemaal niet het geweten van een meisje dat inmiddels al lang dood is. Ik spoor op waar dingen zijn gebleven. Wat mensen hebben gedaan om ze zover te krijgen, en of ze daar goed of fout aan deden, dat moeten ze zelf maar uitmaken met waar ze ook verantwoording voor afleggen, en bovendien is het al honderd jaar een gepasseerd station. Ik heb er geen belang bij om een dode meid te schande te maken omdat ze arm was.” Hij pauzeerde en keek me van boven de dozen indringender aan. „Waarom vraagt u dat op die manier? Weet u iets wat ik niet weet, mevrouw Claus?”</w:t>
-      </w:r>
-    </w:p>
-    <w:p/>
-    <w:p>
-      <w:r>
-        <w:t>„Ik weet een hele hoop dingen die u niet weet,” zei ik op vriendelijke toon, „over breien en over de eetgewoonten van pinguïns. Wat broches betreft ben ik u vrees ik tot no nut.”</w:t>
+        <w:t xml:space="preserve">Hij dacht er serieus over na, en dat zal ik hem nageven. Hij greep niet naar het voor de hand liggende antwoord. „Dat zet ik in mijn rapport,” zei hij tenslotte. „Waar het ding is gebleven, en hoe. De erfenis afhandelen. Mijn honorarium innen en vertrekken.” Hij haalde zijn schouders op. „Ik ben de wet niet, mevrouw Claus, en geen priester, en al helemaal niet het geweten van een meisje dat inmiddels al lang dood is. Ik spoor op waar dingen zijn gebleven. Wat mensen hebben gedaan om ze zover te krijgen, en of ze daar goed of fout aan deden, dat moeten ze zelf maar uitmaken met aan wie ze ook verantwoording afleggen, en bovendien is het al honderd jaar een gepasseerd station. Ik heb er geen belang bij om een dode meid te schande te maken omdat ze arm was.” Hij pauzeerde en keek me van boven de dozen indringender aan. „Waarom vraagt u dat op die manier? Weet u iets wat ik niet weet, mevrouw Claus?”</w:t>
+      </w:r>
+    </w:p>
+    <w:p/>
+    <w:p>
+      <w:r>
+        <w:t xml:space="preserve">„Ik weet een hele hoop dingen die u niet weet,” zei ik op vriendelijke toon, „over breien en over de eetgewoonten van pinguïns. Wat broches betreft ben ik u vrees ik tot geen nut.”</w:t>
       </w:r>
     </w:p>
     <w:p/>
@@ -2143,7 +2143,7 @@
     <w:p/>
     <w:p>
       <w:r>
-        <w:t>„Mevrouw Claus!” Bram kwam in draf om de hoek van het huisje en wreef zijn muts fijn tussen zijn handen. Bram was de elf die met ons naar het zuiden was meegekomen, de opzichter van de verhuisde werkplaats, toegewijd, pietluttig en qua postuur het best te vergelijken met een bezorgde aardappel, en hij stond nu stijf van de stress. „Het is Dancer. Ze is er alweer tussenuit genepen. Voor de derde keer deze week, mevrouw Claus, voor de derde keer. En ik durf op elk knoopje dat ik bezit te zweren dat die grendel erop zat toen ik wegging, erop en gecontroleerd, en nou staat ze hier die goede kolen op te vreten en vertikt ze het om zich te laten meelokken, en het zit me van harte dwars, om eerlijk te zijn.”</w:t>
+        <w:t xml:space="preserve">„Mevrouw Claus!” Bram kwam in draf om de hoek van het huisje en wrong zijn muts tussen zijn handen. Bram was de elf die met ons naar het zuiden was meegekomen, de opzichter van de verhuisde werkplaats, toegewijd, pietluttig en qua postuur het best te vergelijken met een bezorgde aardappel, en hij stond nu stijf van de stress. „Het is Dancer. Ze is er alweer tussenuit genepen. Voor de derde keer deze week, mevrouw Claus, voor de derde keer. En ik durf op elk knoopje dat ik bezit te zweren dat die grendel erop zat toen ik wegging, erop en gecontroleerd, en nou staat ze hier die goede kolen op te vreten en vertikt ze het om zich te laten meelokken, en het zit me van harte dwars, om eerlijk te zijn.”</w:t>
       </w:r>
     </w:p>
     <w:p/>
@@ -2206,7 +2206,7 @@
     <w:p/>
     <w:p>
       <w:r>
-        <w:t xml:space="preserve">„In de werkplaats. Waar anders.” Bram snof minachtend, diep in zijn eer aangetast. „Wil mij er niet in. Wil Fenn er niet in. Zit daar op alle vreemde tijdstippen wie-weet-wat in elkaar te timmeren achter een gesloten deur en zit intussen in zijn baard te neuriën. Ik ben al tweehonderd jaar opzichter van die werkplaats, mevrouw Claus, tweehonderd jaar, en nu word ik geweerd alsof ik een of andere vreemdeling ben die de meter komt opnemen.” Hij herinnerde zich ineens wie hij voor zich had en voegde er haastig aan toe: „Niet dat ik wil snoeren hoor. Ik zou </w:t>
+        <w:t xml:space="preserve">„In de werkplaats. Waar anders.” Bram snof minachtend, diep in zijn eer aangetast. „Wil mij er niet in. Wil Fenn er niet in. Zit daar op alle vreemde tijdstippen wie-weet-wat in elkaar te timmeren achter een gesloten deur en zit intussen in zijn baard te neuriën. Ik ben al tweehonderd jaar opzichter van die werkplaats, mevrouw Claus, tweehonderd jaar, en nu word ik geweerd alsof ik een of andere vreemdeling ben die de meter komt opnemen.” Hij herinnerde zich ineens wie hij voor zich had en voegde er haastig aan toe: „Niet dat ik wil neuzen hoor. Ik zou </w:t>
       </w:r>
       <w:r>
         <w:rPr>
@@ -2215,7 +2215,7 @@
         <w:t xml:space="preserve">nooit</w:t>
       </w:r>
       <w:r>
-        <w:t xml:space="preserve"> snoeren. Het is alleen dat een werkplaats nu eenmaal een opzichter behoeft die weet wat er zich binnen de muren afspeelt, dat is alles, het is een kwestie van professionele waardigheid.”</w:t>
+        <w:t xml:space="preserve"> neuzen. Het is alleen dat een werkplaats nu eenmaal een opzichter behoeft die weet wat er zich binnen de muren afspeelt, dat is alles, het is een kwestie van professionele waardigheid.”</w:t>
       </w:r>
     </w:p>
     <w:p/>
@@ -2239,7 +2239,7 @@
     <w:p/>
     <w:p>
       <w:r>
-        <w:t>Het gezoem hield op. De deur ging een handbreedte open en Nicks gezicht verscheen in de opening, blozend, tevreden en naar vers gezaagd vurenhout ruikend en naar dat andere, warmere geurtje dat ik niet thuis kon brengen. Achter hem was het fel verlicht, en ik hield mijn ogen strak op zijn gezicht gericht en keek niet langs hem de ruimte in, omdat ik mijn woord had gegeven.</w:t>
+        <w:t xml:space="preserve">Het gezoem hield op. De deur ging een handbreedte open en Nicks gezicht verscheen in de opening, blozend, tevreden en naar vers gezaagd grenenhout ruikend en naar dat andere, warmere geurtje dat ik niet thuis kon brengen. Achter hem was het fel verlicht, en ik hield mijn ogen strak op zijn gezicht gericht en keek niet langs hem de ruimte in, omdat ik mijn woord had gegeven.</w:t>
       </w:r>
     </w:p>
     <w:p/>
@@ -2251,7 +2251,7 @@
     <w:p/>
     <w:p>
       <w:r>
-        <w:t>We liepen de lange weg om de weide in de schemering, onze adem wolkten samen op, en hij vertelde het me.</w:t>
+        <w:t xml:space="preserve">We liepen de lange weg om de weide in de schemering, onze adem wolkte samen op, en hij vertelde het me.</w:t>
       </w:r>
     </w:p>
     <w:p/>
@@ -2293,7 +2293,7 @@
     <w:p/>
     <w:p>
       <w:r>
-        <w:t>Pip had al die tijd al snuffelend langs de onderste plank van het weidehek gelopen. Ik had het briefje in de zak van mijn jas, en nu deed ze precies wat ze de laatste tijd telkens deed als we in de buurt kwamen. Ze kwam naar mijn jaszak toe, drukte haar snavel plat tegen de buitenkant en bleef stokstijf stilstaan, die volkomen roerloosheid waar ze in verviel zodra ze een geur had opgepikt en daar absoluut zeker van wilde zijn. Toen draaide ze zich om en waggelde met een enorme vastberadenheid bij me vandaan, recht over het pad naar de binnendeur van de keuken, en bleef daar wachten tot ik opendeed. Ze liep de kamer door en hield halt bij de mand waar ik die ochtend de lantaarn in had gelegd die ik van de smidse had meegebracht. Ze ging naast de mand zitten, keek achterom naar me en gaf één helder, stellig tjilpje dat klonk als een vinger die ergens naar wijst.</w:t>
+        <w:t xml:space="preserve">Pip had al die tijd al snuffelend langs de onderste plank van het weidehek gelopen. Ik had het briefje in de zak van mijn jas, en nu deed ze precies wat ze de laatste tijd telkens deed als we in de buurt kwamen. Ze kwam naar mijn jaszak toe, drukte haar snavel plat tegen de buitenkant en bleef stokstijf stilstaan, die volkomen roerloosheid waar ze in verviel zodra ze een geur had opgepikt en daar absoluut zeker van wilde zijn. Toen draaide ze zich om en waggelde met een enorme vastberadenheid bij me vandaan, recht over het pad naar de binnendeur van de keuken, en bleef daar wachten tot ik opendeed. Ze liep de kamer door en hield halt bij de mand waar ik die ochtend de kaarsenhouder in had gelegd die ik van de smidse had meegebracht. Ze ging naast de mand zitten, keek achterom naar me en gaf één helder, stellig tjilpje dat klonk als een vinger die ergens naar wijst.</w:t>
       </w:r>
     </w:p>
     <w:p/>
@@ -2305,7 +2305,7 @@
     <w:p/>
     <w:p>
       <w:r>
-        <w:t>„Ze volgt het spoor,” zei ik langzaam, terwijl ik toekeek hoe ze daar zat naast het enige voorwerp uit de smidse in het hele huis. „De brief ruikt naar de smidse, en zij is naar het enige voorwerp uit de smidse in deze keuken gegaan en vertelt me nu dat die twee bij elkaar horen. Ze is helemaal geen persoon aan het volgen, Nick. Dat heeft ze nooit gedaan. Ze is op zoek naar een plek. Waar die brief ook is geweest, dat is de geur die haar neus herkent.” Ik keek naar beneden naar mijn slimme dier. „Pip. Je probeert me het antwoord al sinds de eerste avond te vertellen, en ik heb niet geluisterd.”</w:t>
+        <w:t xml:space="preserve">„Ze volgt het spoor,” zei ik langzaam, terwijl ik toekeek hoe ze daar zat naast het enige voorwerp uit de smidse in het hele huis. „De brief ruikt naar de smidse, en zij is naar het enige voorwerp uit de smidse in deze keuken gegaan en vertelt me nu dat die twee bij elkaar horen. Ze is helemaal geen persoon aan het volgen, Nick. Dat heeft ze nooit gedaan. Ze is op zoek naar een plek. Waar die brief ook is geweest, dat is de geur die haar neus herkent.” Ik keek naar beneden naar mijn slimme vogel. „Pip. Je probeert me het antwoord al sinds de eerste avond te vertellen, en ik heb niet geluisterd.”</w:t>
       </w:r>
     </w:p>
     <w:p/>
@@ -2328,12 +2328,12 @@
     <w:p/>
     <w:p>
       <w:r>
-        <w:t>Het stadhuis was een puntig bakstenen gebouw aan het begin van de dorpsweide, met een klokkentoren die al zolang iemand zich kon herinneren vier minuten voorliep. Ik ging er op maandag naartoe met Pip, voor twee zaken, waarvan de ene echt was en de andere wat minder. De echte zaak was om de naam van de kring toe te voegen aan de lijst van helpers van het festival, en om – in niemands belang behalve dat van het dorp zelf – te vragen of Frost Falls misschien wat geld kon missen voor het Historisch Genootschap voordat het dak definitief zou instorten. De minder echte zaak was om Vera Reed eens goed en van dichtbij te bekijken.</w:t>
-      </w:r>
-    </w:p>
-    <w:p>
-      <w:r>
-        <w:t>De hal hing vol portretten van voormalige burgemeesters, in vergulde lijsten en met een zelfingenomen blik, en een opvallend groot aantal daarvan waren Blackburns, waarbij diezelfde lange Blackburn-neus van generatie op generatie was doorgegeven als een stuk familiezilver. Aan het uiteinde van de hal stond de deur van de huidige burgemeester open. Achter een breed, schoon bureau waar niets op stond dan een telefoon en een loper van leer, zat burgemeester Blackburn zelf, een gladde, grijze man die de neus, het ambt en, voor zover iemand in het dorp kon nagaan, bar weinig anders had geërfd.</w:t>
+        <w:t xml:space="preserve">Het stadhuis was een opgesmukt bakstenen gebouw aan het begin van de dorpsweide, met een klokkentoren die al zolang iemand zich kon herinneren vier minuten voorliep. Ik ging er op maandag naartoe met Pip, voor twee zaken, waarvan de ene echt was en de andere wat minder. De echte zaak was om de naam van de kring toe te voegen aan de lijst van helpers van het festival, en om – in niemands belang behalve dat van het dorp zelf – te vragen of Frost Falls misschien wat geld kon missen voor het Historisch Genootschap voordat het dak definitief zou instorten. De minder echte zaak was om Vera Reed eens goed en van dichtbij te bekijken.</w:t>
+      </w:r>
+    </w:p>
+    <w:p>
+      <w:r>
+        <w:t xml:space="preserve">De hal hing vol portretten van voormalige burgemeesters, in vergulde lijsten en met een zelfingenomen blik, en een opvallend groot aantal daarvan waren Blackburns, waarbij diezelfde lange Blackburn-neus van generatie op generatie was doorgegeven als een stuk familiezilver. Aan het uiteinde van de hal stond de deur van de huidige burgemeester open. Achter een breed, schoon bureau waar niets op stond dan een telefoon en een leren onderlegger, zat burgemeester Blackburn zelf, een gladde, grijze man die de neus, het ambt en, voor zover iemand in het dorp kon nagaan, bar weinig anders had geërfd.</w:t>
       </w:r>
     </w:p>
     <w:p>
@@ -2343,7 +2343,7 @@
     </w:p>
     <w:p>
       <w:r>
-        <w:t>„Mevrouw Claus. De festivallenlijst?”</w:t>
+        <w:t xml:space="preserve">„Mevrouw Claus. De festivallijst?”</w:t>
       </w:r>
     </w:p>
     <w:p>
@@ -2353,7 +2353,7 @@
     </w:p>
     <w:p>
       <w:r>
-        <w:t>Hij had tijd, en hij schonk die mij van achter zijn schone bureau zonder ook maar de moeite te nemen op te staan. Ik bepleitte de zaak van het Genootschap zo goed als ik kon. Dat het dak lekte in de achterkamers. Dat de verwarmingsketel aan zijn laatste winter bezig was. Twee eeuwen van de herinnering van het dorp die langzaam verloren ging bij gebrek aan een fractie van wat het dorp zou uitgeven aan een enkel festivalweekend. Ik deed het op warme toon, en ik hield het kort. Claire had me verteld dat treurige verhalen geld niet losmaken, en ik probeerde iets standkasters en harders te vinden dat niet zomaar weggewuifd kon worden als treurnis.</w:t>
+        <w:t xml:space="preserve">Hij had tijd, en hij schonk die mij van achter zijn schone bureau zonder ook maar de moeite te nemen op te staan. Ik bepleitte de zaak van het Genootschap zo goed als ik kon. Dat het dak lekte in de achterkamers. Dat de verwarmingsketel aan zijn laatste winter bezig was. Twee eeuwen van de herinnering van het dorp die langzaam verloren ging bij gebrek aan een fractie van wat het dorp zou uitgeven aan een enkel festivalweekend. Ik deed het op warme toon, en ik hield het kort. Claire had me verteld dat treurige verhalen geld niet losmaken, en ik probeerde iets steviger te vinden, iets wat minder makkelijk weg te wuiven was dan treurnis.</w:t>
       </w:r>
     </w:p>
     <w:p>
@@ -2363,7 +2363,7 @@
     </w:p>
     <w:p>
       <w:r>
-        <w:t>„Het is een nobel doel,” zei hij toen ik uitgesproken was. „Theo verricht goed werk, op zijn manier. Maar de begroting van het dorp is de begroting van het dorp, mevrouw Claus, en de geschiedenis – u vergeeft me dat ik het zeg – strooit in februari geen zout op de wegen en houdt de straatverlichting niet brandende. Het Genootschap heeft zich altijd op eigen kracht gered. Ik weet zeker dat ze wel weer op hun pootjes terechtkomen, dat hebben ze immers altijd gedaan.” Hij produceerde een glimlach, de glimlach van een man die had besloten dat hij al gul was geweest door te luisteren. „Misschien brengt jullie festival wel een mooi kleinigheidje voor ze op. Mensen worden nu eenmaal sentimenteel in deze tijd van het jaar.”</w:t>
+        <w:t xml:space="preserve">„Het is een nobel doel,” zei hij toen ik uitgesproken was. „Theo verricht goed werk, op zijn manier. Maar de begroting van het dorp is de begroting van het dorp, mevrouw Claus, en de geschiedenis – u vergeeft me dat ik het zeg – ruimt in februari geen sneeuw van de wegen en houdt de straatverlichting niet brandend. Het Genootschap heeft zich altijd op eigen kracht gered. Ik weet zeker dat ze wel weer op hun pootjes terechtkomen, dat hebben ze immers altijd gedaan.” Hij produceerde een glimlach, de glimlach van een man die had besloten dat hij al gul was geweest door te luisteren. „Misschien brengt uw festival wel een mooi kleinigheidje voor ze op. Mensen worden nu eenmaal sentimenteel in deze tijd van het jaar.”</w:t>
       </w:r>
     </w:p>
     <w:p>
@@ -2378,7 +2378,7 @@
     </w:p>
     <w:p>
       <w:r>
-        <w:t xml:space="preserve">Ze had de festivallenlijst gereed en netjes rechtgelegd op haar onderlegger. Terwijl ze er met haar pen overheen gleed en de kring toevoegde in haar kleine, gelijkmatige handschrift, liet ik mijn blik ontspannen en doelloos over haar bureau glijden, als een vrouw die staat te wachten tot een klerk klaar is. Het was een wonder van orde, dat bureau. Gelabelde mappen stonden rechtop in een rek. Een lange wandkalender vol roosters en aantekeningen. En achter haar, van vloer tot plafond, een wand vol archiefkasten, elk voorzien van een klein koperen lijstje op de voorkant met daarin een getypte kaart. </w:t>
+        <w:t xml:space="preserve">Ze had de festivallijst gereed en netjes rechtgelegd op haar onderlegger. Terwijl ze er met haar pen overheen gleed en de kring toevoegde in haar kleine, gelijkmatige handschrift, liet ik mijn blik ontspannen en doelloos over haar bureau glijden, als een vrouw die staat te wachten tot een klerk klaar is. Het was een wonder van orde, dat bureau. Gelabelde mappen stonden rechtop in een rek. Een lange wandkalender vol roosters en aantekeningen. En achter haar, van vloer tot plafond, een wand vol archiefkasten, elk voorzien van een klein koperen lijstje op de voorkant met daarin een getypte kaart. </w:t>
       </w:r>
       <w:r>
         <w:rPr>
@@ -2417,7 +2417,7 @@
     </w:p>
     <w:p>
       <w:r>
-        <w:t>Ze keek op naar mij, en gedurende één onbewaakt moment was haar correcte, vermoeide gezicht iets heel anders – op haar hoede, bijna in het nauw gedreven – voordat ze die correctheid er weer als een deksel op een pan overheen trok. „Ik weet niets over de Blackburns,” zei ze, en dat was een vreemde opmerking met een Blackburn op nog geen twee meter afstand achter zijn open deur en akten van de Blackburns in de lades achter haar. „Dat is het terrein van Theo. Het Historisch Genootschap. Ik beheer alleen de administratie. Ik lees ze niet eens.” Ze schoof de festivallenlijst over de onderlegger naar me toe. „Zo. De kring is toegevoegd. Was er verder nog iets?”</w:t>
+        <w:t xml:space="preserve">Ze keek op naar mij, en gedurende één onbewaakt moment was haar correcte, vermoeide gezicht iets heel anders – op haar hoede, bijna in het nauw gedreven – voordat ze die correctheid er weer als een deksel op een pan overheen trok. „Ik weet niets over de Blackburns,” zei ze, en dat was een vreemde opmerking met een Blackburn op nog geen twee meter afstand achter zijn open deur en akten van de Blackburns in de lades achter haar. „Dat is het terrein van Theo. Het Historisch Genootschap. Ik beheer alleen de registers. Ik lees ze niet eens.” Ze schoof de festivallijst over de onderlegger naar me toe. „Zo. De kring is toegevoegd. Was er verder nog iets?”</w:t>
       </w:r>
     </w:p>
     <w:p>
@@ -2427,7 +2427,7 @@
     </w:p>
     <w:p>
       <w:r>
-        <w:t>Ik drong niet verder aan. Door te dringen zou ik haar alleen maar laten merken dat het me was opgevallen. In plaats daarvan verzachtte ik al mijn manieren.</w:t>
+        <w:t xml:space="preserve">Ik drong niet verder aan. Door aan te dringen zou ik haar alleen maar laten merken dat het me was opgevallen. In plaats daarvan verzachtte ik al mijn manieren.</w:t>
       </w:r>
     </w:p>
     <w:p>
@@ -2437,7 +2437,7 @@
     </w:p>
     <w:p>
       <w:r>
-        <w:t>De vriendelijkheid raakte haar op een plek waar de vraag dat niet had gedaan. Haar schouders zakten een stukje naar beneden en haar gezicht vertrok even alsof het op breken stond voordat ze zich herpakte. „Het is de drukte van het seizoen,” zei ze. „En de burgemeester betaalt een dorpsloontje voor een hoeveelheid werk die bij een hele stad past, en aan het einde van de maand is het net niet genoeg. Voor niemand niet dit jaar. De rekeningen betalen zichzelf niet.” Ze slaakte een korte, vermoeide lach waarin geen enkele humor doorklonk. „Niemand zijn rekeningen betalen zichzelf dit jaar, hè, mevrouw Claus.”</w:t>
+        <w:t xml:space="preserve">De vriendelijkheid raakte haar op een plek waar de vraag dat niet had gedaan. Haar schouders zakten een stukje naar beneden en haar gezicht vertrok even alsof het op breken stond voordat ze zich herpakte. „Het is de drukte van het seizoen,” zei ze. „En de burgemeester betaalt een dorpsloontje voor een hoeveelheid werk die bij een hele stad past, en aan het einde van de maand is het net niet genoeg. Voor niemand niet dit jaar. De rekeningen betalen zichzelf niet.” Ze slaakte een korte, vermoeide lach waarin geen enkele humor doorklonk. „Niemands rekeningen betalen zichzelf dit jaar, hè, mevrouw Claus.”</w:t>
       </w:r>
     </w:p>
     <w:p>
@@ -2447,7 +2447,7 @@
     </w:p>
     <w:p>
       <w:r>
-        <w:t>Ik liet haar daar achter tussen haar lades, met de nutteloze burgemeester achter zijn open deur en de klok die vier minuten voorliep boven ieders hoofd. Buiten op de koude treden bleef ik even met Pip staan om te verwerken wat ik had gezien. Ik voegde Vera toe aan het lijstje dat ik in mijn hoofd bijhield.</w:t>
+        <w:t xml:space="preserve">Ik liet haar daar achter tussen haar lades, met de nietsdoende burgemeester achter zijn open deur en de klok die vier minuten voorliep boven ieders hoofd. Buiten op de koude treden bleef ik even met Pip staan om te verwerken wat ik had gezien. Ik voegde Vera toe aan het lijstje dat ik in mijn hoofd bijhield.</w:t>
       </w:r>
     </w:p>
     <w:p>
@@ -2457,7 +2457,7 @@
     </w:p>
     <w:p>
       <w:r>
-        <w:t>Ik wist niet wat het betekende. Het kon niet meer betekenen dan een vermoeide vrouw die geen zin had in opdringerige vragen op een lange dag. Maar mijn pleidooi voor het Genootschap was mislukt, precies zoals Dot al had voorspeld, en het Genootschap dreigde nog steeds het licht te doven. En nu waren er twee mensen in Frost Falls bij wie ik niet aan de naam Blackburn kon denken zonder dat het ergens aan schuurde. De één runde het archief waar de brieven zoekgeraakt waren.</w:t>
+        <w:t xml:space="preserve">Ik wist niet wat het betekende. Misschien betekende het niet meer dan een vermoeide vrouw die geen zin had in opdringerige vragen op een lange dag. Maar mijn pleidooi voor het Genootschap was mislukt, precies zoals Dot al had voorspeld, en het Genootschap dreigde nog steeds het licht te doven. En nu waren er twee mensen in Frost Falls bij wie ik niet aan de naam Blackburn kon denken zonder dat het ergens aan schuurde. De één runde het archief waar de brieven zoekgeraakt waren.</w:t>
       </w:r>
     </w:p>
     <w:p>
@@ -2473,7 +2473,7 @@
     <w:p/>
     <w:p>
       <w:r>
-        <w:t>Het bestuur van de Historische Kring vergaderde die maandagavond in de koude achterkamer onder het lekkende dak. Claire had me gevraagd om met haar mee te gaan, deels omdat de Gazette graag een vertrouwd gezicht bij de vergadering wilde hebben en deels, vermoedde ik, omdat ze meer had geraden dan ze liet blijken over wat ik bij me droeg, en wilde dat ik met eigen ogen zag hoe erg het eraan toe was.</w:t>
+        <w:t xml:space="preserve">Het bestuur van het Historisch Genootschap vergaderde die maandagavond in de koude achterkamer onder het lekkende dak. Claire had me gevraagd om met haar mee te gaan, deels omdat de Gazette graag een vertrouwd gezicht bij de vergadering wilde hebben en deels, vermoedde ik, omdat ze meer had geraden dan ze liet blijken over wat ik bij me droeg, en wilde dat ik met eigen ogen zag hoe erg het eraan toe was.</w:t>
       </w:r>
     </w:p>
     <w:p/>
@@ -2485,7 +2485,7 @@
     <w:p/>
     <w:p>
       <w:r>
-        <w:t>Er zaten zes bestuursleden, vier bejaarden en twee die simpelweg middelbaar waren, opgesteld rond een klaptafel die misplaatst leek in de fraaie oude kamer. Een koffie-urn pruttelde op een s-tafel. In de hoek van het plafond boven het raam verspreidde een bruine watervlek zich als een blauwe plek over het gips, met een metalen emmertje op de vensterbank eronder om de druppels op te vangen. Niemand maakte melding van de emmer. Ieders blik dwaalde ernaar toe en weer weg.</w:t>
+        <w:t xml:space="preserve">Er zaten zes bestuursleden, vier bejaarden en twee die simpelweg middelbaar waren, opgesteld rond een klaptafel die misplaatst leek in de fraaie oude kamer. Een koffie-urn pruttelde op een bijzettafel. In de hoek van het plafond boven het raam verspreidde een bruine watervlek zich als een blauwe plek over het gips, met een metalen emmertje op de vensterbank eronder om de druppels op te vangen. Niemand maakte melding van de emmer. Ieders blik dwaalde ernaar toe en weer weg.</w:t>
       </w:r>
     </w:p>
     <w:p/>
@@ -2503,7 +2503,7 @@
     <w:p/>
     <w:p>
       <w:r>
-        <w:t>De subsidie van de gemeente, met een derde gekort. Het dak, waarvoor een offerte was berekend die een van de oude mannen deed grimassen. De verwarmingsketel, afgekeurd door de man die eraan had gesleuteld, die had gezegd, zo meldde Theo, dat hij verbaasd was dat die de vorige winter nog had gehaald. Het fonds, of wat daar nog van over was, dat twee jaar achtereen was aangesproken om de lichten te laten branden, en bijna op was. De lidmaatschapsgelden, die, zo zei Theo terwijl hij naar zijn blad keek en niet naar de zaal, „ongeveer de kosten van de koffie” dekken.</w:t>
+        <w:t xml:space="preserve">De subsidie van de gemeente, met een derde gekort. Het dak, waarvoor een offerte was berekend die een van de oude mannen deed ineenkrimpen. De verwarmingsketel, afgekeurd door de man die eraan had gesleuteld, die had gezegd, zo meldde Theo, dat hij verbaasd was dat die de vorige winter nog had gehaald. Het fonds, of wat daar nog van over was, dat twee jaar achtereen was aangesproken om de lichten te laten branden, en bijna op was. De lidmaatschapsgelden, die, zo zei Theo terwijl hij naar zijn blad keek en niet naar de zaal, „ongeveer de kosten van de koffie” dekten.</w:t>
       </w:r>
     </w:p>
     <w:p/>
@@ -2515,19 +2515,19 @@
     <w:p/>
     <w:p>
       <w:r>
-        <w:t>„Dat is wat de cijfers zeggen.” Theo zette zijn bril af en drukte zijn vingers tegen de brug van zijn neus, en even haperde die zorgvuldige stem. „Ik heb overal aangeklopt. Ik wil dat jullie dat allemaal weten. Elke subsidie, elk fonds, elk potje in drie staten. Ik heb een map vol afwijzingen. Ik kan de muren van deze kamer ermee behangen, en dan zou de kamer in elk geval droog zijn.” Een paar van hen lachten, de trieste, hopeloze lach van mensen wier opties op zijn. „De gemeente helpt niet. Ik ben afgelopen voorjaar zelf naar de burgemeester gegaan, en mevrouw Claus hier is er vanmorgen nog eens geweest, en hij zegt hetzelfde als altijd. De geschiedenis ploegt de wegen niet.” Hij legde zijn bril op de papieren. „Ik weet niet wat ik nog meer kan proberen. Ik heb geprobeerd redelijk te zijn. Ik heb geprobeerd zielig te zijn. Ik schaam me er niet voor om te vertellen dat ik in een brief aan een fonds in de stad heb geprobeerd om zielig te zijn, en ze stuurden een heel vriendelijke brief terug met een nee.”</w:t>
-      </w:r>
-    </w:p>
-    <w:p/>
-    <w:p>
-      <w:r>
-        <w:t>Ik keek naar hem terwijl hij het zei. Ik zag een man in het openbaar verdrinken, in een koude kamer, voor de neus van de mensen die hielden van wat hij beminde, en dat hardop uitspreken, terwijl het water hem al aan de lippen stond. Ik was naar die vergadering gekomen met nog de stille hoop dat de man van wie ik het vermoedde, op de een of andere manier iemand anders zou blijken te zijn dan hij. Dat was niet zo. Hij was precies deze man. Een goed mens aan het absolute einde van zijn latijn, die moest toezien hoe de Kring waaraan hij zijn leven had gewijd ten onder ging bij gebrek aan geld, terwijl de vlek zich over het plafond uitbreidde en het emmertje de regen opving.</w:t>
-      </w:r>
-    </w:p>
-    <w:p/>
-    <w:p>
-      <w:r>
-        <w:t>Het zou zoveel makkelijker zijn geweest als Theo een slecht mens was geweest, iemand op wie ik zonder wroeging kon neerkijken. Maar ik zat in die koude kamer en begreep door en door hoe Theo Hussein, die dit zag en hoorde, een map met oude brieven kon openmaken, daarin niet een honderd jaar oude misdaad zag maar een reddingsboei, en daarnaar zou grijpen, zichzelf onderweg telkens wijsmakend dat hij het voor de Kring deed. Ik nam het hem niet in dank af. Maar ik begreep het, en dat droeg ik koud en zwaar met me mee gedurende de rest van de vergadering.</w:t>
+        <w:t xml:space="preserve">„Dat is wat de cijfers zeggen.” Theo zette zijn bril af en drukte zijn vingers tegen de brug van zijn neus, en even haperde die zorgvuldige stem. „Ik heb overal aangeklopt. Ik wil dat jullie dat allemaal weten. Elke subsidie, elk fonds, elk potje in drie staten. Ik heb een map vol afwijzingen. Ik kan de muren van deze kamer ermee behangen, en dan zou de kamer in elk geval droog zijn.” Een paar van hen lachten, de trieste, hopeloze lach van mensen wier opties op zijn. „De gemeente helpt niet. Ik ben afgelopen voorjaar zelf naar de burgemeester gegaan, en mevrouw Claus hier is er vanmorgen nog eens geweest, en hij zegt hetzelfde als altijd. De geschiedenis ruimt geen sneeuw.” Hij legde zijn bril op de papieren. „Ik weet niet wat ik nog meer kan proberen. Ik heb geprobeerd redelijk te zijn. Ik heb geprobeerd zielig te zijn. Ik schaam me er niet voor om te vertellen dat ik in een brief aan een fonds in de stad heb geprobeerd om zielig te zijn, en ze stuurden een heel vriendelijke brief terug met een nee.”</w:t>
+      </w:r>
+    </w:p>
+    <w:p/>
+    <w:p>
+      <w:r>
+        <w:t xml:space="preserve">Ik keek naar hem terwijl hij het zei. Ik zag een man in het openbaar verdrinken, in een koude kamer, voor de neus van de mensen die hielden van wat hij beminde, en dat hardop uitspreken, terwijl het water hem al aan de lippen stond. Ik was naar die vergadering gekomen met nog de stille hoop dat de man van wie ik het vermoedde, op de een of andere manier iemand anders zou blijken te zijn dan hij. Dat was niet zo. Hij was precies deze man. Een goed mens aan het absolute einde van zijn latijn, die moest toezien hoe het Genootschap waaraan hij zijn leven had gewijd ten onder ging bij gebrek aan geld, terwijl de vlek zich over het plafond uitbreidde en het emmertje de regen opving.</w:t>
+      </w:r>
+    </w:p>
+    <w:p/>
+    <w:p>
+      <w:r>
+        <w:t xml:space="preserve">Het zou zoveel makkelijker zijn geweest als Theo een slecht mens was geweest, iemand op wie ik zonder wroeging kon neerkijken. Maar ik zat in die koude kamer en begreep door en door hoe Theo Hussein, die dit zag en hoorde, een map met oude brieven kon openmaken, daarin niet een honderd jaar oude misdaad zag maar een reddingsboei, en daarnaar zou grijpen, zichzelf onderweg telkens wijsmakend dat hij het voor het Genootschap deed. Ik nam het hem niet in dank af. Maar ik begreep het, en dat droeg ik koud en zwaar met me mee gedurende de rest van de vergadering.</w:t>
       </w:r>
     </w:p>
     <w:p/>
@@ -2557,7 +2557,7 @@
     <w:p/>
     <w:p>
       <w:r>
-        <w:t>Pip en ik liepen in het donker naar huis, en ik wist twee dingen die ik daarvoor nog niet helemaal had geweten. Dat de Kring werkelijk ten onder ging, wat het motief blootlegde pal voor mijn neus, druppel voor druppel in een metalen emmertje. En dat wat ik ook zou ondernemen tegen Theo, ik het voorzichtig zou moeten aanpakken, omdat de regen hem al genoeg had toegetakeld.</w:t>
+        <w:t xml:space="preserve">Pip en ik liepen in het donker naar huis, en ik wist twee dingen die ik daarvoor nog niet helemaal had geweten. Dat het Genootschap werkelijk ten onder ging, wat het motief blootlegde pal voor mijn neus, druppel voor druppel in een metalen emmertje. En dat wat ik ook zou ondernemen tegen Theo, ik het voorzichtig zou moeten aanpakken, omdat de regen hem al genoeg had toegetakeld.</w:t>
       </w:r>
     </w:p>
     <w:p>
@@ -2592,7 +2592,7 @@
     <w:p/>
     <w:p>
       <w:r>
-        <w:t>Ik had Jamal om oprechte redenen op mijn lijstje gezet. Hij had Theo geholpen bij het opbouwen van de tentoonstelling, had de zware kisten het grootste deel van een week in en uit het archief gesjouwd. Hij had geldproblemen waar het hele dorp van wiste, de uitbreiding van de sportschool lag stil, een lening zat vast in de trage raderen van een bank. Een man met schulden en vrije toegang tot het archief, die zijn handen op de dozen van de Blackburns had gehad. Het zou slordig zijn geweest om hem niet te onderzoeken.</w:t>
+        <w:t xml:space="preserve">Ik had Jamal om oprechte redenen op mijn lijstje gezet. Hij had Theo geholpen bij het opbouwen van de tentoonstelling, had de zware kisten het grootste deel van een week in en uit het archief gesjouwd. Hij had geldproblemen waar het hele dorp van wist, de uitbreiding van de sportschool lag stil, een lening zat vast in de trage raderen van een bank. Een man met schulden en vrije toegang tot het archief, die zijn handen op de dozen van de Blackburns had gehad. Het zou slordig zijn geweest om hem niet te onderzoeken.</w:t>
       </w:r>
     </w:p>
     <w:p/>
@@ -2628,7 +2628,7 @@
     <w:p/>
     <w:p>
       <w:r>
-        <w:t>Ik liet dat bezinken zoals ik Sam zijn twintig dollar had laten bezinken. Hier stond een man die diep in de schulden zat, met elke denkbare reden ter wereld en bovendien alle gelegenheid. Zijn antwoord daarop was om de hele nacht de wacht te houden bij het festival van het dorp voor een fooi en oma’s om half zes ’s ochtends lunges te laten doen. Jamal had drie banen om op de eerlijke, uitputtende, centimeter-voor-centimeter manier uit het dal te klimmen, en dat paste niet bij een afpersingsbrief voor een half miljoen dollar. De rekensom klopte van geen kant. Als Jamal Washington op de een of andere manier dat soort geld uit een geheim had kunnen welslepen, dan had hij zijn wekker niet om vijf uur gezet.</w:t>
+        <w:t xml:space="preserve">Ik liet dat bezinken zoals ik Sam zijn twintig dollar had laten bezinken. Hier stond een man die diep in de schulden zat, met elke denkbare reden ter wereld en bovendien alle gelegenheid. Zijn antwoord daarop was om de hele nacht de wacht te houden bij het festival van het dorp tegen betaling en oma’s om half zes ’s ochtends lunges te laten doen. Jamal had drie banen om op de eerlijke, uitputtende, centimeter-voor-centimeter manier uit het dal te klimmen, en dat paste niet bij een afpersingsbrief voor een half miljoen dollar. De rekensom klopte van geen kant. Als Jamal Washington op de een of andere manier dat soort geld uit een geheim had kunnen slaan, dan had hij zijn wekker niet om vijf uur gezet.</w:t>
       </w:r>
     </w:p>
     <w:p/>
@@ -2646,7 +2646,7 @@
     <w:p/>
     <w:p>
       <w:r>
-        <w:t>„Ingezien?” Hij lachte, er volkomen door overvallen. „Mevrouw Claus, ik sjouwde met twee vitrines tegelijk en probeerde mijn voet niet door een honderd jaar oude stoel te zetten. Ik heb geen enkel woord gelezen. Ik had een Blackburn nog niet van een braam kunnen onderscheiden. Theo gaf me een doos en zei: „Voorzichtig nou, voorzichtig, die is kostbaar”, en ik droeg die kostbare doos waar hij wees en liep meteen terug voor de volgende kostbare doos.” Hij schudde zijn hoofd, lachend om de herinnering. „Tegen het einde van de week was ik zo afgemat dat ik overal voor had getekend, al was het maar om toestemming te krijgen om te gaan zitten. Dat was mijn hele carrière als historicus.”</w:t>
+        <w:t xml:space="preserve">„Ingezien?” Hij lachte, er volkomen door overvallen. „Mevrouw Claus, ik sjouwde met twee vitrines tegelijk en probeerde mijn voet niet door een honderd jaar oude stoel te zetten. Ik heb geen enkel woord gelezen. Ik had een Blackburn nog niet van een braam kunnen onderscheiden. Theo gaf me een doos en zei: ‘Voorzichtig nou, voorzichtig, die is kostbaar’, en ik droeg die kostbare doos waar hij wees en liep meteen terug voor de volgende kostbare doos.” Hij schudde zijn hoofd, lachend om de herinnering. „Tegen het einde van de week was ik zo afgemat dat ik overal voor had getekend, al was het maar om toestemming te krijgen om te gaan zitten. Dat was mijn hele carrière als historicus.”</w:t>
       </w:r>
     </w:p>
     <w:p/>
@@ -2664,7 +2664,7 @@
     <w:p/>
     <w:p>
       <w:r>
-        <w:t>„Het is een goede man.” De glimlach verzachtte. „Maar hij heeft zich de hele tijd doodgerust om die plek. Dat kon je aan hem zien. Alsof het gebouw een ziek familielid was waar hij naast zat te waken. Dan stopte hij midden in het vertellen waar ik een vitrine moest neerzetten om alleen maar te staren naar die vochtplek op het plafond in de achterkamer, alsof die hem persoonlijk naar het leven stond.” Hij schudde zijn hoofd. „Ik hoop dat iemand hem helpt. Ik zou het hem zelf lenen als ik wat had, maar ik ben zowat de laatste man in dit dorp aan wie je dit jaar om geld moet vragen.”</w:t>
+        <w:t xml:space="preserve">„Het is een goede man.” De glimlach verzachtte. „Maar hij heeft zich de hele tijd doodgerust om die plek. Dat kon je aan hem zien. Alsof het gebouw een ziek familielid was waar hij naast zat te waken. Dan stopte hij midden in het vertellen waar ik een vitrine moest neerzetten om alleen maar te staren naar die vochtplek op het plafond in de achterkamer, alsof die hem persoonlijk naar het leven stond.” Hij schudde zijn hoofd. „Ik hoop dat iemand hem helpt. Ik zou het hem zelf geven als ik wat had, maar ik ben zowat de laatste man in dit dorp aan wie je dit jaar om geld moet vragen.”</w:t>
       </w:r>
     </w:p>
     <w:p/>
@@ -2753,7 +2753,7 @@
     <w:p/>
     <w:p>
       <w:r>
-        <w:t>Buiten op de brink lag het probleem bij Bram. Prancer had zich ’s nachts losgemaakt in de paddock en was naar het stadje gelopen, en ze stond nu tot haar enkels in de gevallen bladeren in de kom van de fontein, die het stadje elke oktober afsloot. Ze stond daar met haar kop omhoog, en er was geen beweging in te krijgen.</w:t>
+        <w:t xml:space="preserve">Buiten op de brink lag het probleem bij Bram. Prancer had zich ’s nachts uit de weide bevrijd en was naar het stadje gelopen, en ze stond nu tot haar enkels in de gevallen bladeren in de kom van de fontein, die het stadje elke oktober afsloot. Ze stond daar met haar kop omhoog, en er was geen beweging in te krijgen.</w:t>
       </w:r>
     </w:p>
     <w:p/>
@@ -2771,7 +2771,7 @@
     <w:p/>
     <w:p>
       <w:r>
-        <w:t>Er had zich inderdaad een flinke, opgetogen menigte verzameld. Er waren kinderen opgedoken, zoals dat nu eenmaal gaat zodra er een rendier in het spel is, en ze klommen gillen op de rand van de fontein om haar te aaien. Een man die ik niet kende liep Prancer te fotograferen voor zijn kleinkinderen, en de oude meneer Kim van de autoservice had een klapstoeltje op het trottoir gezet om het hele schouwspel gade te slaan met de tevredenheid van een man bij een goede voorstelling.</w:t>
+        <w:t xml:space="preserve">Er had zich inderdaad een flinke, opgetogen menigte verzameld. Er waren kinderen opgedoken, zoals dat nu eenmaal gaat zodra er een rendier in het spel is, en ze klommen gillend op de rand van de fontein om haar te aaien. Een man die ik niet kende liep Prancer te fotograferen voor zijn kleinkinderen, en de oude meneer Kim van de autoservice had een klapstoeltje op het trottoir gezet om het hele schouwspel gade te slaan met de tevredenheid van een man bij een goede voorstelling.</w:t>
       </w:r>
     </w:p>
     <w:p/>
@@ -2795,13 +2795,13 @@
     <w:p/>
     <w:p>
       <w:r>
-        <w:t>Ze hield haar kop omhoog en keek me aan. Nog een hele poos daarna keek ze omhoog naar het pad richting het huisje en het atelier daarachter, zoals een dier doet dat de geur heeft opgevangen van iets dat beter is dan wat het voor zich ziet. Ze stapte over de rand van de fontein, strooide bladeren over Brams laarzen en oogstde luid gejuich van de kinderen. Toen zette ze in een onhaastige wandeling de pas erin langs het pad, op weg naar huis, waardig en wel, en we keken allemaal na hoe ze wegging.</w:t>
-      </w:r>
-    </w:p>
-    <w:p/>
-    <w:p>
-      <w:r>
-        <w:t>„Ze koestert zich op het atelier af,” zei Bram terwijl hij bladeren van zijn knieën veegde. „Ze willen allemaal naar het atelier nu. Waarom willen ze toch allemaal naar het atelier, mevrouw Claus? Wat heeft hij daar staan?”</w:t>
+        <w:t xml:space="preserve">Ze hield haar kop omhoog en keek me aan. Nog een hele poos daarna keek ze omhoog naar het pad richting het huisje en de werkplaats daarachter, zoals een dier doet dat de geur heeft opgevangen van iets dat beter is dan wat het voor zich ziet. Ze stapte over de rand van de fontein, strooide bladeren over Brams laarzen en oogstte luid gejuich van de kinderen. Toen zette ze in een onhaastige wandeling de pas erin langs het pad, op weg naar huis, waardig en wel, en we keken allemaal na hoe ze wegging.</w:t>
+      </w:r>
+    </w:p>
+    <w:p/>
+    <w:p>
+      <w:r>
+        <w:t xml:space="preserve">„Ze gaat op de werkplaats af,” zei Bram terwijl hij bladeren van zijn knieën veegde. „Ze willen allemaal naar de werkplaats nu. Waarom willen ze toch allemaal naar de werkplaats, mevrouw Claus? Wat heeft hij daar staan?”</w:t>
       </w:r>
     </w:p>
     <w:p/>
@@ -2926,7 +2926,7 @@
     <w:p/>
     <w:p>
       <w:r>
-        <w:t>„Hij hield me staande bij de bank. Hij wilde weten of mijn grootmoeder nog oude sieraden had, en of daar iets van bij de Blackburns vandaan kwam.” Ivy schudde haar hoofd. „Mijn grootmoeder had één caméo, uit een kerkveiling. Ik zei dat hij die kon hebben als hij wilde.”</w:t>
+        <w:t xml:space="preserve">„Hij hield me staande bij de bank. Hij wilde weten of mijn grootmoeder nog oude sieraden had, en of daar iets van bij de Blackburns vandaan kwam.” Ivy schudde haar hoofd. „Mijn grootmoeder had één camee, van een rommelmarkt van de kerk. Ik zei dat hij die kon hebben als hij wilde.”</w:t>
       </w:r>
     </w:p>
     <w:p/>
@@ -2974,7 +2974,7 @@
     <w:p/>
     <w:p>
       <w:r>
-        <w:t>„Heb jij zijn kaartje?” zei ik.</w:t>
+        <w:t xml:space="preserve">„Heb jij zijn kaartje?” zei ze.</w:t>
       </w:r>
     </w:p>
     <w:p/>
@@ -2992,7 +2992,7 @@
     <w:p/>
     <w:p>
       <w:r>
-        <w:t>Ellie was weer steken gaan tellen in stilte. Aan het einde van de nageslagen toer zei ze: „Heeft iemand Fiona deze week nog gezien? Ze is op geen enkele commissievergadering geweest. Ze doet altijd de taartentafel.”</w:t>
+        <w:t xml:space="preserve">Ellie was weer steken gaan tellen in stilte. Aan het einde van de toer zei ze: „Heeft iemand Fiona deze week nog gezien? Ze is op geen enkele commissievergadering geweest. Ze doet altijd de taartentafel.”</w:t>
       </w:r>
     </w:p>
     <w:p/>
@@ -3022,7 +3022,7 @@
     <w:p/>
     <w:p>
       <w:r>
-        <w:t>Pip had het opgegeven met de knopenpot. Ze kwam bij Martha’s voeten liggen, tegen de warme zijkant van de kachel. Martha schoof één voet uit haar schoen en liet hem op Pip’s rug rusten.</w:t>
+        <w:t xml:space="preserve">Pip had het opgegeven met de knopenpot. Ze kwam bij Martha’s voeten liggen, tegen de warme zijkant van de kachel. Martha schoof één voet uit haar schoen en liet hem op Pips rug rusten.</w:t>
       </w:r>
     </w:p>
     <w:p/>
@@ -3077,7 +3077,7 @@
     </w:p>
     <w:p>
       <w:r>
-        <w:t>„Jamal heeft de dozen gedragen maar er nooit eentje geopend,” zei ik. „Dat heeft hij me zelf verteld, en ik geloof hem. Zijn hele studie geschiedenis draaide om ‘voorzichtig, dat is kostbaar’. Hij is de hele week met zijn handen aan de buitenkant van het geheim geweest en heeft er nooit ingekeken. En die man heeft drie banen om op een eerlijke manier uit de put te komen, die bootcamps van half zes en de nachtbeveiliging. Hij is het niet.” Ik zette een streep door Jamals naam, vastberaden. „Hij had wel de kans, maar niet de wetenschap. En bovendien niet het hart ervoor, wat voor mij telt, zelfs al zou het in een rechtszaak geen standhouden.”</w:t>
+        <w:t xml:space="preserve">„Jamal heeft de dozen gedragen maar er nooit eentje geopend,” zei ik. „Dat heeft hij me zelf verteld, en ik geloof hem. Zijn hele studie geschiedenis draaide om ‘voorzichtig, dat is kostbaar’. Hij is de hele week met zijn handen aan de buitenkant van het geheim geweest en heeft er nooit ingekeken. En die man heeft drie banen om op een eerlijke manier uit de put te komen, die bootcamps van half zes en de nachtbeveiliging. Hij is het niet.” Ik zette een streep door Jamals naam, vastberaden. „Hij had wel de kans, maar niet de wetenschap. En bovendien niet het hart ervoor, wat voor mij telt, zelfs al zou het in een rechtszaak niet standhouden.”</w:t>
       </w:r>
     </w:p>
     <w:p>
@@ -3097,7 +3097,7 @@
     </w:p>
     <w:p>
       <w:r>
-        <w:t>Ik streek Sam niet van de lijst, niet helemaal, nog niet. „Dat wil ik bewijzen voordat ik hem definitief vrijpleit,” zei ik. „Maar ik zou er mijn huis op durven verwedden. De geur wijst naar de herberg, niet naar de man.”</w:t>
+        <w:t xml:space="preserve">Ik streepte Sam niet van de lijst, niet helemaal, nog niet. „Dat wil ik bewijzen voordat ik hem definitief vrijpleit,” zei ik. „Maar ik zou er mijn huis op durven verwedden. De geur wijst naar de herberg, niet naar de man.”</w:t>
       </w:r>
     </w:p>
     <w:p>
@@ -3107,7 +3107,7 @@
     </w:p>
     <w:p>
       <w:r>
-        <w:t>Ik fronste mijn wenkbrauwen bij zijn naam op het blad. „Dat is degene waar ik niet uit kom. Hij weet alles wat de afperser weet. De broche, de losse steen, Ridgeline, dat hele verhaal. Hij is er via de kant van de familie Blackburn ingedoken, via de advocaat van de boedel, en hij heeft het spoor bijna tot aan Constance's deur gevolgd.” Ik draaide mijn kop een langzame halve slag op tafel. „Maar hij vertelt het aan iedereen. Hij deelt visitekaartjes uit. Hij ging in de openbare bibliotheek zitten en vertelde me het hele verhaal nog voor ik er ook maar naar had gevraagd. Een afperser duikt onder, Nick. Zijn hele macht schuilt in het verbergen. En Neil Carter doet het exacte tegenovergestelde van onderduiken, elk uur van de dag. Dus of hij is onze man helemaal niet, of hij is de slimste van het stel, door zoveel eerlijk kabaal over de broche te maken dat niemand in het dorp ooit twee keer zou kijken naar de man die er het meeste over praat.” Ik zette een vraagteken naast Neil. „Ik ben er nog niet aan toe om hem weg te strepen. Maar dit wil ik er wel over zeggen. Hij kent het geheim, hij is er op eerlijke wijze aangekomen, en hij is nooit bij Fiona langs geweest voor een cent. Hij is bij haar langs geweest om antwoorden te krijgen, bij daglicht, met een notitieboek in zijn hand.”</w:t>
+        <w:t xml:space="preserve">Ik fronste mijn wenkbrauwen bij zijn naam op het blad. „Dat is degene waar ik niet uit kom. Hij weet alles wat de afperser weet. De broche, de ene steen, Ridgeline, dat hele verhaal. Hij is er via de kant van de familie Blackburn ingedoken, via de advocaat van de boedel, en hij heeft het spoor bijna tot aan Constance's deur gevolgd.” Ik draaide mijn kop een langzame halve slag op tafel. „Maar hij vertelt het aan iedereen. Hij deelt visitekaartjes uit. Hij ging in de openbare bibliotheek zitten en vertelde me het hele verhaal nog voor ik er ook maar naar had gevraagd. Een afperser duikt onder, Nick. Zijn hele macht schuilt in het verbergen. En Neil Carter doet het exacte tegenovergestelde van onderduiken, elk uur van de dag. Dus of hij is onze man helemaal niet, of hij is de slimste van het stel, door zoveel eerlijk kabaal over de broche te maken dat niemand in het dorp ooit twee keer zou kijken naar de man die er het meeste over praat.” Ik zette een vraagteken naast Neil. „Ik ben er nog niet aan toe om hem weg te strepen. Maar dit wil ik er wel over zeggen. Hij kent het geheim, hij is er op eerlijke wijze aangekomen, en hij is nooit bij Fiona langs geweest voor een cent. Hij is bij haar langs geweest om antwoorden te krijgen, bij daglicht, met een notitieboek in zijn hand.”</w:t>
       </w:r>
     </w:p>
     <w:p>
@@ -3117,7 +3117,7 @@
     </w:p>
     <w:p>
       <w:r>
-        <w:t>„Dan blijven er twee over.” Ik keek naar de pagina en wilde dat niet. Vera. Theo. De twee namen waar ik geen streep door kon zetten. „En hier maak ik me zorgen over. Van iedereen op dit blad zijn de enige twee die ik niet kan vrijpleiten degenen die de sleutels van de oude papieren van het dorp in handen hebben. Vera bewaart de akten en de eigendomsregisters, een eeuw aan wie-bezat-wat, de akte van de herberg zit daar ergens tussen. Ze werd stijf als een plank en vertelde me dat ze de papieren die vlak achter haar rug staan nooit leest. En Theo.” Ik dwong mezelf om het langzaam te zeggen. „Theo woont in het archief. De brieven van Blackburn waren in zijn hoede, in zijn handen. En de meest interessante daarvan, precies degene die zouden vertellen dat er een broche was verdwenen en waar die is gebleven, zijn degene waarvan hij voor het hele dorp opstond om aan te kondigen dat ze zoekgeraakt waren.”</w:t>
+        <w:t xml:space="preserve">„Dan blijven er twee over.” Ik keek naar de pagina en wilde dat niet. Vera. Theo. De twee namen waar ik geen streep door kon zetten. „En hier maak ik me zorgen over. Van iedereen op dit blad zijn de enige twee die ik niet kan vrijpleiten degenen die de sleutels van de oude papieren van het dorp in handen hebben. Vera bewaart de akten en de eigendomsregisters, een eeuw aan wie-bezat-wat, de akte van de herberg zit daar ergens tussen. Ze werd stijf als een plank en vertelde me dat ze de papieren die vlak achter haar rug staan nooit leest. En Theo.” Ik dwong mezelf om het langzaam te zeggen. „Theo woont in het archief. De brieven van Blackburn waren in zijn hoede, in zijn handen. En de meest interessante daarvan, precies degenen die zouden vertellen dat er een broche was verdwenen en waar die is gebleven, zijn degenen waarvan hij voor het hele dorp opstond om aan te kondigen dat ze zoekgeraakt waren.”</w:t>
       </w:r>
     </w:p>
     <w:p>
@@ -3147,7 +3147,7 @@
     </w:p>
     <w:p>
       <w:r>
-        <w:t>„Binnenkort,” zei ik. „Eerst moeten er twee losse eindjes worden vastgeknoopt. Sam, en de vreemdeling. Ik wil dat ze allebei definitief weg zijn, buiten enige twijfel vrijgepleit, voordat ik mezelf toesta dat archief binnen te lopen en Theo goed in de ogen te kijken. Dat ben ik hem minstens schuldig, om hem pas ergens van te beschuldigen als er niemand anders meer over is om te verduren. En dan ga ik, en dan zal ik naar de brieven kijken, en dan kom ik erachter of de woorden overeenkomen.”</w:t>
+        <w:t xml:space="preserve">„Binnenkort,” zei ik. „Eerst moeten er twee losse eindjes worden vastgeknoopt. Sam, en de vreemdeling. Ik wil dat ze allebei definitief weg zijn, buiten enige twijfel vrijgepleit, voordat ik mezelf toesta dat archief binnen te lopen en Theo goed in de ogen te kijken. Dat ben ik hem minstens schuldig, om hem pas ergens van te beschuldigen als er niemand anders meer over is om te verdenken. En dan ga ik, en dan zal ik naar de brieven kijken, en dan kom ik erachter of de woorden overeenkomen.”</w:t>
       </w:r>
     </w:p>
     <w:p>
@@ -3210,7 +3210,7 @@
     <w:p/>
     <w:p>
       <w:r>
-        <w:t>„Chantage.” Hij sprak het woord zacht uit, alsof het vies smaakte. „Fiona. En ik sta hier al drie weken op haar veranda te mokken over twintig dollar terwijl zij dat allemaal met zich meedraagt.” Hij drukte de muis van zijn hand hard tegen zijn voorhoofd, waardoor er een veeg roet achterbleef. „Zeg haar dat het is vergeven. Die twintig dollar, de hele bestelling, elke cent, zeg haar dat ik er de rest van mijn leven nooit meer iets over wil horen. God. Ik heb het erger gemaakt, hè? Haar lastigvallen om geld terwijl ze kopje-unter ging. Ik heb het erger gemaakt en het niet eens geweten.”</w:t>
+        <w:t xml:space="preserve">„Chantage.” Hij sprak het woord zacht uit, alsof het vies smaakte. „Fiona. En ik sta hier al drie weken op haar veranda te mokken over twintig dollar terwijl zij dat allemaal met zich meedraagt.” Hij drukte de muis van zijn hand hard tegen zijn voorhoofd, waardoor er een veeg roet achterbleef. „Zeg haar dat het is vergeven. Die twintig dollar, de hele bestelling, elke cent, zeg haar dat ik er de rest van mijn leven nooit meer iets over wil horen. God. Ik heb het erger gemaakt, hè? Haar lastigvallen om geld terwijl ze kopje-onder ging. Ik heb het erger gemaakt en het niet eens geweten.”</w:t>
       </w:r>
     </w:p>
     <w:p/>
@@ -3246,7 +3246,7 @@
     <w:p/>
     <w:p>
       <w:r>
-        <w:t>„Dat kan ik doen.” Hij pakte mijn hand, hard als ijzer en warm. „En mevrouw Claus. Wat dit ook kost om recht te zetten. Als het op geld aankomt, als ze geld nodig heeft om veilig te zijn, dan zeg je maar dat de smeden in drie graafschappen me nog gunsten schulden en dat ik ze allemaal tot de laatste toe opeis zonder er twee keer over na te denken. Zeg haar dat ook, als je haar over die twintig dollar vertelt.”</w:t>
+        <w:t xml:space="preserve">„Dat kan ik doen.” Hij pakte mijn hand, hard als ijzer en warm. „En mevrouw Claus. Wat dit ook kost om recht te zetten. Als het op geld aankomt, als ze geld nodig heeft om veilig te zijn, dan zegt u maar dat de smeden in drie graafschappen me nog gunsten schuldig zijn en dat ik ze allemaal tot de laatste toe opeis zonder er twee keer over na te denken. Zeg haar dat ook, als je haar over die twintig dollar vertelt.”</w:t>
       </w:r>
     </w:p>
     <w:p/>
@@ -3274,7 +3274,7 @@
     </w:p>
     <w:p>
       <w:r>
-        <w:t>„Lekkere vent,” zei ze nog voor ik goed en wel hallo kon zeggen. „Oude firma, twee staten verderop, doet precies wat je man zegt dat hij doet: nalatenschappen, erfenissen en het opsporen van zoekgeraakte spullen voor advocaten die meer geld dan tijd hebben. En er is een erfenis van de Blackburns, Jessica, een echte, lopende zaak. De laatste van de tak van Adelaide Blackburn is dit voorjaar in de stad gestorven, geen kinderen, geen testament van betekenis, en dat laat een enorme puinhoop achter. Onze burgemeester komt van de kant van de neven en nichten, de kant die wel de neus kreeg maar geen cent van het geld. Hij heeft er niets mee te maken. Carter staat bij het kantoor op de loonlijst als de onderzoeker die ze hebben ingehuurd om de boel door te vlooien. Ik hoorde het van een klerk die de hele handel bevestigde zonder ook maar één moment door te hebben dat ze iets aan het bevestigen was. Hij is precies, tot op de letter, wat hij je verteld heeft dat hij is: een speurneus met een vergunning en een onkostenvergoeding.”</w:t>
+        <w:t xml:space="preserve">„Echte firma,” zei ze nog voor ik goed en wel hallo kon zeggen. „Oude firma, twee staten verderop, doet precies wat Carter zegt dat hij doet: nalatenschappen, erfenissen en het opsporen van zoekgeraakte spullen voor advocaten die meer geld dan tijd hebben. En er is een erfenis van de Blackburns, Jessica, een echte, lopende zaak. De laatste van de tak van Adelaide Blackburn is dit voorjaar in de stad gestorven, geen kinderen, geen testament van betekenis, en dat laat een enorme puinhoop achter. Onze burgemeester komt van de kant van de neven en nichten, de kant die wel de neus kreeg maar geen cent van het geld. Hij heeft er niets mee te maken. Carter staat bij het kantoor op de loonlijst als de onderzoeker die ze hebben ingehuurd om de boel door te vlooien. Ik hoorde het van een klerk die de hele handel bevestigde zonder ook maar één moment door te hebben dat ze iets aan het bevestigen was. Hij is precies, tot op de letter, wat hij je verteld heeft dat hij is: een speurneus met een vergunning en een onkostenvergoeding.”</w:t>
       </w:r>
     </w:p>
     <w:p/>
@@ -3290,7 +3290,7 @@
     </w:p>
     <w:p>
       <w:r>
-        <w:t>Hij legde zijn vergrootglas neer, onmiddellijk geïnteresseerd. „Daar houd ik je aan. Ik word graag in de gaten gehouden. Het is op mijn leeftijd vleiend om de moeite waard te zijn om naar te kijken.”</w:t>
+        <w:t xml:space="preserve">Hij legde zijn vergrootglas neer, onmiddellijk geïnteresseerd. „Ga uw gang. Ik word graag in de gaten gehouden. Het is op mijn leeftijd vleiend om de moeite waard te zijn om naar te kijken.”</w:t>
       </w:r>
     </w:p>
     <w:p>
@@ -3306,7 +3306,7 @@
     <w:p/>
     <w:p>
       <w:r>
-        <w:t>Ik keek de hele tijd naar zijn gezicht terwijl ik het zei. Wat er over het gezicht van Neil Carter trok, was de open, vraatzuchtige, zwakjes ontstemde fascinatie van een man die zijn hele carrière heeft besteed aan het achternajagen van een koud, honderd jaar oud spoor op papier, en aan wie zojuist, over een bibliotheektafel heen, is verteld dat het spoor nog warm genoeg is om een levend mens te schroeien.</w:t>
+        <w:t xml:space="preserve">Ik keek de hele tijd naar zijn gezicht terwijl ik het zei. Wat er over het gezicht van Neil Carter trok, was de open, vraatzuchtige, licht ontzette fascinatie van een man die zijn hele carrière heeft besteed aan het achternajagen van een koud, honderd jaar oud spoor op papier, en aan wie zojuist, over een bibliotheektafel heen, is verteld dat het spoor nog warm genoeg is om een levend mens te schroeien.</w:t>
       </w:r>
     </w:p>
     <w:p>
@@ -3327,7 +3327,7 @@
     </w:p>
     <w:p>
       <w:r>
-        <w:t>„Dat zei ik de eerste dag al. Ik spoor op waar dingen zijn gebleven. De rest is iets tussen mensen en waar ze ook maar verantwoording aan afleggen.” Hij trok een dikke map van zijn stapel en schoof die na enig aarzelen over de tafel naar mij toe. „Hier. Je kunt dit net zo goed hebben, aangezien we toch eerlijk tegen elkaar zijn, en aangezien een of andere kruimeldief in jullie mooie stad het slechtste helft daarvan gebruikt om een ​​goede vrouw te tergen. Het is alles wat ik heb opgediept over de meid. Constance Okafor.”</w:t>
+        <w:t xml:space="preserve">„Dat zei ik de eerste dag al. Ik spoor op waar dingen zijn gebleven. De rest is iets tussen mensen en waar ze ook maar verantwoording aan afleggen.” Hij trok een dikke map van zijn stapel en schoof die na enig aarzelen over de tafel naar mij toe. „Hier. U kunt dit net zo goed hebben, aangezien we toch eerlijk tegen elkaar zijn, en aangezien een of andere kruimeldief in jullie mooie stad de slechtste helft daarvan gebruikt om een goede vrouw te kwellen. Het is alles wat ik heb opgediept over de meid. Constance Okafor.”</w:t>
       </w:r>
     </w:p>
     <w:p/>
@@ -3338,13 +3338,13 @@
     </w:p>
     <w:p>
       <w:r>
-        <w:t>„Ze had nog tegoed,” zei Neil terwijl hij me zag lezen. „Dat is het stukje dat de roddel altijd weglaat, omdat roddel een lekker schoon schurkje en een lekker schoon misdrijf wil. De Blackburns hadden hun huishoudelijk personeel al maanden niet betaald, in die winter van vierentwintig. Ik heb de klachten daarover erin zitten, van de andere bedienden die zijn opgestapt, en een brief, mevrouw Claus, een brief van Constance zelf, waarin ze heel höfelijk vraagt om haar achterstallige loon, en als antwoord krijgt dat ze dankbaar moet zijn dat ze een dak boven haar hoofd heeft. Haar moeder lag diezelfde winter op sterven, drie straten verderop, en er was geen geld voor een dokter, helemaal niets. En daar stond ze dan, dag in dag uit, een broche af te stoffen die meer waard was dan ze in drie levens zou verdienen, terwijl de familie die eigenaar was haar vertelde dankbaar te zijn.” Hij spreidde zijn handen. „Ik zeg niet dat het goed was dat ze hem meenam. Ik zeg dat ze geen dievegge was op de simplistische manier waarop het briefje jouw vriendin wil doen geloven. Ze was een wanhopig meisje, als eerste beroofd door rijke mensen die zich haar betaling gemakkelijk konden veroorloven en ervoor kozen dat niet te doen. Ze heeft zichzelf terugbetaald met het enige waar ze bij kon, en heeft daarop een eeuw lang een eerlijk welkom gebouwd. Er zijn slechtere fundamenten voor een herberg.”</w:t>
-      </w:r>
-    </w:p>
-    <w:p/>
-    <w:p>
-      <w:r>
-        <w:t>Ik bleef daar zitten met de open map in mijn handen, en er kantelde langzaam iets van binnen in mijn borst. Dit veranderde de vorm van het hele verhaal. Het geheim waar Fiona zichzelf bijna voor dood had gehouden om het maar te bewaren, die schandelijke diefstal aan de wortel van haar familie, zag er opeens heel anders uit toen je de papieren open en bloot in het licht legde. Het was een hard verhaal, en een menselijk verhaal: een wanhopig meisje in een koud huis, en een schuld die werd ingelost op de enige manier die haar nog restte. Op de ene manier verteld, in een fluistering, met slechts de halve feiten, kon het haar ruïneren. Op de ware manier verteld, helemaal, met Neils documenten daaronder uitgespreid, zou het haar misschien helemaal niet ruïneren. Het kon zomaar een verhaal zijn waar een vrouw recht overeind in kon blijven staan.</w:t>
+        <w:t xml:space="preserve">„Ze had nog tegoed,” zei Neil terwijl hij me zag lezen. „Dat is het stukje dat de roddel altijd weglaat, omdat roddel een lekker schoon schurkje en een lekker schoon misdrijf wil. De Blackburns hadden hun huishoudelijk personeel al maanden niet betaald, in die winter van vierentwintig. Ik heb de klachten daarover erin zitten, van de andere bedienden die zijn opgestapt, en een brief, mevrouw Claus, een brief van Constance zelf, waarin ze heel hoffelijk vraagt om haar achterstallige loon, en als antwoord krijgt dat ze dankbaar moet zijn dat ze een dak boven haar hoofd heeft. Haar moeder lag diezelfde winter op sterven, drie straten verderop, en er was geen geld voor een dokter, helemaal niets. En daar stond ze dan, dag in dag uit, een broche af te stoffen die meer waard was dan ze in drie levens zou verdienen, terwijl de familie die eigenaar was haar vertelde dankbaar te zijn.” Hij spreidde zijn handen. „Ik zeg niet dat het goed was dat ze hem meenam. Ik zeg dat ze geen dievegge was op de simplistische manier waarop het briefje uw vriendin wil doen geloven. Ze was een wanhopig meisje, als eerste beroofd door rijke mensen die zich haar betaling gemakkelijk konden veroorloven en ervoor kozen dat niet te doen. Ze heeft zichzelf terugbetaald met het enige waar ze bij kon, en heeft daarop een eeuw lang een eerlijk welkom gebouwd. Er zijn slechtere fundamenten voor een herberg.”</w:t>
+      </w:r>
+    </w:p>
+    <w:p/>
+    <w:p>
+      <w:r>
+        <w:t xml:space="preserve">Ik bleef daar zitten met de open map in mijn handen, en er kantelde langzaam iets van binnen in mijn borst. Dit veranderde de vorm van het hele verhaal. Het geheim waar Fiona zich bijna kapot voor had gemaakt om het maar te bewaren, die schandelijke diefstal aan de wortel van haar familie, zag er opeens heel anders uit toen je de papieren open en bloot in het licht legde. Het was een hard verhaal, en een menselijk verhaal: een wanhopig meisje in een koud huis, en een schuld die werd ingelost op de enige manier die haar nog restte. Op de ene manier verteld, in een fluistering, met slechts de halve feiten, kon het haar ruïneren. Op de ware manier verteld, helemaal, met Neils documenten daaronder uitgespreid, zou het haar misschien helemaal niet ruïneren. Het kon zomaar een verhaal zijn waar een vrouw recht overeind in kon blijven staan.</w:t>
       </w:r>
     </w:p>
     <w:p>
@@ -3354,7 +3354,7 @@
     </w:p>
     <w:p>
       <w:r>
-        <w:t>„Houd maar. Ik heb kopieën van elke pagina.” Hij pauzeerde, en voor een keer werd de levendigheid in hem stil en zacht. „Zeg je vriendin eens wat, van een man die voor zijn brood de post van dode mensen leest. De geheimen die mensen te gronde richten, zijn de half vertelde. Elke keer weer. Het is het verbergen dat de tanden eraan zet, niet de waarheid. Ik heb in mijn carrière honderd begraven familiegeheimen opgegraven, en elk stuk voor stuk bleek kleiner en treuriger te zijn dan waar de familie haar hele leven tegenop had gezien.”</w:t>
+        <w:t xml:space="preserve">„Houd maar. Ik heb kopieën van elke pagina.” Hij pauzeerde, en voor een keer werd de levendigheid in hem stil en zacht. „Zeg uw vriendin eens wat, van een man die voor zijn brood de post van dode mensen leest. De geheimen die mensen te gronde richten, zijn de half vertelde. Elke keer weer. Het is het verbergen dat de tanden eraan zet, niet de waarheid. Ik heb in mijn carrière honderd begraven familiegeheimen opgegraven, en stuk voor stuk bleken ze kleiner en treuriger te zijn dan waar de familie haar hele leven tegenop had gezien.”</w:t>
       </w:r>
     </w:p>
     <w:p/>
@@ -3394,7 +3394,7 @@
     <w:p/>
     <w:p>
       <w:r>
-        <w:t xml:space="preserve">Theo hield een kaartenbak bij, zoals een goed archivist betaamt, een lange, ondiepe lade vol kaartjes, één kaartje voor elk stuk in het bezit van de instelling, elk voorzien van een korte samenvatting in zijn kleine, hellende handschrift over wat een bepaalde map bevatte. Ik had aangeboden om een stapel kaartjes die door elkaar geraakt waren opnieuw op te bergen. Ik was door de B's aan het werken – Bakkerijbonen, Benefietabonnementen – toen ik bij de kaartjes voor de papieren van de familie Blackburn aankwam, en daartussen drie trof met rood potlood bovenaan doorgestreept: </w:t>
+        <w:t xml:space="preserve">Theo hield een kaartenbak bij, zoals een goed archivist betaamt, een lange, ondiepe lade vol kaartjes, één kaartje voor elk stuk in het bezit van de instelling, elk voorzien van een korte samenvatting in zijn kleine, hellende handschrift over wat een bepaalde map bevatte. Ik had aangeboden om een stapel kaartjes die door elkaar geraakt waren opnieuw op te bergen. Ik was door de B's aan het werken – Bakkerijbonnen, Benefietabonnementen – toen ik bij de kaartjes voor de papieren van de familie Blackburn aankwam, en daartussen drie trof die bovenaan met rood potlood gemarkeerd waren: </w:t>
       </w:r>
       <w:r>
         <w:rPr>
@@ -3418,7 +3418,7 @@
         <w:rPr>
           <w:i/>
         </w:rPr>
-        <w:t>Correspondentie, Adelaide Blackburn aan haar zuster, winter 1924. Betreffende: de diefstal van de familiebroche (de saffier in haar hart) door een huisknecht; het stuk later verpand bij Ridgeline. Van aanzienlijk lokaal belang.</w:t>
+        <w:t xml:space="preserve">Correspondentie, Adelaide Blackburn aan haar zuster, winter 1924. Betreffende: de diefstal van de familiebroche (de saffier in haar hart) door een huisbediende; het stuk later verpand bij Ridgeline. Van aanzienlijk lokaal belang.</w:t>
       </w:r>
     </w:p>
     <w:p/>
@@ -3460,7 +3460,7 @@
     <w:p/>
     <w:p>
       <w:r>
-        <w:t>Ik confronteerde hem niet. Het was het moment niet. Wat in haast wordt gedaan, wordt slecht gedaan, en er bleef nog steeds de vraag open hoe precies, en of hij het alleen had gedaan. Dus ik maakte het uur af. Ik vertelde Theo dat het sorteren prachtig opschoot, wat waar was. Ik liet toe dat hij bij de deur mijn handen drukte, me bedankte en met stralende, vermoeide ogen vertelde dat de tentoonstelling veertig nieuwe leden had opgeleverd – veertig, begreep ik wel wat dat kon betekenen voor de Vereniging. Ik zei dat het prachtig was, en ik meende de verwondering om zijn hoop, al brak het mijn hart. Toen liep ik de treden af de kou in met benen die niet helemaal van mijzelf waren.</w:t>
+        <w:t xml:space="preserve">Ik confronteerde hem niet. Het was het moment niet. Wat in haast wordt gedaan, wordt slecht gedaan, en er bleef nog steeds de vraag open hoe precies, en of hij het alleen had gedaan. Dus ik maakte het uur af. Ik vertelde Theo dat het sorteren prachtig opschoot, wat waar was. Ik liet toe dat hij bij de deur mijn handen drukte, me bedankte en met stralende, vermoeide ogen vertelde dat de tentoonstelling veertig nieuwe leden had opgeleverd – veertig, begreep ik wel wat dat kon betekenen voor het Genootschap. Ik zei dat het prachtig was, en ik meende de verwondering om zijn hoop, al brak het mijn hart. Toen liep ik de treden af de kou in met benen die niet helemaal van mijzelf waren.</w:t>
       </w:r>
     </w:p>
     <w:p/>
@@ -3490,7 +3490,7 @@
     <w:p/>
     <w:p>
       <w:r>
-        <w:t>„Op dezelfde manier waarop iemand ooit een vreselijke daad verricht,” zei Nick. „Door zichzelf te vertellen dat het voor iets goeds is, en het zichzelf opnieuw te vertellen, keer op keer, totdat hij niets meer ziet dan het goede dat hij zichzelf blijft voorhouden, en het leed klein en ver weg aan de rand van zijn blikveld is geraakt. Het is de liefde die het hem toestaat, Jess. Dat is het wrede eraan. Theo zou nog geen cent voor zichzelf stelen. Voor de Vereniging heeft hij zichzelf zowat van alles weten te overtuigen.”</w:t>
+        <w:t xml:space="preserve">„Op dezelfde manier waarop iemand ooit een vreselijke daad verricht,” zei Nick. „Door zichzelf te vertellen dat het voor iets goeds is, en het zichzelf opnieuw te vertellen, keer op keer, totdat hij niets meer ziet dan het goede dat hij zichzelf blijft voorhouden, en het leed klein en ver weg aan de rand van zijn blikveld is geraakt. Het is de liefde die het hem toestaat, Jess. Dat is het wrede eraan. Theo zou nog geen cent voor zichzelf stelen. Voor het Genootschap heeft hij zichzelf zowat alles aangepraat.”</w:t>
       </w:r>
     </w:p>
     <w:p/>
@@ -3514,25 +3514,25 @@
     <w:p/>
     <w:p>
       <w:r>
-        <w:t>Het werd plotseling goudkleurig bij de ramen, hoewel het buiten stikdonker was en dat al een uur lang was. Warm en bewegend stroomde het naar binnen vanuit de wei achter het erf, vanuit het atelier, helder genoeg om de schaduwen van de kozijnen in lange gouden balken over de keukenvloer te werpen. Pip stond op bij de haard. Van buiten klonk, zwak en helder, een geluid dat leek op een heleboel klokjes in de verte, of een groot vuur dat in één klap ineenzakte.</w:t>
-      </w:r>
-    </w:p>
-    <w:p/>
-    <w:p>
-      <w:r>
-        <w:t>Nick stond op. Hij keek in de richting van het atelier en daarna naar mij. Er verscheen iets op zijn gezicht waar ik al weken op had gewacht: bereidheid.</w:t>
-      </w:r>
-    </w:p>
-    <w:p/>
-    <w:p>
-      <w:r>
-        <w:t>„Kom mee,” zei hij, en hij stak zijn hand uit. „Het is nu ver genoeg gevorderd. En ik denk dat je het vanavond moet zien, van alle avonden die er zijn. Ik denk dat je moet zien waar wij voor dienen, jij en ik, voordat je nog dieper afdalen in wat zij hebben gedaan.”</w:t>
-      </w:r>
-    </w:p>
-    <w:p/>
-    <w:p>
-      <w:r>
-        <w:t>Ik pakte zijn hand, en we liepen over het koude, zilveren erf terwijl het goud bij elke stap helderder overstroomde en Pip waggelend voor ons uit liep. Nick legde zijn hand op de deur van het atelier en duwde hem open.</w:t>
+        <w:t xml:space="preserve">Het werd plotseling goudkleurig bij de ramen, hoewel het buiten stikdonker was en dat al een uur lang was. Warm en bewegend stroomde het naar binnen vanuit de wei achter het erf, vanuit de werkplaats, helder genoeg om de schaduwen van de kozijnen in lange gouden balken over de keukenvloer te werpen. Pip stond op bij de haard. Van buiten klonk, zwak en helder, een geluid dat leek op een heleboel klokjes in de verte, of een groot vuur dat in één klap ineenzakte.</w:t>
+      </w:r>
+    </w:p>
+    <w:p/>
+    <w:p>
+      <w:r>
+        <w:t xml:space="preserve">Nick stond op. Hij keek in de richting van de werkplaats en daarna naar mij. Er verscheen iets op zijn gezicht waar ik al weken op had gewacht: bereidheid.</w:t>
+      </w:r>
+    </w:p>
+    <w:p/>
+    <w:p>
+      <w:r>
+        <w:t xml:space="preserve">„Kom mee,” zei hij, en hij stak zijn hand uit. „Het is nu ver genoeg gevorderd. En ik denk dat je het vanavond moet zien, van alle avonden die er zijn. Ik denk dat je moet zien waar wij voor dienen, jij en ik, voordat je nog dieper afdaalt in wat zij hebben gedaan.”</w:t>
+      </w:r>
+    </w:p>
+    <w:p/>
+    <w:p>
+      <w:r>
+        <w:t xml:space="preserve">Ik pakte zijn hand, en we liepen over het koude, zilveren erf terwijl het goud bij elke stap helderder overstroomde en Pip waggelend voor ons uit liep. Nick legde zijn hand op de deur van de werkplaats en duwde hem open.</w:t>
       </w:r>
     </w:p>
     <w:p/>
@@ -3627,13 +3627,13 @@
     <w:p/>
     <w:p>
       <w:r>
-        <w:t xml:space="preserve">Ik pakte het van haar aan. Hetzelfde crème papier. Hetzelfde welbewust verwrongen handschrift. Korter dan het eerste, dit briefje, en des te wreder door die beknoptheid. </w:t>
+        <w:t xml:space="preserve">Ik pakte het van haar aan. Hetzelfde crèmekleurige papier. Hetzelfde welbewust verwrongen handschrift. Korter dan het eerste, dit briefje, en des te wreder door die beknoptheid. </w:t>
       </w:r>
       <w:r>
         <w:rPr>
           <w:i/>
         </w:rPr>
-        <w:t>Het festival eindigt zondag. Zorg dat het geld er tegen die tijd is, anders leest de hele stad maandagochtend over je familie. Rode strik op de krans als het klaar is. Wees hier niet onverstandig in.</w:t>
+        <w:t xml:space="preserve">Het festival eindigt zondag. Zorg dat het geld er tegen die tijd is, anders leest de hele stad maandagochtend over je familie. Rood lint op de krans als het klaar is. Wees hier niet onverstandig in.</w:t>
       </w:r>
     </w:p>
     <w:p/>
@@ -3651,7 +3651,7 @@
     <w:p/>
     <w:p>
       <w:r>
-        <w:t>„Nee,” zei ik, terwijl ik het briefje in mijn handen omdraaide en het opnieuw las. „Hij wil dat je zo bang bent dat je iets opspeurt wat er niet is. Mensen die nooit echt wanhopig zijn geweest, geloven dat wanhopige mensen op de een of andere manier altijd wel geld kunnen toveren, als je ze maar hard genoeg uitknijpt. Hij denkt dat er een rijke familielid is waar je te trots voor bent geweest om geld aan te vragen. Hij denkt dat je iets zult verkopen, ergens een hypotheek op zult nemen, op je knieën naar de Worthingtons zult gaan. Hij gelooft dat de angst zelf het geld zal losmaken, als muntstukken uit een zak die je ondersteboven houdt.” Ik keek haar aan. „En dat vertelt me iets over hem, Fiona, of hij dat nu zo bedoeld heeft of niet. Het vertelt me dat hij zelf ook wanhopig is. Comfortabele mensen denken niet dat geld zomaar verschijnt onder druk, omdat geld voor hen nog nooit tevoorschijn hoeft te worden getoverd; het is er simpelweg altijd al geweest. Alleen iemand die het op de een of andere manier heeft moeten laten verschijnen in een magere maand, redeneert zo. Het briefje heeft me al dagenlang bang gemaakt voor jou. Pas nu bedenk ik me dat ik misschien ook een beetje bang voor hem moet zijn, wie hij dan ook mag zijn.”</w:t>
+        <w:t xml:space="preserve">„Nee,” zei ik, terwijl ik het briefje in mijn handen omdraaide en het opnieuw las. „Hij wil dat je zo bang bent dat je iets opspeurt wat er niet is. Mensen die nooit echt wanhopig zijn geweest, geloven dat wanhopige mensen op de een of andere manier altijd wel geld kunnen toveren, als je ze maar hard genoeg uitknijpt. Hij denkt dat er een rijk familielid is waar je te trots voor bent geweest om geld aan te vragen. Hij denkt dat je iets zult verkopen, ergens een hypotheek op zult nemen, op je knieën naar de Worthingtons zult gaan. Hij gelooft dat de angst zelf het geld zal losmaken, als muntstukken uit een zak die je ondersteboven houdt.” Ik keek haar aan. „En dat vertelt me iets over hem, Fiona, of hij dat nu zo bedoeld heeft of niet. Het vertelt me dat hij zelf ook wanhopig is. Comfortabele mensen denken niet dat geld zomaar verschijnt onder druk, omdat geld voor hen nog nooit tevoorschijn hoeft te worden getoverd; het is er simpelweg altijd al geweest. Alleen iemand die het op de een of andere manier heeft moeten laten verschijnen in een magere maand, redeneert zo. Het briefje heeft me al dagenlang bang gemaakt voor jou. Pas nu bedenk ik me dat ik misschien ook een beetje bang voor hem moet zijn, wie hij dan ook mag zijn.”</w:t>
       </w:r>
     </w:p>
     <w:p/>
@@ -3663,13 +3663,13 @@
     <w:p/>
     <w:p>
       <w:r>
-        <w:t>Ik had een blik. Ik schijn altijd een blik te hebben. En ik wist het inderdaad, of in elk geval dicht genoeg bij de waarheid dat het niet-helemaal-weten alleen nog een kwestie was van hoe en of ik het in mijn eentje kon oplossen. Maar ik was nog niet zover om zijn naam hardop uit te spreken in dat kleine kamertje. Als ik Theo Hussein hardop tegen Fiona zou zeggen, zou dat iets in beweging zetten wat ik niet meer kon terugdraaien, en ik wilde absoluut zeker zijn van m'n zaak, en weten hoe ik het voorzichtig moest aanpakken, voordat ik het liet rollen.</w:t>
-      </w:r>
-    </w:p>
-    <w:p/>
-    <w:p>
-      <w:r>
-        <w:t>„Ik ben in de buurt,” zei ik. „Dichterbij dan twee dagen geleden. Ik heb nog heel even nodig, en ik moet het goed aanpakken, want een misstap nu kan je harder kwetsen dan een juiste zet je ooit kan helpen. Wil je me nog drie dagen geven? Tot het einde van het festival?”</w:t>
+        <w:t xml:space="preserve">Ik had een blik. Ik schijn altijd een blik te hebben. En ik wist het inderdaad, of in elk geval dicht genoeg bij de waarheid dat het niet-helemaal-weten alleen nog een kwestie was van hoe, en of hij het alleen had gedaan. Maar ik was nog niet zover om zijn naam hardop uit te spreken in dat kleine kamertje. Als ik Theo Hussein hardop tegen Fiona zou zeggen, zou dat iets in beweging zetten wat ik niet meer kon terugdraaien, en ik wilde absoluut zeker zijn van m'n zaak, en weten hoe ik het voorzichtig moest aanpakken, voordat ik het liet rollen.</w:t>
+      </w:r>
+    </w:p>
+    <w:p/>
+    <w:p>
+      <w:r>
+        <w:t xml:space="preserve">„Ik zit er dichtbij,” zei ik. „Dichterbij dan twee dagen geleden. Ik heb nog heel even nodig, en ik moet het goed aanpakken, want een misstap nu kan je harder kwetsen dan een juiste zet je ooit kan helpen. Wil je me nog drie dagen geven? Tot het einde van het festival?”</w:t>
       </w:r>
     </w:p>
     <w:p/>
@@ -3687,7 +3687,7 @@
     <w:p/>
     <w:p>
       <w:r>
-        <w:t>Ze maakte een wegwerpbaren handbeweging, ze kon het aanzicht ervan missen als kiespijn, en ik vouwde het op en stak het weg.</w:t>
+        <w:t xml:space="preserve">Ze maakte een wegwerpend handgebaar, ze kon het aanzicht ervan missen als kiespijn, en ik vouwde het op en stak het weg.</w:t>
       </w:r>
     </w:p>
     <w:p/>
@@ -3699,7 +3699,7 @@
     <w:p/>
     <w:p>
       <w:r>
-        <w:t>Daarmee stond het waar buiten kijf, en het wie was al evenmin een raadsel. Het voelde koud en zwaar aan vanbinnen, omdat ik na al dat gesnuffel in het archief al wist door wiens handen die brieven waren gegaan. Maar toen ik daar in dat kille kamertje zat, stuitte ik op iets dat niet klopte, hoe ik het ook wendde of keerde, en dat maar niet op zijn plek wilde vallen.</w:t>
+        <w:t xml:space="preserve">Daarmee stond het waar buiten kijf, en het wie bijna ook. Het voelde koud en zwaar aan vanbinnen, omdat ik na al dat gesnuffel in het archief al wist door wiens handen die brieven waren gegaan. Maar toen ik daar in dat kille kamertje zat, stuitte ik op iets dat niet klopte, hoe ik het ook wendde of keerde, en dat maar niet op zijn plek wilde vallen.</w:t>
       </w:r>
     </w:p>
     <w:p/>
@@ -3732,7 +3732,7 @@
     <w:p/>
     <w:p>
       <w:r>
-        <w:t>„Drie dagen,” beaamde ik, en ik stak het briefje weg bij het eerste. „En dan heb ik het opgelost voordat de laatsten vertrokken zijn. Dat beloof ik je.”</w:t>
+        <w:t xml:space="preserve">„Drie dagen,” beaamde ik, en ik stak het briefje weg bij het eerste. „En dan heb ik het opgelost voordat de laatste daarvan voorbij is. Dat beloof ik je.”</w:t>
       </w:r>
     </w:p>
     <w:p/>
@@ -3759,7 +3759,7 @@
     </w:p>
     <w:p>
       <w:r>
-        <w:t>Pip was een sensatie. Dat had ik wel geweten. Fiona had een hoek van de veranda van de herberg ingericht als fotohokje, met een stoel, een beschilderd winterachtergrond en een mand met gebreide sjaals, en voor een dollar voor het Historisch Genootschap kon je op de foto met de eigen pinguïn van de Noordpool. De rij stond de hele middag over de hele lengte van de veranda en liep tot beneden aan de treden. Pip droeg op elke foto een andere sjaal en nam de verering in ontvangst alsof het haar vanouds toekwam. Elk stuk zandkoek dat kinderen haar stiekem onder de tafel probeerden toe te stoppen, weigerde ze met grote waardigheid. De dollarbiljetten stapelden zich op in de pot, en het was het eerste geld dat het Genootschap had binnengekregen sinds de kassa van Olivia weg was. Het zou ze niet redden. Een pot met dollarbiljetten kon een gebouw niet redden. Maar het was iets, en het was warm. Fiona stond naast het hokje de dollars aan te pakken met een echte glimlach, en voor één middag leek ze weer op zichzelf.</w:t>
+        <w:t xml:space="preserve">Pip was een sensatie. Dat had ik wel geweten. Fiona had een hoek van de veranda van de herberg ingericht als fotohokje, met een stoel, een beschilderde winterachtergrond en een mand met gebreide sjaals, en voor een dollar voor het Historisch Genootschap kon je op de foto met de eigen pinguïn van de Noordpool. De rij stond de hele middag over de hele lengte van de veranda en liep tot beneden aan de treden. Pip droeg op elke foto een andere sjaal en nam de verering in ontvangst alsof het haar vanouds toekwam. Elk stuk zandkoek dat kinderen haar stiekem onder de tafel probeerden toe te stoppen, weigerde ze met grote waardigheid. De dollarbiljetten stapelden zich op in de pot, en het was het eerste geld dat het Genootschap had binnengekregen sinds het geldkistje van Olivia. Het zou ze niet redden. Een pot met dollarbiljetten kon een gebouw niet redden. Maar het was iets, en het was warm. Fiona stond naast het hokje de dollars aan te pakken met een echte glimlach, en voor één middag leek ze weer op zichzelf.</w:t>
       </w:r>
     </w:p>
     <w:p>
@@ -3769,17 +3769,17 @@
     </w:p>
     <w:p>
       <w:r>
-        <w:t>Aan de ene kant was ik er gewoon bij, een dorpsbewoonster op het feest van haar dorp, en het was prachtig. Emma Redfern vond me bij de cider en pronkte met haar kostuum, dat ze per se een avond te vroeg aan wilde: een sterrenbeeld, Orion, zwart met zilveren sterren die door de handige hand van haar vader op de juiste plek waren genaaid, de riem precies goed. Ze liet me alle sterren opnoemen, en dat deed ik, omdat ik die sterren al heel lang ken. Ze vond het geweldig dat mevrouw Claus haar sterrenbeelden kende. Mark stond ernaast met twee bekers cider en de ingesleten blik van een man die toekijkt hoe zijn dochter luidkeels en midden in een mensenmassa acht jaar oud is. Martha drukte me een paar wanten van de tafel in de handen, de groene, „voor die koude handen van je.” Sam Patel tikte met zijn pet naar me vanaf de overkant van de weide, bij zijn post vlak bij de veranda van de herberg, waar hij de hele dag met zijn ogen gericht op de receptiebalie net binnen de deur was gebleven, zoals ik hem had gevraagd.</w:t>
-      </w:r>
-    </w:p>
-    <w:p>
-      <w:r>
-        <w:t>En aan de andere kant, onder alle warmte, was ik ook op mijn hoekje. Het tweede briefje had gezegd dat het feest zondag eindigt, en de afperser was hier, ergens in deze mensenmassa, achter een van deze lachende gezichten. Ik kon maar niet ophouden met kijken naar de deur van de herberg en de balie vlak daarbinnen, waar zomaar een derde briefje kon worden achtergelaten tussen het feestgedruis.</w:t>
-      </w:r>
-    </w:p>
-    <w:p>
-      <w:r>
-        <w:t>Eens, midden in de middag, dacht ik dat het zover was. Een gestalte glipte de veranda van de herberg op, bleef even stilstaan bij de open deur, keek om zich heen en greep naar de receptiebalie. Mijn hart stond stil. Ik liep veel te snel over de weide, en Sam was al vertrokken vanaf zijn post. Toen draaide de gestalte zich om, en het bleek slechts mevrouw Pelletier van het bestuur van het Genootschap te zijn, die een stapel folders van het lidmaatschap achterliet op de balie waar gasten ze zouden zien. Sam en ik kwamen op precies hetzelfde moment aan, uit tegenovergestelde richtingen, allebei te snel, en keken elkaar boven de folders in de ogen. Mevrouw Pelletier kelk ons verbaasd aan. Ik pakte drie folders mee die ik niet nodig had, Sam zei iets over het weer, en we dropen af. Dat was het dichtst dat de dag bij een confrontatie kwam. Vals alarm. Maar het liet me wel zien hoe strak ik gespannen stond, onder de vioolmuziek vandaan, en hoe dun de grens was tussen de warmte en de angst.</w:t>
+        <w:t xml:space="preserve">Aan de ene kant was ik er gewoon bij, een dorpsbewoonster op het feest van haar dorp, en het was prachtig. Emma Redfern vond me bij de cider en pronkte met haar kostuum, dat ze per se een avond te vroeg aan wilde: een sterrenbeeld, Orion, zwart met zilveren sterren die door de zorgvuldige hand van haar vader op de juiste plek waren genaaid, de riem precies goed. Ze liet me alle sterren opnoemen, en dat deed ik, omdat ik die sterren al heel lang ken. Ze vond het geweldig dat mevrouw Claus haar sterrenbeelden kende. Mark stond ernaast met twee bekers cider en de ingesleten blik van een man die toekijkt hoe zijn dochter luidkeels en midden in een mensenmassa acht jaar oud is. Martha drukte me een paar wanten van de tafel in de handen, de groene, „voor die koude handen van je.” Sam Patel tikte met zijn pet naar me vanaf de overkant van de weide, bij zijn post vlak bij de veranda van de herberg, waar hij de hele dag met zijn ogen gericht op de receptiebalie net binnen de deur was gebleven, zoals ik hem had gevraagd.</w:t>
+      </w:r>
+    </w:p>
+    <w:p>
+      <w:r>
+        <w:t xml:space="preserve">En aan de andere kant, onder alle warmte, was ik ook op mijn hoede. Het tweede briefje had gezegd dat het feest zondag eindigt, en de afperser was hier, ergens in deze mensenmassa, achter een van deze lachende gezichten. Ik kon maar niet ophouden met kijken naar de deur van de herberg en de balie vlak daarbinnen, waar zomaar een derde briefje kon worden achtergelaten tussen het feestgedruis.</w:t>
+      </w:r>
+    </w:p>
+    <w:p>
+      <w:r>
+        <w:t xml:space="preserve">Eens, midden in de middag, dacht ik dat het zover was. Een gestalte glipte de veranda van de herberg op, bleef even stilstaan bij de open deur, keek om zich heen en greep naar de receptiebalie. Mijn hart stond stil. Ik liep veel te snel over de weide, en Sam was al vertrokken vanaf zijn post. Toen draaide de gestalte zich om, en het bleek slechts mevrouw Pelletier van het bestuur van het Genootschap te zijn, die een stapel folders van het lidmaatschap achterliet op de balie waar gasten ze zouden zien. Sam en ik kwamen op precies hetzelfde moment aan, uit tegenovergestelde richtingen, allebei te snel, en keken elkaar boven de folders in de ogen. Mevrouw Pelletier keek ons verbaasd aan. Ik pakte drie folders mee die ik niet nodig had, Sam zei iets over het weer, en we dropen af. Dat was het dichtst dat de dag bij een confrontatie kwam. Vals alarm. Maar het liet me wel zien hoe strak ik gespannen stond, onder de vioolmuziek vandaan, en hoe dun de grens was tussen de warmte en de angst.</w:t>
       </w:r>
     </w:p>
     <w:p>
@@ -3814,7 +3814,7 @@
     </w:p>
     <w:p>
       <w:r>
-        <w:t>Ze knikte, alsof dat een antwoord was dat ze wel vaker hoorde. „Je weet waar het bureau is. De koffie is slecht, maar de deur staat open. Zondags ook.” Ze wees met haar beker naar de veranda van de herberg, waar Pip in een rode sjaal aan het poseren was voor een gezin van vijf. „Jullie pinguïn heeft het Genootschap vandaag meer geld opgeleverd dan de burgemeester in een heel jaar.”</w:t>
+        <w:t xml:space="preserve">Ze knikte, alsof dat een antwoord was dat ze wel vaker hoorde. „Je weet waar het bureau is. De koffie is slecht, maar de deur staat open. Zondags ook.” Ze wees met haar beker naar de veranda van de herberg, waar Pip in een rode sjaal aan het poseren was voor een gezin van vijf. „Je pinguïn heeft het Genootschap vandaag meer geld opgeleverd dan de burgemeester in een heel jaar.”</w:t>
       </w:r>
     </w:p>
     <w:p>
@@ -3829,7 +3829,7 @@
     </w:p>
     <w:p>
       <w:r>
-        <w:t>Ik stond in de vallende sneeuw tussen mijn buren met Pip leunend tegen mijn laars, Emma's gewantde hand die de mijne zocht aan de ene kant en die van Fiona aan de andere kant. Ik keek naar dat alles, de lantaarns, de sneeuw, het gouden licht, de honderd gezichten gericht naar de hemel, en ik begreep, op die diepe manier in je borst voordat je verstand het bijbeent, precies wat er op het spel stond. Geen gebouw. Zelfs geen geheim. Dit. Deze samenkomst, dit dorp dat op zijn allerbest is op een koud en helder dag. Een man had zijn hand uitgestoken vanuit de duisternis om een stuk hiervan te gijzelen, om het te veranderen in een wapen en een angst. Terwijl ik daar in de sneeuw stond, werd mijn geest zo hard en helder als de kou. Wat het mij ook zou kosten, ik zou niet toestaan dat hij zijn grip daarop behield. Ik zou het naar het licht brengen, naar een dag als deze, waar dingen konden genezen.</w:t>
+        <w:t xml:space="preserve">Ik stond in de vallende sneeuw tussen mijn buren met Pip leunend tegen mijn laars, Emma's gewantde hand die de mijne zocht aan de ene kant en die van Fiona aan de andere kant. Ik keek naar dat alles, de lantaarns, de sneeuw, het gouden licht, de honderd gezichten gericht naar de hemel, en ik begreep, op die diepe manier in je borst voordat je verstand het bijbeent, precies wat er op het spel stond. Geen gebouw. Zelfs geen geheim. Dit. Deze samenkomst, dit dorp dat op zijn allerbest is op een koude, heldere dag. Een man had zijn hand uitgestoken vanuit de duisternis om een stuk hiervan te gijzelen, om het te veranderen in een wapen en een angst. Terwijl ik daar in de sneeuw stond, werd mijn geest zo hard en helder als de kou. Wat het mij ook zou kosten, ik zou niet toestaan dat hij zijn grip daarop behield. Ik zou het naar het licht brengen, naar een dag als deze, waar dingen konden genezen.</w:t>
       </w:r>
     </w:p>
     <w:p>
@@ -3849,7 +3849,7 @@
     </w:p>
     <w:p>
       <w:r>
-        <w:t>Ze vroeg niet wat ik met morgen bedoelde. Tegen die tijd was ze het, denk ik, al te weten gekomen. We bleven nog even in de sneeuw staan, ons drieën en de pinguïn te midden van het hele stralende dorp, en lieten de dag zijn wat hij was.</w:t>
+        <w:t xml:space="preserve">Ze vroeg niet wat ik met morgen bedoelde. Tegen die tijd was ze het, denk ik, al gaan vermoeden. We bleven nog even in de sneeuw staan, ons drieën en de pinguïn te midden van het hele stralende dorp, en lieten de dag zijn wat hij was.</w:t>
       </w:r>
     </w:p>
     <w:p>
@@ -3865,7 +3865,7 @@
     <w:p/>
     <w:p>
       <w:r>
-        <w:t>Ik had drie mannen vrijgesproken, en door hen vrij te spreken was ik in een kleine kamer achterbleven met de waarheid die ik juist had proberen te ontlopen door hen te gebruiken.</w:t>
+        <w:t xml:space="preserve">Ik had drie mannen vrijgesproken, en door hen vrij te spreken was ik in een kleine kamer achtergebleven met de waarheid die ik juist had proberen te ontlopen door hen te gebruiken.</w:t>
       </w:r>
     </w:p>
     <w:p/>
@@ -3883,7 +3883,7 @@
         <w:rPr>
           <w:i/>
         </w:rPr>
-        <w:t>the sapphire at its heart</w:t>
+        <w:t xml:space="preserve">De saffier in haar hart</w:t>
       </w:r>
       <w:r>
         <w:t>: vijf woorden, de formulering van een historicus en niet van een dief, die precies zo in de afpersingsbrief stonden als op de kaart in Theo's zorgvuldige, hellende handschrift. Het briefje was geschreven op het crèmekleurige briefpapier van het Genootschap, het zware geribbelde papier dat ik op de receptie van de tentoonstelling had zien liggen. De man die het archief runde, verdronk. Hij had op elke eerlijke deur in drie staten geklopt en ze dicht zien slaan. Hij had voor het hele dorp gestaan om spijtig te verkondigen dat juist de brieven waarin de broche werd beschreven, spoorloos waren verdwenen.</w:t>
@@ -3940,10 +3940,10 @@
         <w:rPr>
           <w:i/>
         </w:rPr>
-        <w:t>I know how your family came by this inn</w:t>
-      </w:r>
-      <w:r>
-        <w:t>, had het eerste briefje gezegd. De diefstal zelf, de broche, de edelsteen, het pandjeshuis in Ridgeline, stond allemaal in de Blackburn-brieven, in Theo's archief. Maar de koop van de herberg, de aankoop uit 1924, het papierspoor van een eigendom dat van hand wisselde, stond in geen enkele Blackburn-brief. Dat was een vastgoaddossier. Een akte.</w:t>
+        <w:t xml:space="preserve">Ik weet hoe je familie aan deze herberg is gekomen</w:t>
+      </w:r>
+      <w:r>
+        <w:t xml:space="preserve">, had het eerste briefje gezegd. De diefstal zelf, de broche, de edelsteen, het pandjeshuis in Ridgeline, stond allemaal in de Blackburn-brieven, in Theo's archief. Maar de koop van de herberg, de aankoop uit 1924, het papierspoor van een eigendom dat van hand wisselde, stond in geen enkele Blackburn-brief. Dat was een vastgoeddossier. Een akte.</w:t>
       </w:r>
     </w:p>
     <w:p/>
@@ -3955,13 +3955,13 @@
     <w:p/>
     <w:p>
       <w:r>
-        <w:t>Ik bleef roerloos in het lamplicht zitten. De diefstal van de broche en de aankoop van de herberg waren twee verschillende geheimen, bewaard in twee verschillende gebouwen. Theo had er daar één van. Hij had het archief, de brieven, de cataloguskaart, het briefpapier. Hij had de diefstal. Maar het bewijs dat gestolen geld deze geliefde herberg was geworden, lag op het gemeentehuis, in de vastgoaddossiers waarvan een stijve, vermoeide vrouw mij recht in de ogen had aangekeken en had gezworen dat ze die nooit las.</w:t>
-      </w:r>
-    </w:p>
-    <w:p/>
-    <w:p>
-      <w:r>
-        <w:t>Één persoon kon die beide helften niet alleen hebben geweten, en Theo kon de briefjes niet naar de herberg hebben gebracht.</w:t>
+        <w:t xml:space="preserve">Ik bleef roerloos in het lamplicht zitten. De diefstal van de broche en de aankoop van de herberg waren twee verschillende geheimen, bewaard in twee verschillende gebouwen. Theo had er één van. Hij had het archief, de brieven, de cataloguskaart, het briefpapier. Hij had de diefstal. Maar het bewijs dat gestolen geld deze geliefde herberg was geworden, lag op het gemeentehuis, in de vastgoeddossiers waarvan een stijve, vermoeide vrouw mij recht in de ogen had aangekeken en had gezworen dat ze die nooit las.</w:t>
+      </w:r>
+    </w:p>
+    <w:p/>
+    <w:p>
+      <w:r>
+        <w:t xml:space="preserve">Eén persoon kon die beide helften niet alleen hebben geweten, en Theo kon de briefjes niet naar de herberg hebben gebracht.</w:t>
       </w:r>
     </w:p>
     <w:p/>
@@ -4026,13 +4026,13 @@
     <w:p/>
     <w:p>
       <w:r>
-        <w:t xml:space="preserve">In Vera's nete draadstalen mandje met stukken die moesten worden opgeborgen, halverwege de kleine stapel, lag een map, en op het getypte tabje van de map stond, in dezelfde oude stijl als de kaartjes in de koperen houders: </w:t>
+        <w:t xml:space="preserve">In Vera's nette draadstalen mandje met stukken die moesten worden opgeborgen, halverwege de kleine stapel, lag een map, en op het getypte tabje van de map stond, in dezelfde oude stijl als de kaartjes in de koperen houders: </w:t>
       </w:r>
       <w:r>
         <w:rPr>
           <w:i/>
         </w:rPr>
-        <w:t>PROPERTY — EVERGREEN AVE — WINTER WONDERLAND INN.</w:t>
+        <w:t xml:space="preserve">VASTGOED — EVERGREEN AVE — WINTER WONDERLAND INN.</w:t>
       </w:r>
     </w:p>
     <w:p/>
@@ -4050,7 +4050,7 @@
     <w:p/>
     <w:p>
       <w:r>
-        <w:t>Toen ze terugkwam met een kopie van de akte van de brink, bedankte ik haar en mompelde wat saaie commissiepraatjes over marktlui en kraampllaatsen. Vervolgens nam ik alle tijd om het papier in mijn tas te vouwen. Ik hield haar in de gaten, en nu ik wist waar ik naar keek, kon ik haar glashelder lezen. Ze was geen harde vrouw. Dat was wat me zo aangreep. Ik had halverwege verwacht, toen ik het eenmaal in zijn geheel overzag, iets kouds en inhaligs aan te treffen onder die vermoeidheid. Er was helemaal niets kouds te bekennen, alleen angst die tot op de botten was versleten, de diepgewortelde angst van iemand die iets heeft gehaald dat veel te groot voor haar is en er elke nacht wakker van ligt. Haar handen beefden toen ze het mandje rechtzette. Er stonden twee vergeten koppen koude koffie op het bureau. Ze zag eruit zoals Fiona er de hele week al had uitgezien, als iemand die werd uitgeknepen, behalve dat zij degene was die aan het knijpen was, en om de een of andere reden maakte dat het alleen maar droeviger.</w:t>
+        <w:t xml:space="preserve">Toen ze terugkwam met een kopie van de akte van de brink, bedankte ik haar en mompelde wat saaie commissiepraatjes over marktlui en standplaatsen. Vervolgens nam ik alle tijd om het papier in mijn tas te vouwen. Ik hield haar in de gaten, en nu ik wist waar ik naar keek, kon ik haar glashelder lezen. Ze was geen harde vrouw. Dat was wat me zo aangreep. Ik had half en half verwacht, toen ik het eenmaal in zijn geheel overzag, iets kouds en inhaligs aan te treffen onder die vermoeidheid. Er was helemaal niets kouds te bekennen, alleen angst die tot op de botten was versleten, de diepgewortelde angst van iemand die iets heeft gedaan dat veel te groot voor haar is en er elke nacht wakker van ligt. Haar handen beefden toen ze het mandje rechtzette. Er stonden twee vergeten koppen koude koffie op het bureau. Ze zag eruit zoals Fiona er de hele week al had uitgezien, als iemand die werd uitgeknepen, behalve dat zij degene was die aan het knijpen was, en om de een of andere reden maakte dat het alleen maar droeviger.</w:t>
       </w:r>
     </w:p>
     <w:p/>
@@ -4068,7 +4068,7 @@
     <w:p/>
     <w:p>
       <w:r>
-        <w:t>Haar ogen waren fel geworden, en het lukte haar niet om ze op te heffen en de mijne te ontmoeten, net zomin als toen er hardop over de oude geschiedenis werd gesproken. Ik begreep, daar staande in mijn jas met de akte van de brink in mijn tas, dat Vera Reed geen schurk was. Ze was een bange vrouw die erin was geluisd door een man die ze vertrouwde, of medelijden mee had, of allebei, en ze zat er inmiddels veel te diep in om er nog uit te klimmen. Ze wist het, en ze sliep geen zucht beter dan de vrouw die ze hielp te gronde te richten.</w:t>
+        <w:t xml:space="preserve">Haar ogen waren vochtig geworden, en het lukte haar niet om ze op te heffen en de mijne te ontmoeten, net zomin als toen er hardop over de oude geschiedenis werd gesproken. Ik begreep, daar staande in mijn jas met de akte van de brink in mijn tas, dat Vera Reed geen schurk was. Ze was een bange vrouw die erin was meegezogen door een man die ze vertrouwde, of medelijden mee had, of allebei, en ze zat er inmiddels veel te diep in om er nog uit te klimmen. Ze wist het, en ze sliep geen zier beter dan de vrouw die ze hielp te gronde te richten.</w:t>
       </w:r>
     </w:p>
     <w:p/>
@@ -4080,7 +4080,7 @@
     <w:p/>
     <w:p>
       <w:r>
-        <w:t>Theo had de diefstal gepleegd. Hij had het gevonden in de brieven van Blackburn, de broche, de steen, de pandjesbaas. Hij had het met zijn zorgvuldige handschrift gecatalogiseerd, de saffier in het hart daarvan, en vervolgens had hij die brieven uit de dossiers getrokken en ze als vermist opgegeven. Maar Theo, die kopje-onder ging, die door het hele dorp in de gaten werd gehouden, die nooit thuis was, kon de rest niet in zijn eentje hebben gedaan. Hij had niet kunnen bevestigen dat de herberg van dat geld was gekocht, want dat bewijs lag niet in zijn gebouw. En hij had de briefjes niet het dorp door kunnen dragen en er in het volle daglicht van een druk festival eentje op een bureau kunnen leggen, want Theo Hussein kon geen stap over Evergreen Avenue zetten zonder dat het opviel.</w:t>
+        <w:t xml:space="preserve">Theo had het geheim van de diefstal. Hij had het gevonden in de brieven van Blackburn, de broche, de steen, het pandjeshuis. Hij had het met zijn zorgvuldige handschrift gecatalogiseerd, de saffier in haar hart, en vervolgens had hij die brieven uit de dossiers getrokken en ze als vermist opgegeven. Maar Theo, die kopje-onder ging, die door het hele dorp in de gaten werd gehouden, die nooit thuis was, kon de rest niet in zijn eentje hebben gedaan. Hij had niet kunnen bevestigen dat de herberg van dat geld was gekocht, want dat bewijs lag niet in zijn gebouw. En hij had de briefjes niet het dorp door kunnen dragen en er in het volle daglicht van een druk festival eentje op een bureau kunnen leggen, want Theo Hussein kon geen stap over Evergreen Avenue zetten zonder dat het opviel.</w:t>
       </w:r>
     </w:p>
     <w:p/>
@@ -4098,7 +4098,7 @@
     <w:p/>
     <w:p>
       <w:r>
-        <w:t>Ik had ze allebei. Na al die angst had dat als een overwinning moeten voelen, maar in plaats daarvan voelde het alsof ik bovenaan een lange heuvel stond waar ik niet naar beneden wilde lopen. Onderaan stonden twee mensen die ik kende en mocht, een vriendin die ze tussen zich in hadden vermorzeld en een heel warm dorp dat misschien iets lelijks moest vernemen over twee van de huns.</w:t>
+        <w:t xml:space="preserve">Ik had ze allebei. Na al die angst had dat als een overwinning moeten voelen, maar in plaats daarvan voelde het alsof ik bovenaan een lange heuvel stond waar ik niet naar beneden wilde lopen. Onderaan stonden twee mensen die ik kende en mocht, een vriendin die ze tussen zich in hadden vermorzeld en een heel warm dorp dat misschien iets lelijks moest vernemen over twee van de hunnen.</w:t>
       </w:r>
     </w:p>
     <w:p/>
@@ -4133,13 +4133,13 @@
     <w:p/>
     <w:p>
       <w:r>
-        <w:t>Het zat zo. Ik wist wie. Ik wist hoe. Ik had het bewijsmateriaal: de cataloguskaart, het gematchte papier bij de lamp gehouden, de eigendomsakte van de herberg die buiten haar la lag. Ik kon dus stilletjes naar Theo en Vera gaan, met z'n drieën, zonder dat iemand anders ervan wist, en zeggen: ik weet het. Stop er nu mee, en hier eindigt het, vannacht, zonder dat iemand er erg in heeft. Nooit meer. En dat zouden ze doen, omdat ze bange mensen waren en geen doorwinterden. Ze zouden huilen van opluchting dat ze ermee wegkwamen. De brieven zouden ophouden en Fiona zou veilig zijn. Het geheim zou teruggaan naar zijn koffer op de zolder. Theo zou zijn genootschap en zijn goede naam behouden, en Vera haar baan. Het stadje hoefde nooit te vernemen dat twee van de hunnen voor één zwaar seizoen op het slechte pad waren geraakt. Iedereen van wie ik hield zou het verdriet bespaard blijven.</w:t>
-      </w:r>
-    </w:p>
-    <w:p/>
-    <w:p>
-      <w:r>
-        <w:t>Geen politie. Geen schandaal. Geen lelijke rubriek in de Gazette. Geen braaf oud man die werd afgevoerd uit het gebouw waaraan hij zijn leven had gewijd. Gewoon een stil woord in het duister, genade, en iedereen gaat naar huis om te slapen.</w:t>
+        <w:t xml:space="preserve">Het zat zo. Ik wist wie. Ik wist hoe. Ik had het bewijsmateriaal: de cataloguskaart, het gematchte papier bij de lamp gehouden, de eigendomsakte van de herberg die buiten haar la lag. Ik kon dus stilletjes naar Theo en Vera gaan, met z'n drieën, zonder dat iemand anders ervan wist, en zeggen: ik weet het. Stop er nu mee, en hier eindigt het, vannacht, zonder dat iemand er erg in heeft. Nooit meer. En dat zouden ze doen, omdat ze bange mensen waren en geen doorwinterden. Ze zouden huilen van opluchting dat ze ermee wegkwamen. De briefjes zouden ophouden en Fiona zou veilig zijn. Het geheim zou teruggaan naar zijn koffer op de zolder. Theo zou zijn Genootschap en zijn goede naam behouden, en Vera haar baan. Het stadje hoefde nooit te vernemen dat twee van de hunnen voor één zwaar seizoen op het slechte pad waren geraakt. Iedereen van wie ik hield zou het verdriet bespaard blijven.</w:t>
+      </w:r>
+    </w:p>
+    <w:p/>
+    <w:p>
+      <w:r>
+        <w:t xml:space="preserve">Geen politie. Geen schandaal. Geen lelijke rubriek in de Gazette. Geen brave oude man die werd afgevoerd uit het gebouw waaraan hij zijn leven had gewijd. Gewoon een stil woord in het duister, genade, en iedereen gaat naar huis om te slapen.</w:t>
       </w:r>
     </w:p>
     <w:p/>
@@ -4157,7 +4157,7 @@
     <w:p/>
     <w:p>
       <w:r>
-        <w:t>Een stil woord in het duister zou elk mens beschermen behalve degene die het het meest moest beschermen. Het zou Fiona niet bevrijden. Het zou alleen veranderen in wiens handen haar geheim lag. Momenteel hield een afperser het vast. Na mijn stille genade zou ik het vasthouden. Nick ook, en Theo en Vera ook, vergeven en vrij, de twee mensen ter wereld die precies wisten hoe ze die zolderkoffer in een fortuin moesten veranderen. Fiona zou de rest van haar leven moeten doorbrengen in de wetenschap dat twee van haar buren ooit hadden geprobeerd losgeld voor haar te vragen en ermee waren weggekomen, en dat op elke slechte avond, in elke wanhopige winter door de jaren heen, opnieuw zouden kunnen proberen. De angst zou niet eindigen. Hij zou alleen stil worden. Ik had tienduizend brieven gelezen op de Pool, en de pijn daarin was maar al te vaak een geheim dat alleen werd meegedragen in het donker.</w:t>
+        <w:t xml:space="preserve">Een stil woord in het duister zou elk mens beschermen behalve degene die het het meest moest beschermen. Het zou Fiona niet bevrijden. Het zou alleen veranderen in wiens handen haar geheim lag. Momenteel hield een afperser het vast. Na mijn stille genade zou ik het vasthouden. Nick ook, en Theo en Vera ook, vergeven en vrij, de twee mensen ter wereld die precies wisten hoe ze die zolderkoffer in een fortuin moesten veranderen. Fiona zou de rest van haar leven moeten doorbrengen in de wetenschap dat twee van haar buren ooit hadden geprobeerd losgeld voor haar te vragen en ermee waren weggekomen, en dat ze het op elke slechte avond, in elke wanhopige winter door de jaren heen, opnieuw zouden kunnen proberen. De angst zou niet eindigen. Hij zou alleen stil worden. Ik had tienduizend brieven gelezen op de Pool, en de pijn daarin was maar al te vaak een geheim dat alleen werd meegedragen in het donker.</w:t>
       </w:r>
     </w:p>
     <w:p/>
@@ -4187,19 +4187,19 @@
     <w:p/>
     <w:p>
       <w:r>
-        <w:t>„Ik kan het niet begraven”, zei ik. „Ik wil het wel. God weet dat ik er vannacht naartoe wil lopen, alles weg wil fluisteren en iedereen zijn leven wil laten behouden. Maar als ik dat doe, houdt Fiona niet op met bang zijn, niet echt. Wordt Theo nooit een man die vergeven kan worden. En het rot blijft beneden in de muur zitten waar ik het niet kan zien, en woekert voort.” Ik drukte de muizen van mijn handen tegen mijn ogen. „Het vriendelijke en het gemakkelijke zijn niet dezelfde. Het moet aan het licht komen. Alles. Goed en wel. Met Noriko Tanaka. Met de wet erbij, zachtjes toegepast, met genade, maar wel toegepast. Dat is de enige manier waarop Fiona er ooit vrij van wegbeweegt, en de enige manier waarop Theo ooit iets anders mag zijn dan een man met een misdaad onder zijn vloerdelen.”</w:t>
-      </w:r>
-    </w:p>
-    <w:p/>
-    <w:p>
-      <w:r>
-        <w:t>„Dat is de moeilijkste weg”, zei Nick zachtjes. „Voor jou nog het meest. Het stadje zal rouwen, Jess, en sommigen van hen zullen wensen dat je het met rust had gelaten, en jij bent degene die het verdriet over hen hebt afgeroepen. Ze zullen weten dat jij het was.”</w:t>
-      </w:r>
-    </w:p>
-    <w:p/>
-    <w:p>
-      <w:r>
-        <w:t>Daar was hij dan, de laatste angst, de kleinste van allemaal en het meest volstrekt de mijne. Ik was nog altijd half een vreemdeling in dit stadje. Al de anderen kenden elkaar al sinds ze kinderen waren en leerden lopen op dezelfde trottoirs, en ik had mijn plekje er duim voor duim veroverd, een ovenschotel hier, een hond zoeken daar, een aangeschoven stoel bij de breiclub. Theo Hussein naar het licht slepen kon me een deel van die zwaarbevochten duim kosten. Mensen houden niet altijd van degene die de harde, waarachtige dingen vertelt. Ik kon exact het juiste doen en voorgoed de buitenstaander zijn die een goed man brak en het stadje verdriet bezorgde.</w:t>
+        <w:t xml:space="preserve">„Ik kan het niet begraven”, zei ik. „Ik wil het wel. God weet dat ik er vannacht naartoe wil lopen, alles weg wil fluisteren en iedereen zijn leven wil laten behouden. Maar als ik dat doe, houdt Fiona niet op met bang zijn, niet echt. Wordt Theo nooit een man die vergeven kan worden. En het rot blijft beneden in de muur zitten waar ik het niet kan zien, en woekert voort.” Ik drukte de muizen van mijn handen tegen mijn ogen. „Het vriendelijke en het gemakkelijke zijn niet hetzelfde. Het moet aan het licht komen. Alles. Goed en wel. Met Noriko Tanaka. Met de wet erbij, zachtjes toegepast, met genade, maar wel toegepast. Dat is de enige manier waarop Fiona er ooit vrij van wegbeweegt, en de enige manier waarop Theo ooit iets anders mag zijn dan een man met een misdaad onder zijn vloerdelen.”</w:t>
+      </w:r>
+    </w:p>
+    <w:p/>
+    <w:p>
+      <w:r>
+        <w:t xml:space="preserve">„Dat is de moeilijkste weg”, zei Nick zachtjes. „Voor jou nog het meest. Het stadje zal rouwen, Jess, en sommigen van hen zullen wensen dat je het met rust had gelaten, en jij bent degene die het verdriet over hen heeft afgeroepen. Ze zullen weten dat jij het was.”</w:t>
+      </w:r>
+    </w:p>
+    <w:p/>
+    <w:p>
+      <w:r>
+        <w:t xml:space="preserve">Daar was hij dan, de laatste angst, de kleinste van allemaal en het meest volstrekt de mijne. Ik was nog altijd half een vreemdeling in dit stadje. Al de anderen kenden elkaar al sinds ze kinderen waren en leerden lopen op dezelfde trottoirs, en ik had mijn plekje er stukje bij beetje veroverd, een ovenschotel hier, een hond zoeken daar, een aangeschoven stoel bij de breiclub. Theo Hussein naar het licht slepen kon me een deel van dat zwaarbevochten plekje kosten. Mensen houden niet altijd van degene die de harde, waarachtige dingen vertelt. Ik kon exact het juiste doen en voorgoed de buitenstaander zijn die een goed man brak en het stadje verdriet bezorgde.</w:t>
       </w:r>
     </w:p>
     <w:p/>
@@ -4223,7 +4223,7 @@
     <w:p/>
     <w:p>
       <w:r>
-        <w:t>Nick leunde naar voren en pakte mijn hand. Zijn ogen waren tegelijk trots en bedroefd. „Dan vinden we die samen”, zei hij. „En Jess. Wat het je ook kost bij het stadje, uiteindelijk. Jij zult niet de buitenstaander zijn die een goed man brak. Jij zult degene zijn die genoeg van deze plek hield om haar te helen. Sommigen van hen zullen dat een tijdje niet inzien. Maar ik zie het. En de mensen om wie het geeft komen er wel.”</w:t>
+        <w:t xml:space="preserve">Nick leunde naar voren en pakte mijn hand. Zijn ogen waren tegelijk trots en bedroefd. „Dan vinden we die samen”, zei hij. „En Jess. Wat het je ook kost bij het stadje, uiteindelijk. Jij zult niet de buitenstaander zijn die een goed man brak. Jij zult degene zijn die genoeg van deze plek hield om haar te helen. Sommigen van hen zullen dat een tijdje niet inzien. Maar ik zie het. En de mensen om wie het gaat komen er wel.”</w:t>
       </w:r>
     </w:p>
     <w:p/>
@@ -4270,13 +4270,13 @@
     <w:p/>
     <w:p>
       <w:r>
-        <w:t>Er ontspande zich toen iets in haar, achter die professionele onverschilligheid. Noriko Tanaka hield het grootste deel van de werkdag een warm hart in een afgesloten la verborgen, en ik had haar zojuist verteld dat ze dat er voor deze keer mocht uithalen.</w:t>
-      </w:r>
-    </w:p>
-    <w:p/>
-    <w:p>
-      <w:r>
-        <w:t>„Er is een manier”, zei ze. „Er is bijna altijd een manier, wanneer de betrokken mensen geen monsters zijn, en naar alles wat je me hebt verteld, zijn deze twee geen monsters. Het is een wanhopige man en een bange vrouw die iets slechts hebben gedaan om redenen waarvan ze zichzelf er meer dan voor de helft van hadden overtuigd dat ze goed waren.” Ze legde de pen neer. „Dit is wat ik niet ga doen. Ik ga geen deur intrappen en Theo Hussein midden in het festival voor de ogen van het hele dorp handboeien omdoen. Daar is niemand bij gebaat, dat is nergens voor nodig, en ik doe niet zoiets wreeds wanneer iets goeds zal werken.” Ze keek me vastberaden aan over het bureau. „Dit is wat ik wel ga doen. Ik geef hem de kans om de verantwoordelijkheid te nemen, met mij in de kamer, zodat het wettelijk en gedocumenteerd is. Als hij er vrijelijk voor uitkomt en het goedmaakt, met schadevergoeding en een echte verantwoording, dan is er ruimte om dit te laten eindigen in iets anders dan de ondergang. We noemen dat herstelrecht. Het herstelt wat het kan in plaats van alleen te breken wat er nog over is. Maar het werkt alleen als het oprecht is, Jessica. Als hij liegt of zich er via een achterdeur uit probeert te praten, dan loopt het via de harde weg, en dat is zijn keuze, niet de mijne en niet de jouwe.”</w:t>
+        <w:t xml:space="preserve">Er ontspande zich toen iets in haar, achter die professionele zakelijkheid. Noriko Tanaka hield het grootste deel van de werkdag een warm hart in een afgesloten la verborgen, en ik had haar zojuist verteld dat ze dat er voor deze keer mocht uithalen.</w:t>
+      </w:r>
+    </w:p>
+    <w:p/>
+    <w:p>
+      <w:r>
+        <w:t xml:space="preserve">„Er is een manier”, zei ze. „Er is bijna altijd een manier, wanneer de betrokken mensen geen monsters zijn, en naar alles wat je me hebt verteld, zijn deze twee geen monsters. Het is een wanhopige man en een bange vrouw die iets slechts hebben gedaan om redenen waarvan ze zichzelf al meer dan half hadden overtuigd dat ze goed waren.” Ze legde de pen neer. „Dit is wat ik niet ga doen. Ik ga geen deur intrappen en Theo Hussein midden in het festival voor de ogen van het hele dorp handboeien omdoen. Daar is niemand bij gebaat, dat is nergens voor nodig, en ik doe niet zoiets wreeds wanneer iets vriendelijkers ook werkt.” Ze keek me vastberaden aan over het bureau. „Dit is wat ik wel ga doen. Ik geef hem de kans om de verantwoordelijkheid te nemen, met mij in de kamer, zodat het wettelijk en gedocumenteerd is. Als hij er vrijelijk voor uitkomt en het goedmaakt, met schadevergoeding en een echte verantwoording, dan is er ruimte om dit te laten eindigen in iets anders dan de ondergang. We noemen dat herstelrecht. Het herstelt wat het kan in plaats van alleen te breken wat er nog over is. Maar het werkt alleen als het oprecht is, Jessica. Als hij liegt of zich er via een achterdeur uit probeert te praten, dan loopt het via de harde weg, en dat is zijn keuze, niet de mijne en niet de jouwe.”</w:t>
       </w:r>
     </w:p>
     <w:p/>
@@ -4294,7 +4294,7 @@
     <w:p/>
     <w:p>
       <w:r>
-        <w:t>Het was juist. Het was zoveel beter dan de val die ik me half had ingebeeld, een nacht met lokgeld, ingehouden adem en iemands hand die uit het donker reikte. Er zou hier helemaal geen donker aan te pas komen. We zouden het 's middags in een warme kamer doen, met genade in onze handen en de hoofdinspecteur van politie aan onze zijde, en we zouden een goede man die op het padje was geraakt de eenvoudige waardigheid geven om het recht op zijn eigen twee benen onder ogen te zien.</w:t>
+        <w:t xml:space="preserve">Het was juist. Het was zoveel beter dan de val die ik me half had ingebeeld, een nacht met lokgeld, ingehouden adem en iemands hand die uit het donker reikte. Er zou hier helemaal geen donker aan te pas komen. We zouden het 's middags in een warme kamer doen, met genade in onze handen en de hoofdinspecteur van politie aan onze zijde, en we zouden een goede man die op het slechte pad was geraakt de eenvoudige waardigheid geven om het recht op zijn eigen twee benen onder ogen te zien.</w:t>
       </w:r>
     </w:p>
     <w:p/>
@@ -4306,7 +4306,7 @@
     <w:p/>
     <w:p>
       <w:r>
-        <w:t>Ik vertelde haar alles. Wie en hoe, en dat het de twee samen waren. Ik zag hoe het binnenkwam, het verdriet ervan, dat het Theo was, dat het Vera was, mensen bij wie ze had gegeten en met wie ze aan haar tafels had gelachen. En toen gaf ik haar Neils map en vertelde ik haar het andere, het ding dat de hele vorm van de zaak veranderde.</w:t>
+        <w:t xml:space="preserve">Ik vertelde haar alles. Wie en hoe, en dat het de twee samen waren. Ik zag hoe het binnenkwam, het verdriet ervan, dat het Theo was, dat het Vera was, mensen die ze te eten had gegeven en met wie ze aan haar tafels had gelachen. En toen gaf ik haar Neils map en vertelde ik haar het andere, het ding dat de hele vorm van de zaak veranderde.</w:t>
       </w:r>
     </w:p>
     <w:p/>
@@ -4342,7 +4342,7 @@
     <w:p/>
     <w:p>
       <w:r>
-        <w:t>„In de kamer zijn”, zei ik. „Als je het kunt verdragen. Niet om iemand te beschuldigen. Gewoon om er te zijn, zodat Theo moet kijken naar het gezicht van de vriend die hij probeerde te kwetsen, en zodat jij ophoudt degene te zijn die daar alleen in het donker mee achterblijft. Je hoeft geen enkel woord te zeggen als je dat niet wilt. Maar het is jouw verhaal, Fiona, meer dan dat van wie dan ook. Jij hoort erbij te zijn wanneer het eindelijk aan het licht komt.”</w:t>
+        <w:t xml:space="preserve">„In de kamer zijn”, zei ik. „Als je het kunt verdragen. Niet om iemand te beschuldigen. Gewoon om er te zijn, zodat Theo moet kijken naar het gezicht van de vriendin die hij probeerde te kwetsen, en zodat jij ophoudt degene te zijn die daar alleen in het donker mee achterblijft. Je hoeft geen enkel woord te zeggen als je dat niet wilt. Maar het is jouw verhaal, Fiona, meer dan dat van wie dan ook. Jij hoort erbij te zijn wanneer het eindelijk aan het licht komt.”</w:t>
       </w:r>
     </w:p>
     <w:p/>
@@ -4371,13 +4371,13 @@
     <w:p/>
     <w:p>
       <w:r>
-        <w:t>We deden het op de laatste middag van het festival, in Fiona's kleine zitkamer, terwijl de geluiden van een kermis op zijn retour door het raam naar binnen waaiden: een kind dat klaagde dat het naar huis wilde, het geschraap van schraagtafels die op de weide werden ingeklapt. Noriko had Theo gevraagd te komen om te praten over wat ze een zaak van het Genootschap had genoemd, en Vera gevraagd te komen voor wat ze een boodschap van het burgemeestershuis noemde. Dus kwamen ze allebei een paar minuten na elkaar, afzonderlijk van elkaar, zonder dat de een wist dat de ander zou komen.</w:t>
-      </w:r>
-    </w:p>
-    <w:p/>
-    <w:p>
-      <w:r>
-        <w:t>Ik keek toe vanuit mijn stoel in de hoek. Pip had zich daaronder genesteld en hield voor de verandering haar meningen voor zichzelf. Vera kwam als eerste binnen en had nog geen twee stappen gezet voordat ze zag dat Theo daar al zat. Ze nam mij in zich op, Fiona bleke en rechtop bij het raam, en het hoofd van de politie aan de andere kant van de kamer met haar versleten notitieboekje open op haar schoot. Ze begreep het. De kleur trok in één keer uit haar gezicht, als water uit een omgegooid glas.</w:t>
+        <w:t xml:space="preserve">We deden het op de laatste middag van het festival, in Fiona's kleine zitkamer, terwijl de geluiden van een kermis op zijn retour door het raam naar binnen waaiden: een kind dat klaagde dat het naar huis wilde, het geschraap van schraagtafels die op de weide werden ingeklapt. Noriko had Theo gevraagd te komen om te praten over wat ze een zaak van het Genootschap had genoemd, en Vera gevraagd te komen voor wat ze een boodschap van het burgemeesterskantoor noemde. Dus kwamen ze allebei een paar minuten na elkaar, afzonderlijk van elkaar, zonder dat de een wist dat de ander zou komen.</w:t>
+      </w:r>
+    </w:p>
+    <w:p/>
+    <w:p>
+      <w:r>
+        <w:t xml:space="preserve">Ik keek toe vanuit mijn stoel in de hoek. Pip had zich daaronder genesteld en hield voor de verandering haar meningen voor zichzelf. Vera kwam als eerste binnen en had nog geen twee stappen gezet voordat ze zag dat Theo daar al zat. Ze nam mij in zich op, Fiona bleek en rechtop bij het raam, en het hoofd van de politie aan de andere kant van de kamer met haar versleten notitieboekje open op haar schoot. Ze begreep het. De kleur trok in één keer uit haar gezicht, als water uit een omgegooid glas.</w:t>
       </w:r>
     </w:p>
     <w:p/>
@@ -4407,7 +4407,7 @@
     <w:p/>
     <w:p>
       <w:r>
-        <w:t xml:space="preserve">„Theo,” zei ik. „De afpersingsbrieven aan Fiona zijn geschreven op het papier van het Genootschap. Het zware crème papier met de scheprand. Ik heb het vezel voor vezel vergeleken met een vel uit jouw voorraad.” Hij deinsde terug, maar ik ging door, standvastig. „En daarin wordt de broche omschreven als </w:t>
+        <w:t xml:space="preserve">„Theo,” zei ik. „De afpersingsbrieven aan Fiona zijn geschreven op het papier van het Genootschap. Het zware crèmekleurige papier met de scheplijnen. Ik heb het vezel voor vezel vergeleken met een vel uit jouw voorraad.” Hij deinsde terug, maar ik ging door, standvastig. „En daarin wordt de broche omschreven als </w:t>
       </w:r>
       <w:r>
         <w:t>&lt;bt&gt;</w:t>
@@ -4449,7 +4449,7 @@
     <w:p/>
     <w:p>
       <w:r>
-        <w:t>„Vera,” zei ik. „Theo heeft de diefstal gepleegd. Maar de briefjes wisten dat de herberg was gekocht met het geld van de broche, en dat heeft nooit in een Blackburn-brief gestaan. Dat is een eigendomsregister. Een akte. En de akte van deze herberg lag gisterochtend buiten haar la in je herindelingsmand, aangeraakt, op het bureau van een vrouw die me twee keer had verteld dat ze nooit de dossiers achter zich leest.” Ik hield mijn stem zacht. „Hij pleegde de diefstal. Jij had de akte. En jij had de benen, Vera. Hij had deze stad niet onopgemerkt kunnen doorkruisen om zijn leven te redden, iedereen kent Theo, iedereen houdt hem staande. Maar niemand blikt of plankt als de secretaresse van de burgemeester tijdens het festival even langskomt bij de herberg. Ik kwam je die ochtend zelf op de trappen tegen, met je parkeerkaarten. Hij had dit niet in zijn eentje gekund. Hij had iemand nodig die zich onopgemerkt door de stad kon bewegen. Dat was jij.”</w:t>
+        <w:t xml:space="preserve">„Vera,” zei ik. „Theo wist van de diefstal. Maar de briefjes wisten dat de herberg was gekocht met het geld van de broche, en dat heeft nooit in een Blackburn-brief gestaan. Dat is een eigendomsregister. Een akte. En de akte van deze herberg lag gisterochtend buiten haar la in je opbergmand, aangeraakt, op het bureau van een vrouw die me twee keer had verteld dat ze nooit de dossiers achter zich leest.” Ik hield mijn stem zacht. „Hij had de helft over de diefstal. Jij had de akte. En jij had de benen, Vera. Hij had deze stad niet onopgemerkt kunnen doorkruisen om zijn leven te redden, iedereen kent Theo, iedereen houdt hem staande. Maar niemand kijkt op als de secretaresse van de burgemeester tijdens het festival even langskomt bij de herberg. Ik kwam je die ochtend zelf op de trappen tegen, met je parkeerkaarten. Hij had dit niet in zijn eentje gekund. Hij had iemand nodig die zich onopgemerkt door de stad kon bewegen. Dat was jij.”</w:t>
       </w:r>
     </w:p>
     <w:p/>
@@ -4461,13 +4461,13 @@
     <w:p/>
     <w:p>
       <w:r>
-        <w:t>„Hij is naar mij toe gekomen,” zei ze. „Weken geleden. Half buiten zinnen, pratend over het Genootschap, over hoe hij dit had gevonden en het niet alleen kon doen. En ik had nee moeten zeggen. Ik weet dat ik nee had moeten zeggen, dat wist ik toen al.” Ze wiegde een beetje heen en weer, haar armen strak om haar heen geslagen. „Maar ik loop zo vreselijk achter, mevrouw Claus. De burgemeester betaalt me niets en laat me tot op het bot afbeulen, en ik heb schulden waarvan je het bestaan niet zou geloven, van dat soort waarvan je niet kunt slapen, en Theo zei dat het geld was dat in de eerste plaats was gestolen, van een rijke familie honderd jaar geleden, en dat het het Genootschap zou redden, en dat een stukje daarvan naar mij zou gaan, en dat ik eindelijk van dat juk verlost zou zijn. Hij liet het bijna nobel klinken. Daar is hij goed in, iets laten klinken als geschiedenis in plaats van een misdaad. En ik wilde zo graag van dat juk verlost zijn dat ik het zo liet klinken, omdat ik het wilde geloven.” Ze keek Fiona aan, aangeslagen. „Ik heb nooit aan jou gedacht als mens. Dat is het ergste eraan, dat is wat ik mee zal dragen. Ik dacht alleen aan het geld en het niet-slapen. Het spijt me. Het spijt me zo, Fiona.”</w:t>
-      </w:r>
-    </w:p>
-    <w:p/>
-    <w:p>
-      <w:r>
-        <w:t>De kamer werd stil daarna, op het gehuil en de verre geluiden van het festival dat daarbuiten werd opgeruimd na. Twee mensen die iets wreeds hadden gedaan om redenen die ze in mooie woorden hadden gehuld tot ze niet meer konden zien wat eronder zat, zaten nu te midden van de wrakstukken, namen er eindelijk de verantwoordelijkheid voor, hardop. Er was geen val dichtgeklapt. Niemand had naar hen gegrepen vanuit het duisternis. We hadden het open en bloot uitgestald in een warme kamer in het middaglicht en hun de kans gegeven om eerlijk te zijn. Ze hadden die gegrepen, omdat de meeste mensen, precies zoals Noriko al zei, het grondig beu zijn om het met zich mee te dragen.</w:t>
+        <w:t xml:space="preserve">„Hij is naar mij toe gekomen,” zei ze. „Weken geleden. Half buiten zinnen, pratend over het Genootschap, over hoe hij dit had gevonden en het niet alleen kon doen. En ik had nee moeten zeggen. Ik weet dat ik nee had moeten zeggen, dat wist ik toen al.” Ze wiegde een beetje heen en weer, haar armen strak om haar heen geslagen. „Maar ik loop zo vreselijk achter, mevrouw Claus. De burgemeester betaalt me niets en laat me tot op het bot afbeulen, en ik heb schulden waarvan je het bestaan niet zou geloven, van dat soort waarvan je niet kunt slapen, en Theo zei dat het geld was dat in de eerste plaats was gestolen, van een rijke familie honderd jaar geleden, en dat het het Genootschap zou redden, en dat een stukje daarvan naar mij zou gaan, en dat ik eindelijk van dat juk verlost zou zijn. Hij liet het bijna nobel klinken. Daar is hij goed in, iets laten klinken als geschiedenis in plaats van een misdaad. En ik wilde zo graag van dat juk verlost zijn dat ik het hem zo liet brengen, omdat ik het wilde geloven.” Ze keek Fiona aan, aangeslagen. „Ik heb nooit aan jou gedacht als mens. Dat is het ergste eraan, dat is wat ik mee zal dragen. Ik dacht alleen aan het geld en het niet-slapen. Het spijt me. Het spijt me zo, Fiona.”</w:t>
+      </w:r>
+    </w:p>
+    <w:p/>
+    <w:p>
+      <w:r>
+        <w:t xml:space="preserve">De kamer werd stil daarna, op het gehuil en de verre geluiden van het festival dat daarbuiten werd opgeruimd na. Twee mensen die iets wreeds hadden gedaan om redenen die ze in mooie woorden hadden gehuld tot ze niet meer konden zien wat eronder zat, zaten nu te midden van de wrakstukken, namen er eindelijk de verantwoordelijkheid voor, hardop. Er was geen val dichtgeklapt. Niemand had naar hen gegrepen vanuit de duisternis. We hadden het open en bloot uitgestald in een warme kamer in het middaglicht en hun de kans gegeven om eerlijk te zijn. Ze hadden die gegrepen, omdat de meeste mensen, precies zoals Noriko al zei, het grondig beu zijn om het met zich mee te dragen.</w:t>
       </w:r>
     </w:p>
     <w:p/>
@@ -4496,13 +4496,13 @@
     <w:p/>
     <w:p>
       <w:r>
-        <w:t>Noriko pakte het tegelijkertijd volgens het boekje en vanuit het hart aan. Er kwam geen stilletjes onder het tapijt vegen, geen laten-we-dit-aljeblieft-vergeten, geen gefingeerde verontwaardiging alsof een misdrijf geen misdrijf was geweest. Zowel Theo als Vera legde een volledige, uitgeschreven en ondertekende verklaring af van alles wat ze hadden gedaan, netjes op volgorde, zonder enige verzachting. De twee brieven werden bewijsmateriaal, gelabeld en gearchiveerd. Het stond nu zwart-op-wit en officieel dat twee burgers van Frost Falls hadden geprobeerd een derde een half miljoen dollar af te troggelen.</w:t>
-      </w:r>
-    </w:p>
-    <w:p/>
-    <w:p>
-      <w:r>
-        <w:t>Beiden hadden het direct ruiterlijk bekend zodra ernaar werd gevraagd, geen van beiden had een strafblad, en de vrouw die ze hadden benadeeld vroeg om herstel in plaats van ondergang. Dus bouwde Noriko hun een pad dat noch een cel in de gevangenis noch een vrijgeleide was.</w:t>
+        <w:t xml:space="preserve">Noriko pakte het tegelijkertijd volgens het boekje en vanuit het hart aan. Er kwam geen stilletjes onder het tapijt vegen, geen laten-we-dit-alsjeblieft-vergeten, geen gedoe alsof een misdrijf geen misdrijf was geweest. Zowel Theo als Vera legde een volledige, uitgeschreven en ondertekende verklaring af van alles wat ze hadden gedaan, netjes op volgorde, zonder enige verzachting. De twee briefjes werden bewijsmateriaal, gelabeld en gearchiveerd. Het stond nu zwart-op-wit en officieel dat twee burgers van Frost Falls hadden geprobeerd een derde een half miljoen dollar af te troggelen.</w:t>
+      </w:r>
+    </w:p>
+    <w:p/>
+    <w:p>
+      <w:r>
+        <w:t xml:space="preserve">Beiden hadden het direct ruiterlijk bekend zodra ernaar werd gevraagd, geen van beiden had een strafblad, en de vrouw die ze hadden benadeeld vroeg om herstel in plaats van ondergang. Dus bouwde Noriko hun een pad dat noch een cel in de gevangenis noch gratie was.</w:t>
       </w:r>
     </w:p>
     <w:p/>
@@ -4532,13 +4532,13 @@
     <w:p/>
     <w:p>
       <w:r>
-        <w:t>Hij trad af. Niet voor even, om later stilletjes weer op zijn stoel gezet te worden zodra de woede van het stadje was bekoeld. Hij legde zijn functie als voorzitter van het Frost Falls Historical Society neer, en het bestuur nam dat ontslag, nu alles bekend was, volledig serieus. Je kon als man geen buurman proberen af te persen met behulp van de collectie en het briefpapier van het Genootschap, om vervolgens de sleutels van de tent te behouden.</w:t>
-      </w:r>
-    </w:p>
-    <w:p/>
-    <w:p>
-      <w:r>
-        <w:t>Maar ze stootten hem niet uit. Ze deden niet alsof een man die al dertig jaar van de geschiedenis van dit stadje hield, daar nooit van had gehouden. Noriko, het bestuur en Fiona — die alle recht van de wereld had gehad om zijn kop te eisen en dat naliet — bouwden in plaats daarvan een deur waar hij op een dag weer doorheen kon lopen, over jaren, desnoods op zijn knieën als het moest. Hij mocht vrijwilliger worden bij het Genootschap. Onder toezicht. Het meest vernederende werk verrichten dat er bestond, repareren en sorteren, de geduldige taakjes waar je nooit dank voor krijgt. Niet de baas over iets. Niet te vertrouwen met de sleutels. Alleen langzaam, met kleine stapjes, toegelaten om terug te verdienen wat hij zelf had weggegooid. Als hij zich over een voldoende lange periode bewees, zou het stadje dat zien. Zo niet, dan lag dat aan hemzelf.</w:t>
+        <w:t xml:space="preserve">Hij trad af. Niet voor even, om later stilletjes weer op zijn stoel gezet te worden zodra de woede van het stadje was bekoeld. Hij legde zijn functie als voorzitter van het Historisch Genootschap van Frost Falls neer, en het bestuur nam dat ontslag, nu alles bekend was, volledig serieus. Je kon als man geen buurman proberen af te persen met behulp van de collectie en het briefpapier van het Genootschap, om vervolgens de sleutels van de tent te behouden.</w:t>
+      </w:r>
+    </w:p>
+    <w:p/>
+    <w:p>
+      <w:r>
+        <w:t xml:space="preserve">Maar ze stootten hem niet uit. Ze deden niet alsof een man die al dertig jaar van de geschiedenis van dit stadje hield, daar nooit van had gehouden. Noriko, het bestuur en Fiona — die alle recht van de wereld had gehad om zijn kop te eisen en dat naliet — bouwden in plaats daarvan een deur waar hij op een dag weer doorheen kon lopen, over jaren, desnoods op zijn knieën als het moest. Hij mocht vrijwilliger worden bij het Genootschap. Onder toezicht. Het nederigste werk verrichten dat er bestond, repareren en sorteren, de geduldige taakjes waar je nooit dank voor krijgt. Niet de baas over iets. Niet te vertrouwen met de sleutels. Alleen langzaam, met kleine stapjes, toegelaten om terug te verdienen wat hij zelf had weggegooid. Als hij zich over een voldoende lange periode bewees, zou het stadje dat zien. Zo niet, dan lag dat aan hemzelf.</w:t>
       </w:r>
     </w:p>
     <w:p/>
@@ -4550,7 +4550,7 @@
     <w:p/>
     <w:p>
       <w:r>
-        <w:t>„Het is precies wat je verdient,” zei Fiona tegen hem, en in haar vriendelijkheid klonk een staalharde vastberadenheid door. „Namelijk de kans om iemand te worden die zoiets nooit in zijn hoofd zou hebben gehaald. Je krijgt niet de makkelijke weg, Theo, waarop iedereen je een knuffel geeft en alles met Kerstmis is vergeven. Je krijgt de werkelijkheid. Je mag het jarenlang terugverdienen en elk jaar daarvan voelen. Ik ben niet wreed tegen je. Ik geloof dat je het kunt. Ik zou niet de moeite nemen om een pad voor je te bouwen als ik dacht dat je het niet aankon.”</w:t>
+        <w:t xml:space="preserve">„Het is precies wat je verdient,” zei Fiona tegen hem, en in haar vriendelijkheid klonk een staalharde vastberadenheid door. „Namelijk de kans om iemand te worden die zoiets nooit in zijn hoofd zou hebben gehaald. Je krijgt niet de makkelijke weg, Theo, waarop iedereen je een knuffel geeft en alles met Kerstmis is vergeten. Je krijgt de werkelijkheid. Je mag het jarenlang terugverdienen en elk jaar daarvan voelen. Ik ben niet wreed tegen je. Ik geloof dat je het kunt. Ik zou niet de moeite nemen om een pad voor je te bouwen als ik dacht dat je het niet aankon.”</w:t>
       </w:r>
     </w:p>
     <w:p/>
@@ -4580,7 +4580,7 @@
     <w:p/>
     <w:p>
       <w:r>
-        <w:t>Fiona was vrij. De brieven waren opgehouden. Het geheim was uit de duisternis gehaald, en in het licht had het geen tanden meer. Twee mensen die de weg kwijt waren geraakt, keken de werkelijkheid nu recht in de ogen en begonnen, heel voorzichtig begonnen, aan de lange weg terug naar zichzelf.</w:t>
+        <w:t xml:space="preserve">Fiona was vrij. De briefjes waren opgehouden. Het geheim was uit de duisternis gehaald, en in het licht had het geen tanden meer. Twee mensen die de weg kwijt waren geraakt, keken de werkelijkheid nu recht in de ogen en begonnen, heel voorzichtig begonnen, aan de lange weg terug naar zichzelf.</w:t>
       </w:r>
     </w:p>
     <w:p/>
@@ -4592,7 +4592,7 @@
     <w:p/>
     <w:p>
       <w:r>
-        <w:t>Datgene wat hij had verpest om te redden, gleed nog steeds af. En nu hij weg was, moest het op de juiste manier worden gered, door het stadje zelf, voor zichzelf. Anders zou het helemaal niet gered worden.</w:t>
+        <w:t xml:space="preserve">Datgene wat hij op de verkeerde manier had willen redden, gleed nog steeds af. En nu hij weg was, moest het op de juiste manier worden gered, door het stadje zelf, voor zichzelf. Anders zou het helemaal niet gered worden.</w:t>
       </w:r>
     </w:p>
     <w:p>
@@ -4608,12 +4608,12 @@
     </w:p>
     <w:p>
       <w:r>
-        <w:t>Ze hadden het natuurlijk gehoord. Zoiets bleef in Frost Falls geen ochtend langer stil. De gepolijste, vriendelijke Worthingtons hadden uit het gefluister over het festival en de stilte in de herberg begrepen dat de Historische Vereniging in diepe problemen zat en dat die problemen een goed mens naar een slecht pad hadden gedreven. Meneer Worthington vond mij op de ochtend van hun vertrek op de veranda van de herberg, zijn vrouw naast hem in haar crèmekleurige kasjmier met haar goede jas over haar arm, en hij kwam direct ter zake met het gemak van een man voor wie geld nooit een moeilijk onderwerp was geweest om aan te snijden.</w:t>
-      </w:r>
-    </w:p>
-    <w:p>
-      <w:r>
-        <w:t>„Mevrouw Claus”, zei hij. „We zijn in de weken dat we hier waren erg gesteld geraakt op dit stadje. Oprecht gesteld. En we begrijpen dat de Historische Vereniging in ernstige financiële nood verkeert. Ernstige nood, naar we horen.” Hij glimlachte, warm en zelfverzekerd. „Wij zijn in de positie om te helpen. Royaal. Genoeg om de hele kwestie in één klap te regelen, het dak, de verwarmingsketel, en daarnaast een endowment om de boel voor een generatie veilig te stellen. Ik zou met alle plezier de cheque uitschrijven voor we vanochtend weggaan. Het zou ons heel weinig kosten en hier heel veel betekenen, en eerlijk gezegd, na alle ellende denk ik dat het stadje wel wat goed nieuws kan gebruiken om het seizoen mee af te sluiten.”</w:t>
+        <w:t xml:space="preserve">Ze hadden het natuurlijk gehoord. Zoiets bleef in Frost Falls geen ochtend langer stil. De gepolijste, vriendelijke Worthingtons hadden uit het gefluister over het festival en de stilte in de herberg begrepen dat het Historisch Genootschap in diepe problemen zat en dat die problemen een goed mens op een slecht pad hadden gedreven. Meneer Worthington vond mij op de ochtend van hun vertrek op de veranda van de herberg, zijn vrouw naast hem in haar crèmekleurige kasjmier met haar goede jas over haar arm, en hij kwam direct ter zake met het gemak van een man voor wie geld nooit een moeilijk onderwerp was geweest om aan te snijden.</w:t>
+      </w:r>
+    </w:p>
+    <w:p>
+      <w:r>
+        <w:t xml:space="preserve">„Mevrouw Claus”, zei hij. „We zijn in de weken dat we hier waren erg gesteld geraakt op dit stadje. Oprecht gesteld. En we begrijpen dat het Historisch Genootschap in ernstige financiële nood verkeert. Ernstige nood, naar we horen.” Hij glimlachte, warm en zelfverzekerd. „Wij zijn in de positie om te helpen. Royaal. Genoeg om de hele kwestie in één klap te regelen, het dak, de verwarmingsketel, en daarnaast een fonds om de boel voor een generatie veilig te stellen. Ik zou met alle plezier de cheque uitschrijven voor we vanochtend weggaan. Het zou ons heel weinig kosten en hier heel veel betekenen, en eerlijk gezegd, na alle ellende denk ik dat het stadje wel wat goed nieuws kan gebruiken om het seizoen mee af te sluiten.”</w:t>
       </w:r>
     </w:p>
     <w:p>
@@ -4623,7 +4623,7 @@
     </w:p>
     <w:p>
       <w:r>
-        <w:t>Het was een vriendelijk aanbod, welgemeend uit een warm hart. Het zou ook hebben gewerkt, op die beperkte manier. Eén cheque, en de geldproblemen van de Vereniging zouden verdwenen zijn, precies de problemen die Theo half krankzinnig hadden gemaakt om te doen wat hij had gedaan. Een deel van mij, moe staand op die koude veranda, wilde het met beide handen aanpakken en er een punt achter zetten.</w:t>
+        <w:t xml:space="preserve">Het was een vriendelijk aanbod, welgemeend uit een warm hart. Het zou ook hebben gewerkt, op die beperkte manier. Eén cheque, en de geldproblemen van het Genootschap zouden verdwenen zijn, precies de problemen die Theo half krankzinnig hadden gemaakt om te doen wat hij had gedaan. Een deel van mij, moe staand op die koude veranda, wilde het met beide handen aanpakken en er een punt achter zetten.</w:t>
       </w:r>
     </w:p>
     <w:p>
@@ -4643,17 +4643,17 @@
     </w:p>
     <w:p>
       <w:r>
-        <w:t>„In dit stadje is net iets naars gebeurd”, zei ik, „omdat één goed mens besloot dat het redden van de Vereniging alles rechtvaardigde, dat een redding een misstap waard was, dat het doel de middelen zou heiligen. Nou. Als de Vereniging volgende week wordt gered door het chequeboekje van een langskomende vreemdeling, hoe vriendelijk ook, dan is de les die het hele stadje stilletjes leert dat Theo in elk geval op één punt gelijk had. Namelijk dat het voortbestaan van het gebouw iets is dat van buiten komt, door geld, door een kortere route, door een weldoener, en niet iets wat het stadje zelf wil, waarvoor het moet werken en dat het moet verdienen.” Ik schudde mijn hoofd. „Een Vereniging die gered wordt door een gulle gast is slechts uitgesteld, meneer Worthington. Over vijf jaar zit ze in hetzelfde schuitje, wachtend tot de volgende rijke bezoeker een zwak krijgt voor de dekens. De enige manier waarop de plek ooit echt veilig is, is als Frost Falls zelf beslist dat ze het waard is om gered te worden, en haar redt met eigen handen, uit eigen zak, hoe krap die ook is. Dat gaat langzamer. Het is een stuk moeilijker. Maar het is de versie die beklijft, en die heelt wat hier zojuist is gebeurd in plaats van er een vrolijke poster overheen te plakken.”</w:t>
-      </w:r>
-    </w:p>
-    <w:p>
-      <w:r>
-        <w:t>Meneer Worthington keek me een lang moment aan, en het pleitte voor hem dat zijn gezicht veranderde, van puzzel naar een soort respect. „U slaat een hoop geld af, mevrouw Claus.”</w:t>
-      </w:r>
-    </w:p>
-    <w:p>
-      <w:r>
-        <w:t>„Ik sla een redding af”, zei ik. „Niet uw vriendelijkheid, nooit dat. En dit is wat ik u in plaats daarvan zou willen vragen, als u het meent. Laat het stadje het eerst proberen. Laat het bake-sales en gênante kleine loterijen houden en zelf ontdekken wat het over heeft voor zijn eigen herinnering. En als het dan tekortschiet, als Frost Falls alles doet wat het kan en het nog steeds net niet haalt, kom dan terug. Wees de laatste steen in de brug, niet de hele brug. Laat het stadje het grootste deel zelf bouwen. Op die manier is de brug van henzelf.”</w:t>
+        <w:t xml:space="preserve">„In dit stadje is net iets naars gebeurd”, zei ik, „omdat één goed mens besloot dat het redden van het Genootschap alles rechtvaardigde, dat een redding een misstap waard was, dat het doel de middelen zou heiligen. Nou. Als het Genootschap volgende week wordt gered door het chequeboekje van een langskomende vreemdeling, hoe vriendelijk ook, dan is de les die het hele stadje stilletjes leert dat Theo in elk geval op één punt gelijk had. Namelijk dat het voortbestaan van het gebouw iets is dat van buiten komt, door geld, door een kortere route, door een weldoener, en niet iets wat het stadje zelf wil, waarvoor het moet werken en dat het moet verdienen.” Ik schudde mijn hoofd. „Een Genootschap dat gered wordt door een gulle gast is slechts uitgesteld, meneer Worthington. Over vijf jaar zit het in hetzelfde schuitje, wachtend tot de volgende rijke bezoeker een zwak krijgt voor de quilts. De enige manier waarop de plek ooit echt veilig is, is als Frost Falls zelf beslist dat ze het waard is om gered te worden, en haar redt met eigen handen, uit eigen zak, hoe krap die ook is. Dat gaat langzamer. Het is een stuk moeilijker. Maar het is de versie die beklijft, en die heelt wat hier zojuist is gebeurd in plaats van er een vrolijke poster overheen te plakken.”</w:t>
+      </w:r>
+    </w:p>
+    <w:p>
+      <w:r>
+        <w:t xml:space="preserve">Meneer Worthington keek me een lang moment aan, en het pleitte voor hem dat zijn gezicht veranderde, van verbazing naar een soort respect. „U slaat een hoop geld af, mevrouw Claus.”</w:t>
+      </w:r>
+    </w:p>
+    <w:p>
+      <w:r>
+        <w:t xml:space="preserve">„Ik sla een redding af”, zei ik. „Niet uw vriendelijkheid, nooit dat. En dit is wat ik u in plaats daarvan zou willen vragen, als u het meent. Laat het stadje het eerst proberen. Laat het koekjesverkopen en gênante kleine loterijen houden en zelf ontdekken wat het over heeft voor zijn eigen herinnering. En als het dan tekortschiet, als Frost Falls alles doet wat het kan en het nog steeds net niet haalt, kom dan terug. Wees de laatste steen in de brug, niet de hele brug. Laat het stadje het grootste deel zelf bouwen. Op die manier is de brug van henzelf.”</w:t>
       </w:r>
     </w:p>
     <w:p>
@@ -4663,22 +4663,22 @@
     </w:p>
     <w:p>
       <w:r>
-        <w:t>Dus zo lieten ze het. Geen cheque. Wel een belofte, achter de hand gehouden voor nood. En de Vereniging bleef precies waar ze was geweest, op het randje, met een lekkend dak en een afstervende ketel, alleen nu zonder dat zelfs maar Theo overbleef om ervoor te vechten, wat de situatie nog haperender maakte dan voorheen, niet minder.</w:t>
-      </w:r>
-    </w:p>
-    <w:p>
-      <w:r>
-        <w:t>Het voelde niet als een overwinning toen ik naar huis liep. Ik had net een aardig mens gepraat van het oplossen van het enige concrete probleem dat aan de basis lag van de hele trieste affaire, en er waren een paar koude straten op die wandeling dat ik me afvroeg of ik wijs was geweest of alleen maar koppig, of ik een echt goed doel had laten schieten omwille van een principe dat nog geen druppel regen uit de achterkamer zou tegenhouden.</w:t>
-      </w:r>
-    </w:p>
-    <w:p>
-      <w:r>
-        <w:t>Maar ik bleef terugkeren naar hetzelfde punt. Het stadje moest dit zelf doen. Dat zou het werk van de hele winter zijn, misschien langer: bake-sales, loterijen en de trage, koppige vrijgevigheid van een kleine gemeenschap die dollar voor dollar besloot dat haar verleden het behouden waard was. Het zou een nipte race worden. Misschien zou het helemaal niet lukken.</w:t>
-      </w:r>
-    </w:p>
-    <w:p>
-      <w:r>
-        <w:t>De afrekening was achter de rug. Het helingsproces van de mensen was begonnen. Maar de Vereniging bungelde nog steeds aan een zijden draadje, en we zouden erachter komen waar Frost Falls uit was opgetrokken wanneer het erop aankwam.</w:t>
+        <w:t xml:space="preserve">Dus zo lieten ze het. Geen cheque. Wel een belofte, achter de hand gehouden voor nood. En het Genootschap bleef precies waar het was geweest, op het randje, met een lekkend dak en een afstervende ketel, alleen nu zonder dat zelfs maar Theo overbleef om ervoor te vechten, wat de situatie nog wankeler maakte dan voorheen, niet minder.</w:t>
+      </w:r>
+    </w:p>
+    <w:p>
+      <w:r>
+        <w:t xml:space="preserve">Het voelde niet als een overwinning toen ik naar huis liep. Ik had net een aardig mens het oplossen van het enige concrete probleem dat aan de basis lag van de hele trieste affaire uit het hoofd gepraat, en er waren een paar koude straten op die wandeling dat ik me afvroeg of ik wijs was geweest of alleen maar koppig, of ik een echt goed doel had laten schieten omwille van een principe dat nog geen druppel regen uit de achterkamer zou tegenhouden.</w:t>
+      </w:r>
+    </w:p>
+    <w:p>
+      <w:r>
+        <w:t xml:space="preserve">Maar ik bleef terugkeren naar hetzelfde punt. Het stadje moest dit zelf doen. Dat zou het werk van de hele winter zijn, misschien langer: koekjesverkopen, loterijen en de trage, koppige vrijgevigheid van een kleine gemeenschap die dollar voor dollar besloot dat haar verleden het behouden waard was. Het zou een nipte race worden. Misschien zou het helemaal niet lukken.</w:t>
+      </w:r>
+    </w:p>
+    <w:p>
+      <w:r>
+        <w:t xml:space="preserve">De afrekening was achter de rug. Het helingsproces van de mensen was begonnen. Maar het Genootschap bungelde nog steeds aan een zijden draadje, en we zouden erachter komen waar Frost Falls uit was opgetrokken wanneer het erop aankwam.</w:t>
       </w:r>
     </w:p>
     <w:p>
@@ -4741,7 +4741,7 @@
     <w:p/>
     <w:p>
       <w:r>
-        <w:t>„Constance Okafor stal in een poging haar moeder te redden,” zei ze, „en bouwde een huis dat dit dorp sindsdien al honderd jaar warm heeft gehouden. Als iemand in Frost Falls om een broche de eerste steen naar haar wil gooien, dan mogen ze die mooi eerst naar mij gooien, want ik kende dat soort armoede toen ik een meisje was, echte armoede, en de helft van de grootmoeders van de mensen die hier in deze winkel zitten ook. Laat haar met rust. Laat Fiona rechtop staan. Het is een goed verhaal. Er zit alleen een zwaar stuk in het midden.”</w:t>
+        <w:t xml:space="preserve">„Constance Okafor stal in een poging haar moeder te redden,” zei ze, „en bouwde een huis dat dit dorp sindsdien al honderd jaar warm heeft gehouden. Als iemand in Frost Falls om een broche de eerste steen naar haar wil gooien, dan mogen ze die mooi eerst naar mij gooien, want ik kende dat soort armoede toen ik een meisje was, echte armoede, en de helft van de grootmoeders van de mensen die hier in deze winkel zitten ook. Laat haar rusten. Laat Fiona rechtop staan. Het is een goed verhaal. Er zit alleen een zwaar stuk in het midden.”</w:t>
       </w:r>
     </w:p>
     <w:p/>
@@ -4759,7 +4759,7 @@
     <w:p/>
     <w:p>
       <w:r>
-        <w:t>Ik had me erop ingesteld de buitenstaander te worden die een goed man ten val bracht. Ik had meer dan ten dele verwacht dat het dorp kil zou worden naar mij toe, dat ze zouden wensen dat ik me er niet mee had bemoeid, dat ze zich zouden herinneren, telkens als ze naar me keken, dat ik degene was die Theo Hussein in het licht had geslepen en de boel overhoop had gehaald. En dat was er hier en daar ook wel even, een poosje. Een paar mensen die me niet recht in de ogen konden aankijken, die wat stilletjes werden als ik een winkel binnenkwam. Ik begreep het en liet het rusten. Ik drong nergens op aan.</w:t>
+        <w:t xml:space="preserve">Ik had me erop ingesteld de buitenstaander te worden die een goed man ten val bracht. Ik had meer dan ten dele verwacht dat het dorp kil zou worden naar mij toe, dat ze zouden wensen dat ik me er niet mee had bemoeid, dat ze zich zouden herinneren, telkens als ze naar me keken, dat ik degene was die Theo Hussein in het licht had gesleept en de boel overhoop had gehaald. En dat was er hier en daar ook wel even, een poosje. Een paar mensen die me niet recht in de ogen konden aankijken, die wat stilletjes werden als ik een winkel binnenkwam. Ik begreep het en liet het rusten. Ik drong nergens op aan.</w:t>
       </w:r>
     </w:p>
     <w:p/>
@@ -4771,7 +4771,7 @@
     <w:p/>
     <w:p>
       <w:r>
-        <w:t>En Martha. Martha greep op een grauwe middag in de breiclub mijn hand, hield hem vast en zei: „Weet je nog, een tijdje geleden, dat ik tegen je zei dat je dingen niet alleen hoeft te dragen? Dat een kring er is om op te steunen?” Ik zei dat ik me dat goed herinnerde. „Nou,” zei ze, „jij ging je gang en bewees dat je een van ons bent, door dat op die manier te dragen. Je steunde niet alleen op de kring toen je het nodig had. Jíj was de kring, voor Fiona, toen ze niemand anders had. Een buitenstaander doet zoiets niet, Jessica. Eén van ons wel.” En ze klopte me eens op de hand en ging meteen weer verder met haar want, alsof ze me niet zojuist volledig van my stuk had gebracht waar ik zat.</w:t>
+        <w:t xml:space="preserve">En Martha. Martha greep op een grauwe middag in de breiclub mijn hand, hield hem vast en zei: „Weet je nog, een tijdje geleden, dat ik tegen je zei dat je dingen niet alleen hoeft te dragen? Dat een kring er is om op te steunen?” Ik zei dat ik me dat goed herinnerde. „Nou,” zei ze, „jij ging je gang en bewees dat je een van ons bent, door dat op die manier te dragen. Je steunde niet alleen op de kring toen je het nodig had. Jíj was de kring, voor Fiona, toen ze niemand anders had. Een buitenstaander doet zoiets niet, Jessica. Eén van ons wel.” En ze klopte me eens op de hand en ging meteen weer verder met haar want, alsof ze me niet zojuist volledig van mijn stuk had gebracht waar ik zat.</w:t>
       </w:r>
     </w:p>
     <w:p/>
@@ -4794,7 +4794,7 @@
     <w:p/>
     <w:p>
       <w:r>
-        <w:t>Het Genootschap kon na Theo wel wat orde op zaken stellen, dus de vriendengroep en een goede helft van Evergreen Avenue kwamen de volgende dagen opdagen om het archief weer op orde te brengen.</w:t>
+        <w:t xml:space="preserve">Het Genootschap kon na Theo wel wat orde op zaken stellen, dus de kring en een goede helft van Evergreen Avenue kwamen de volgende dagen opdagen om het archief weer op orde te brengen.</w:t>
       </w:r>
     </w:p>
     <w:p>
@@ -4820,17 +4820,17 @@
     </w:p>
     <w:p>
       <w:r>
-        <w:t>„De tijdcapsule,” zei Olivia zacht. „Theo heeft er zijn haar uit het hoofd getrokken. Elk archiefstuk dat hij had, zei simpelweg dat hij op de brink was begraven, en de brink is vier hectare groot. Hij ligt onder de iep. Hij heeft er de hele tijd al gelegen.”</w:t>
-      </w:r>
-    </w:p>
-    <w:p>
-      <w:r>
-        <w:t>Binnen een uur stond de halve helft van Frost Falls op de brink rond de grote iep met schoppen en lantaarns, in een ingehouden, ademloze stilte zoals ik die nooit eerder had meegemaakt in dit luidruchtige en vriendelijke stadje.</w:t>
-      </w:r>
-    </w:p>
-    <w:p>
-      <w:r>
-        <w:t>Sam Patel deed het graafwerk, omdat Sam het zware, eerlijke werk deed en dat graag deed. We stonden allemaal om hem heen in het goud van de lantaarns en de aaneengeregen lichtjes, onze adem die in de kou samenvloeide. Emma Redfern hield mijn hand aan de ene kant vast en Pip leunde warm tegen mijn laars aan de andere. Sneeuwbal droeg zijn gewei-muts. Mark stond achter zijn dochter met zijn handen op haar schouders. De hele vriendengroep was aanwezig, en Neil Carter eveneens, die langer was gebleven dan hij van plan was geweest en achteraan stond met zijn notitieboekje deze keer opgeborgen in zijn zak. Toen Sams schop iets raakte dat dof, massief en van metaal klonk, bracht de hele brink samen één enkel geluid voort, een zacht, verbaasd oh dat in de koude lucht bleef hangen.</w:t>
+        <w:t xml:space="preserve">„De tijdcapsule,” zei Olivia zacht. „Theo heeft er zijn haar uit het hoofd getrokken. Elk archiefstuk dat hij had, zei simpelweg dat hij op de brink was begraven, en de brink is zo'n anderhalve hectare groot. Hij ligt onder de iep. Hij heeft er de hele tijd al gelegen.”</w:t>
+      </w:r>
+    </w:p>
+    <w:p>
+      <w:r>
+        <w:t xml:space="preserve">Binnen een uur stond half Frost Falls op de brink rond de grote iep met schoppen en lantaarns, in een ingehouden, ademloze stilte zoals ik die nooit eerder had meegemaakt in dit luidruchtige en vriendelijke stadje.</w:t>
+      </w:r>
+    </w:p>
+    <w:p>
+      <w:r>
+        <w:t xml:space="preserve">Sam Patel deed het graafwerk, omdat Sam het zware, eerlijke werk deed en dat graag deed. We stonden allemaal om hem heen in het goud van de lantaarns en de aaneengeregen lichtjes, onze adem die in de kou samenvloeide. Emma Redfern hield mijn hand aan de ene kant vast en Pip leunde warm tegen mijn laars aan de andere. Sneeuwbal droeg zijn gewei-muts. Mark stond achter zijn dochter met zijn handen op haar schouders. De hele kring was aanwezig, en Neil Carter eveneens, die langer was gebleven dan hij van plan was geweest en achteraan stond met zijn notitieboekje deze keer opgeborgen in zijn zak. Toen Sams schop iets raakte dat dof, massief en van metaal klonk, bracht de hele brink samen één enkel geluid voort, een zacht, verbaasd oh dat in de koude lucht bleef hangen.</w:t>
       </w:r>
     </w:p>
     <w:p>
@@ -4840,7 +4840,7 @@
     </w:p>
     <w:p>
       <w:r>
-        <w:t>„Niet openen,” zei Noriko, voordat iemands handen erbij konden komen, en ze zei het vriendelijk maar beslist, de agente en de wijze vrouw allebei tegelijk. „Niet vanavond, niet op deze manier, in het donker met schoppen en iedereen die het koud heeft. Hij ligt er al honderd jaar. Hij kan wachten tot het nieuwe jaar en goed worden geopend. We doen het zoals het hoort. Het hele stadje, bij daglicht.” Ze ving mijn blik op over het lantaarnlicht heen en hield hem vast. „Met Theo erbij.”</w:t>
+        <w:t xml:space="preserve">„Niet openen,” zei Noriko, voordat iemands handen erbij konden komen, en ze zei het vriendelijk maar beslist, de politiechef en de wijze vrouw allebei tegelijk. „Niet vanavond, niet op deze manier, in het donker met schoppen en iedereen die het koud heeft. Hij ligt er al honderd jaar. Hij kan wachten tot het nieuwe jaar en goed worden geopend. We doen het zoals het hoort. Het hele stadje, bij daglicht.” Ze ving mijn blik op over het lantaarnlicht heen en hield hem vast. „Met Theo erbij.”</w:t>
       </w:r>
     </w:p>
     <w:p>
@@ -4865,7 +4865,7 @@
     </w:p>
     <w:p>
       <w:r>
-        <w:t>Een ogenblik later kwam Bram al hijgend over de brink rennen terwijl hij zijn pet uitkneep, en achter hem kwam, hoe kan het ook anders, een rendier aangerend. Dancer dit keer, die weer uit de paddock was uitgebroken en de lantaarns naar het stadje had gevolgd. Ze stond midden op de brink met rijp glinsterend op haar gewei, met een milde, onthaaste belangstelling het opgegraven koperen kistje te observeren terwijl honderd stadgenoten stonden te staren en één klein meisje luid gilde van pure vreugde.</w:t>
+        <w:t xml:space="preserve">Een ogenblik later kwam Bram al hijgend over de brink rennen terwijl hij zijn pet uitkneep, en achter hem kwam, hoe kan het ook anders, een rendier aangerend. Dancer dit keer, die weer uit de weide was uitgebroken en de lantaarns naar het stadje had gevolgd. Ze stond midden op de brink met rijp glinsterend op haar gewei, met een milde, onthaaste belangstelling het opgegraven koperen kistje te observeren terwijl honderd stadgenoten stonden te staren en één klein meisje luid gilde van pure vreugde.</w:t>
       </w:r>
     </w:p>
     <w:p>
@@ -4880,7 +4880,7 @@
     </w:p>
     <w:p>
       <w:r>
-        <w:t>Ik stond daar op de brink en keek om me heen naar dit alles: de iep en de gouden lichtjes, het groene koperen kistje, het rendier, het lachende kind en het hele stadje dat dicht bijeenkwam in het lantaarnlicht. Pip was onder Dancers neus gaan staan en trakteerde het rendier op een lange, strenge blik, alsof ze wilde herinneren wiens pinguïn dit was. Nicks hand vond de mijne. Voorbij de paddock bevond zich de haard die hij voor de magie had gebouwd, en ik vroeg me af hoeveel meer daarvan zou rondzweven tegen de tijd dat we thuiskwamen.</w:t>
+        <w:t xml:space="preserve">Ik stond daar op de brink en keek om me heen naar dit alles: de iep en de gouden lichtjes, het groene koperen kistje, het rendier, het lachende kind en het hele stadje dat dicht bijeenkwam in het lantaarnlicht. Pip was onder Dancers neus gaan staan en trakteerde het rendier op een lange, strenge blik, alsof ze wilde herinneren wiens pinguïn dit was. Nicks hand vond de mijne. Voorbij de weide bevond zich de haard die hij voor de magie had gebouwd, en ik vroeg me af hoeveel meer daarvan zou rondzweven tegen de tijd dat we thuiskwamen.</w:t>
       </w:r>
     </w:p>
     <w:p>
@@ -4907,7 +4907,7 @@
     <w:p/>
     <w:p>
       <w:r>
-        <w:t>Ik wandelde op een avond die week met Emma en Snowball naar huis, met Pip voor ons uit waggelde en Mark naast me. Emma kletste de gehele weg, zoals ze tegenwoordig deed, over de koperen kist en wat daarin zou kunnen zitten. Munten, dacht ze. Of een brief. Of een schat, een echte schat, goud, hoopte ze, en zou het hele stadje mogen komen kijken, en mocht ze vooraan staan als ze die opkroegen, want ze was er immers bij geweest toen hij uit de grond werd gehaald en dat moest toch wel wat tellen, of niet?</w:t>
+        <w:t xml:space="preserve">Ik wandelde op een avond die week met Emma en Snowball naar huis, met Pip die voor ons uit waggelde en Mark naast me. Emma kletste de gehele weg, zoals ze tegenwoordig deed, over de koperen kist en wat daarin zou kunnen zitten. Munten, dacht ze. Of een brief. Of een schat, een echte schat, goud, hoopte ze, en zou het hele stadje mogen komen kijken, en mocht ze vooraan staan als ze hem openmaakten, want ze was er immers bij geweest toen hij uit de grond werd gehaald en dat moest toch wel wat tellen, of niet?</w:t>
       </w:r>
     </w:p>
     <w:p/>
@@ -4925,7 +4925,7 @@
     <w:p/>
     <w:p>
       <w:r>
-        <w:t>„Ze is tot het nieuwe jaar niet te harden,” zei hij. „Omdat ze wil dat hij opengegaan is. Omdat ze elke ochtend vraagt of het inmiddels al nieuwjaar is.”</w:t>
+        <w:t xml:space="preserve">„Ze is tot het nieuwe jaar niet te harden,” zei hij. „Ze wil dat hij opengaat. Ze vraagt elke ochtend of het inmiddels al nieuwjaar is.”</w:t>
       </w:r>
     </w:p>
     <w:p/>
@@ -4937,7 +4937,7 @@
     <w:p/>
     <w:p>
       <w:r>
-        <w:t>„Het is me opgevallen.” Zijn stem sloeg een beetje ruw uit en hij zei niets meer.</w:t>
+        <w:t xml:space="preserve">„Het is me opgevallen.” Zijn stem werd een beetje schor en hij zei niets meer.</w:t>
       </w:r>
     </w:p>
     <w:p/>
@@ -4955,7 +4955,7 @@
     <w:p/>
     <w:p>
       <w:r>
-        <w:t>De hulst zat erin, het takje van de pompoen, staand in een laagje water van een centimeter. De drie blaadjes waren donker en glanzend en de bessen net zo rood als op de middag dat hij tevoorschijn kwam.</w:t>
+        <w:t xml:space="preserve">De hulst zat erin, het takje van de pompoen, staand in een laagje water van een paar centimeter. De drie blaadjes waren donker en glanzend en de bessen net zo rood als op de middag dat hij tevoorschijn kwam.</w:t>
       </w:r>
     </w:p>
     <w:p/>
@@ -4985,7 +4985,7 @@
     <w:p/>
     <w:p>
       <w:r>
-        <w:t>Ik zag Theo die week nog een keer. Hij was in het Genootschap, in het achterste kamertje, bezig met het herstellen van een oude, gescheurde kaart – het meest nederige werk dat hij ooit had gekregen, en hij was er zichtbaar dankbaar voor. Hij had me niet binnen horen komen. Toen hij opkeek, richtte hij zich op en schrok terug, als een man die verwachtte dat hem precies zou worden ingewreven wie hij was.</w:t>
+        <w:t xml:space="preserve">Ik zag Theo die week nog een keer. Hij was in het Genootschap, in het achterste kamertje, bezig met het herstellen van een oude, gescheurde kaart – het meest nederige werk dat hij ooit had gekregen, en hij was er zichtbaar dankbaar voor. Hij had me niet binnen horen komen. Toen hij opkeek, richtte hij zich op en zette zich schrap, als een man die verwachtte dat hem precies zou worden ingewreven wie hij was.</w:t>
       </w:r>
     </w:p>
     <w:p/>
@@ -5003,7 +5003,7 @@
     <w:p/>
     <w:p>
       <w:r>
-        <w:t>„Het is het enige dat ze me laten doen,” zei hij, en toen snel, voordat ik kon antwoorden: „En terecht ook. Ik klaag er niet over. Het is zoveel meer dan ik mezelf zou hebben toevertrouwd in hun schoenen.” Hij streek het oude papier met twee vingers glad. „Ze gaan de capsule openmaken in het nieuwe jaar. Heb je het gehoord? Noriko zegt dat ik erbij mag zijn. Om toe te kijken.” Zijn ogen schoten vol. Hij knipperde heftig met zijn ogen en boog zich dieper over de kaart. „Ik verdien het niet om daarbij te zijn. Maar ze zegt dat ik mag kijken. Na alles mag ik in de ruimte staan wanneer het stadje zijn hart opent. Ik denk er elke dag aan. Het is voor een groot deel wat me op de been houdt, als ik eerlijk ben.”</w:t>
+        <w:t xml:space="preserve">„Het is het enige dat ze me laten doen,” zei hij, en toen snel, voordat ik kon antwoorden: „En terecht ook. Ik klaag er niet over. Het is zoveel meer dan ik mezelf zou hebben gegund als ik in hun schoenen stond.” Hij streek het oude papier met twee vingers glad. „Ze gaan de capsule openmaken in het nieuwe jaar. Heb je het gehoord? Noriko zegt dat ik erbij mag zijn. Om toe te kijken.” Zijn ogen schoten vol. Hij knipperde heftig met zijn ogen en boog zich dieper over de kaart. „Ik verdien het niet om daarbij te zijn. Maar ze zegt dat ik mag kijken. Na alles mag ik in de ruimte staan wanneer het stadje zijn hart opent. Ik denk er elke dag aan. Het is voor een groot deel wat me op de been houdt, als ik eerlijk ben.”</w:t>
       </w:r>
     </w:p>
     <w:p/>
@@ -5021,7 +5021,7 @@
     <w:p/>
     <w:p>
       <w:r>
-        <w:t>Nick stond op me te wachten toen ik thuiskwam. Hij pakte mijn hand bij de deur en leidde me zwijgend over het koude erf naar het werkhuis, waarna hij de deur opende. De haard die hij had gemetseld gloeide in het midden van de ruimte, de ronde keien warm en goudkleurig, en de magie hing boven het lege rooster in trage cirkels. Er was er meer van dan eerst.</w:t>
+        <w:t xml:space="preserve">Nick stond op me te wachten toen ik thuiskwam. Hij pakte mijn hand bij de deur en leidde me zwijgend over het koude erf naar de werkplaats, waarna hij de deur opende. De haard die hij had gemetseld gloeide in het midden van de ruimte, de ronde keien warm en goudkleurig, en de magie hing boven het lege rooster in trage cirkels. Er was er meer van dan eerst.</w:t>
       </w:r>
     </w:p>
     <w:p/>
@@ -5063,7 +5063,7 @@
     <w:p/>
     <w:p>
       <w:r>
-        <w:t>Samen stapten we naar binnen, weg uit de gouden nacht. Pip was ons allebei te slim af bij de keukendeur en stond daar te eisen dat ze werd binnengelaten in de warmte, en achter ons, aan de overkant van het erf, bleef de haard in het werkhuis gloeien.</w:t>
+        <w:t xml:space="preserve">Samen stapten we naar binnen, weg uit de gouden nacht. Pip was ons allebei te slim af bij de keukendeur en stond daar te eisen dat ze werd binnengelaten in de warmte, en achter ons, aan de overkant van het erf, bleef de haard in de werkplaats gloeien.</w:t>
       </w:r>
     </w:p>
     <w:p/>
@@ -5084,13 +5084,13 @@
     <w:p/>
     <w:p>
       <w:r>
-        <w:t>Wat is de volgende stap?</w:t>
-      </w:r>
-    </w:p>
-    <w:p/>
-    <w:p>
-      <w:r>
-        <w:t>Greta bakte al veertig jaar lang dezelfde kaneelrol. Ze had hem gebakken op de ochtend na de begrafenis van haar man omdat ze geen raad wiste met haar handen. Deze week komt hij zuur uit de oven, net als de volgende bakbeurt, en die daarna ook.</w:t>
+        <w:t xml:space="preserve">Wat komt er hierna?</w:t>
+      </w:r>
+    </w:p>
+    <w:p/>
+    <w:p>
+      <w:r>
+        <w:t xml:space="preserve">Greta bakte al veertig jaar lang dezelfde kaneelrol. Ze had hem gebakken op de ochtend na de begrafenis van haar man omdat ze geen raad wist met haar handen. Deze week komt hij zuur uit de oven, net als de volgende bakbeurt, en die daarna ook.</w:t>
       </w:r>
     </w:p>
     <w:p/>
@@ -5108,7 +5108,7 @@
     <w:p/>
     <w:p>
       <w:r>
-        <w:t>Het stadje grijpt naar de makkelijke verdachten: de slager die de laadperronpoort op slot deed, het gezin dat achterliep met de stookolie, een verveelde jongen met een gestolen spuitbus. Jessica grijpt naar het puzzelstukje dat klopt — want wie dit ook deed, die kende de dosis van het poeder, wist het middel te vinden en diende een klacht in waarin de gezondheidswet tot op de subparagraaf werd aangehaald. Dat is geen woede-uitbarsting. Dat is een vakman.</w:t>
+        <w:t xml:space="preserve">Het stadje grijpt naar de makkelijke verdachten: de slager die de laadperronpoort op slot deed, het gezin dat achterliep met de stookolie, een verveelde jongen met een gestolen spuitbus. Jessica grijpt naar het puzzelstukje dat klopt — want wie dit ook deed, die kocht het poeder, kende de dosis en diende een klacht in waarin de gezondheidswet tot op de subparagraaf werd aangehaald. Dat is geen woede-uitbarsting. Dat is een vakman.</w:t>
       </w:r>
     </w:p>
     <w:p/>
@@ -5150,7 +5150,7 @@
     <w:p/>
     <w:p>
       <w:r>
-        <w:t xml:space="preserve">Elke vrouw in de kring had haar eigen balsemtakjes meegenomen en ik had de Noordpoolse manier meegenomen om ze te binden, waarvan Olivia had gezworen dat ze die voor Kerstmis van me zou jatten. Ik bevestigde het draad langzaam aan het frame, zodat iedereen kon meekijken. Pas toen pakte ik de eerste handvol balsem. De geur kwam koud en groen omhoog, scherp genoeg om je hoofd helder te maken. Hij vulde de voorkamer van </w:t>
+        <w:t xml:space="preserve">Elke vrouw in de kring had haar eigen balsemtakjes meegenomen en ik had de Noordpoolse manier meegenomen om ze te binden, waarvan Olivia had gezworen dat ze die voor Kerstmis van me zou jatten. Ik bevestigde de draad langzaam aan het frame, zodat iedereen kon meekijken. Pas toen pakte ik de eerste handvol balsem. De geur kwam koud en groen omhoog, scherp genoeg om je hoofd helder te maken. Hij vulde de voorkamer van </w:t>
       </w:r>
       <w:r>
         <w:t>&lt;bt&gt;</w:t>
@@ -5210,7 +5210,7 @@
     <w:p/>
     <w:p>
       <w:r>
-        <w:t>Dot slaakte haar korte, droge lachje vanuit de overkant van de kring, zonder op te kijken van haar eigen krans, die al half zo groot was als die van de anderen en tweemaal zo dik. „Ze aast al op je truc sinds de dag dat je binnenstapte. Op die van mij aasde ze in negentienhonderdlzoveel.” Dot was stevig en grijs en zei heel veel in heel weinig woorden. Ze maakte al tientallen jaren kransen in die winkel. Dat was aan haar handen te zien. Die stonden nooit stil en misten nooit een handeling.</w:t>
+        <w:t xml:space="preserve">Dot slaakte haar korte, droge lachje vanuit de overkant van de kring, zonder op te kijken van haar eigen krans, die al anderhalf keer zo groot was als die van de anderen en tweemaal zo dik. „Ze aast al op je truc sinds de dag dat je binnenstapte. Op die van mij aasde ze in negentienhonderdtachtig-en-nog-wat.” Dot was stevig en grijs en zei heel veel in heel weinig woorden. Ze maakte al tientallen jaren kransen in die winkel. Dat was aan haar handen te zien. Die stonden nooit stil en misten nooit een handeling.</w:t>
       </w:r>
     </w:p>
     <w:p/>
@@ -5228,7 +5228,7 @@
     <w:p/>
     <w:p>
       <w:r>
-        <w:t>„Nou is de truc met de dennenappels,” zei ik terwijl ik er een omhoog hield, „dat je er draad omheen wikkelt voor je ze erin steekt, anders vallen ze rond Nieuwjaar zo bij je eruit en vind je tot in de lente nog gouden appels in de bank — Pip. Pip, ik zie je. Dat is niet voor jou.”</w:t>
+        <w:t xml:space="preserve">„Nou is de truc met de dennenappels,” zei ik terwijl ik er een omhoog hield, „dat je er draad omheen wikkelt voor je ze erin steekt, anders vallen ze rond Nieuwjaar zo bij je eruit en vind je tot in de lente nog gouden dennenappels in de bank — Pip. Pip, ik zie je. Dat is niet voor jou.”</w:t>
       </w:r>
     </w:p>
     <w:p/>
@@ -5276,7 +5276,7 @@
     <w:p/>
     <w:p>
       <w:r>
-        <w:t>„Iemand moet het doen. Jullie tuig doet het immers niet voor jezelf.” Ze was het deksel al aan het optillen. De geur steeg op en vermengde zich met de balsemgeur midden in de ruimte; chocolade, pecannoten en bruine suiker vermengd met koude, groene dennennaalden. Het was, dacht ik, zo dicht bij de geur van het naderende seizoen als maar kon. „En er zitten gemberkoekjes op de bodem, dus zorg dat je niet alleen de cupcakes pakt en de koekjes laat liggen, Dot, ik zag je dat bij de Grange ook al doen en ik ben het niet vergeten.”</w:t>
+        <w:t xml:space="preserve">„Iemand moet het doen. Jullie doen het immers niet voor jezelf.” Ze was het deksel al aan het optillen. De geur steeg op en vermengde zich met de balsemgeur midden in de ruimte; chocolade, pecannoten en bruine suiker vermengd met koude, groene dennennaalden. Het was, dacht ik, zo dicht bij de geur van het naderende seizoen als maar kon. „En er zitten gemberkoekjes op de bodem, dus zorg dat je niet alleen de cupcakes pakt en de koekjes laat liggen, Dot, ik zag je dat bij de Grange ook al doen en ik ben het niet vergeten.”</w:t>
       </w:r>
     </w:p>
     <w:p/>
@@ -5312,13 +5312,13 @@
     <w:p/>
     <w:p>
       <w:r>
-        <w:t>Daarna gingen we weer fanatiek aan de slag, acht vrouwen, een doos cupcakes, een pinguïn en een slapende hond. Het gepraat kabbelde heen en weer rond het werk zoals dat in een kring gaat, al het kleine ochtendnieuws gevangen in de pauzes tussen het binden van de takjes. Ivy’s dochter had een nieuwe baan in Concord. Claire zou donderdag een stuk publiceren over het strooirochema dat naar haar zeggen veel spannender was dan het klonk. Martha zei dat de dagen nu zo snel korter werden dat Emma Snowball bijna in het donker uitliet, en ik zei dat ze het kind de groeten moest doen. Martha zei dat Emma altijd naar Pip vroeg. En Pip, die haar naam hoorde en dat feilloos als een compliment opvatte, zette haar veren op en keek vergenoegd.</w:t>
-      </w:r>
-    </w:p>
-    <w:p/>
-    <w:p>
-      <w:r>
-        <w:t>Het was Claire die het over de winkel had, omdat het nu eenmaal Claire’s vak was om op te merken dat er iets was veranderd en dat van al de anderen alleen maar te bespreken achteraf.</w:t>
+        <w:t xml:space="preserve">Daarna gingen we weer fanatiek aan de slag, acht vrouwen, een doos cupcakes, een pinguïn en een slapende hond. Het gepraat kabbelde heen en weer rond het werk zoals dat in een kring gaat, al het kleine ochtendnieuws gevangen in de pauzes tussen het binden van de takjes. Ivy’s dochter had een nieuwe baan in Concord. Claire zou donderdag een stuk publiceren over het strooischema dat naar haar zeggen veel spannender was dan het klonk. Martha zei dat de dagen nu zo snel korter werden dat Emma Snowball bijna in het donker uitliet, en ik zei dat ze het kind de groeten moest doen. Martha zei dat Emma altijd naar Pip vroeg. En Pip, die haar naam hoorde en dat feilloos als een compliment opvatte, zette haar veren op en keek vergenoegd.</w:t>
+      </w:r>
+    </w:p>
+    <w:p/>
+    <w:p>
+      <w:r>
+        <w:t xml:space="preserve">Het was Claire die het over de winkel had, omdat het nu eenmaal Claires vak was om op te merken dat er iets was veranderd en dat van al de anderen alleen maar te bespreken achteraf.</w:t>
       </w:r>
     </w:p>
     <w:p/>
@@ -5330,7 +5330,7 @@
     <w:p/>
     <w:p>
       <w:r>
-        <w:t>Dat trok de aandacht van de kring los van het draad. Het oude pand van Fenwick had al een dik jaar leeggestaan, met donkere ruiten aan het einde van een helder winkelblok. Het was zo’n gat in een winkelstraat waar mensen van leren weg te kijken om de kleine steek in hun hart te vermijden.</w:t>
+        <w:t xml:space="preserve">Dat trok de aandacht van de kring los van de draad. Het oude pand van Fenwick had al een dik jaar leeggestaan, met donkere ruiten aan het einde van een helder winkelblok. Het was zo’n gat in een winkelstraat waar mensen van leren weg te kijken om de kleine steek in hun hart te vermijden.</w:t>
       </w:r>
     </w:p>
     <w:p/>
@@ -5354,7 +5354,7 @@
     <w:p/>
     <w:p>
       <w:r>
-        <w:t>Ik draaide een takje balsem rond in mijn met hars besmeurde vingers, en ik voelde, zonder dat ik daarvoor een aanwijsbare reden had kunnen geven aan de kring, een koel, tintelend gevoel van nieuwsgierigheid in mijn nek. Ik schoof het opzij, zoals ik in al die jaren geleerd had om dingen op zij te schuiven die nog nergens op sloegen, voor het geval dat nog van pas zou komen.</w:t>
+        <w:t xml:space="preserve">Ik draaide een takje balsem rond in mijn met hars besmeurde vingers, en ik voelde, zonder dat ik daarvoor een aanwijsbare reden had kunnen geven aan de kring, een koel, tintelend gevoel van nieuwsgierigheid in mijn nek. Ik schoof het opzij, zoals ik in al die jaren geleerd had om dingen opzij te schuiven die nog nergens op sloegen, voor het geval dat nog van pas zou komen.</w:t>
       </w:r>
     </w:p>
     <w:p/>
@@ -5390,7 +5390,7 @@
         <w:t>&lt;/bt&gt;</w:t>
       </w:r>
       <w:r>
-        <w:t>, een brede witte strook met de muzentent aan de ene kant en het Oorlogsmonument aan de andere kant. De schoolkinderen hadden er tijdens de eerste echte sneeuwval een rij sneeuwpoppen neergezet. Drie stuks, dik en uit het lood, gekroond met wat de kinderen maar konden vinden. Gisteren, zoals Ellie al zei, keken ze uit over de weg, met hun kolenogen en hun gemoedelijke blik, het verkeer observerend zoals sneeuwpoppen dat doen. Ik was er de avond ervoor zelf nog langsgelopen. Ze keken naar de straat.</w:t>
+        <w:t xml:space="preserve">, een brede witte strook met de muziektent aan de ene kant en het Oorlogsmonument aan de andere kant. De schoolkinderen hadden er tijdens de eerste echte sneeuwval een rij sneeuwpoppen neergezet. Drie stuks, dik en uit het lood, gekroond met wat de kinderen maar konden vinden. Gisteren, zoals Ellie al zei, keken ze uit over de weg, met hun kolenogen en hun gemoedelijke blik, het verkeer observerend zoals sneeuwpoppen dat doen. Ik was er de avond ervoor zelf nog langsgelopen. Ze keken naar de straat.</w:t>
       </w:r>
     </w:p>
     <w:p/>
@@ -5402,7 +5402,7 @@
     <w:p/>
     <w:p>
       <w:r>
-        <w:t>Hij stond nu met zijn rug naar de weg, met zijn armen van takken wijdgespreid naar beide kanten, en zijn plompe kolengezicht wees weg over het grasveld richting de winkels. Richting, om precies te zijn, het verre uiteinde van het blok waar het oude pand van Fenwick achter zijn bruine papier schuilde. De andere twee keken nog steeds naar de straat. Alleen de middelste was van plek veranderd. Volledig op zijn as gedraaid om de andere kant op te kijken. En er was in de verste verte geen voetafdruk te bekennen. De sneeuw rondom alle drie lag er glad en maagdelijk bij. Vijftien centimeter verse sneeuw van vannacht, met niets daarin getekend behalve de lange blauwe schaduwen van het hek bij de muzentent.</w:t>
+        <w:t xml:space="preserve">Hij stond nu met zijn rug naar de weg, met zijn armen van takken wijdgespreid naar beide kanten, en zijn plompe kolengezicht wees weg over het grasveld richting de winkels. Richting, om precies te zijn, het verre uiteinde van het blok waar het oude pand van Fenwick achter zijn bruine papier schuilde. De andere twee keken nog steeds naar de straat. Alleen de middelste was van plek veranderd. Volledig op zijn as gedraaid om de andere kant op te kijken. En er was in de verste verte geen voetafdruk te bekennen. De sneeuw rondom alle drie lag er glad en maagdelijk bij. Vijftien centimeter verse sneeuw van vannacht, met niets daarin getekend behalve de lange blauwe schaduwen van het hek bij de muziektent.</w:t>
       </w:r>
     </w:p>
     <w:p/>
@@ -5414,7 +5414,7 @@
     <w:p/>
     <w:p>
       <w:r>
-        <w:t>„Iemands stomme grap,” concludeerde Dot. „ ’s Nachts omgedraaid. Kinderen.”</w:t>
+        <w:t xml:space="preserve">„Iemands stomme grap,” concludeerde Dot. „’s Nachts omgedraaid. Kinderen.”</w:t>
       </w:r>
     </w:p>
     <w:p/>
@@ -5426,7 +5426,7 @@
     <w:p/>
     <w:p>
       <w:r>
-        <w:t>„Die hebben ze erachter weggesveegd. Of de wind heeft ze dichtgewaaid.” „Het is een grap. Een koudvingerig kind dat niets beters te doen heeft. Tegen zondag staat er een hele rij van die omgedraaide poppen, let maar op, zodra de rest ziet dat het kan.”</w:t>
+        <w:t xml:space="preserve">„Die hebben ze erachter weggeveegd. Of de wind heeft ze dichtgewaaid.” „Het is een grap. Een koudvingerig kind dat niets beters te doen heeft. Tegen zondag staat er een hele rij van die omgedraaide poppen, let maar op, zodra de rest ziet dat het kan.”</w:t>
       </w:r>
     </w:p>
     <w:p/>
@@ -5444,7 +5444,7 @@
     <w:p/>
     <w:p>
       <w:r>
-        <w:t>Omdat ik het verschil ken. Ik leef inmiddels al heel lang naast de magie van Kerstmis. Lang genoeg om haar te herkennen tot in mijn botten toe, zo duidelijk als een voetstap op mijn eigen trap. Dit was geen kind met koude vingers. De magie was losgebroken in Frost Falls. Ze was los sinds onze aankomst, op zoek naar een thuis. Mijn man was er eentje aan het bouwen. Langzaam en geduldig in zijn werkhuis, een haard om in te aarden, en elke dag kroop ze wat dichter naar het vuur toe. Maar ze was nog niet bezonken. Ze zwierf nog ’s nachts rond door het stadje, warm en onhandig en zonder enige kwaadaardigheid, en deed de kleine, onmogelijke dingen die magie nu eenmaal doet als ze meer gevoel heeft dan verstand. Zoals de festivalverlichting veranderen van oranje in goud. En nu blijkbaar het sneeuwpopje van een kind in het donker omdraaien zodat het kon kijken naar datgene wat zijn zwervende aandacht had getrokken.</w:t>
+        <w:t xml:space="preserve">Omdat ik het verschil ken. Ik leef inmiddels al heel lang naast de magie van Kerstmis. Lang genoeg om haar te herkennen tot in mijn botten toe, zo duidelijk als een voetstap op mijn eigen trap. Dit was geen kind met koude vingers. De magie was losgebroken in Frost Falls. Ze was los sinds onze aankomst, op zoek naar een thuis. Mijn man was er eentje aan het bouwen. Langzaam en geduldig in zijn werkplaats, een haard om in te aarden, en elke dag kroop ze wat dichter naar het vuur toe. Maar ze was nog niet bezonken. Ze zwierf nog ’s nachts rond door het stadje, warm en onhandig en zonder enige kwaadaardigheid, en deed de kleine, onmogelijke dingen die magie nu eenmaal doet als ze meer gevoel heeft dan verstand. Zoals de festivalverlichting veranderen van oranje in goud. En nu blijkbaar het sneeuwpopje van een kind in het donker omdraaien zodat het kon kijken naar datgene wat zijn zwervende aandacht had getrokken.</w:t>
       </w:r>
     </w:p>
     <w:p/>

</xml_diff>